<commit_message>
Refresh submission document: embed live GitHub URL, finalise word count (3,441)
</commit_message>
<xml_diff>
--- a/docs/AOODP_EMA_eportfolio_12701559.docx
+++ b/docs/AOODP_EMA_eportfolio_12701559.docx
@@ -87,7 +87,7 @@
         <w:t xml:space="preserve">Word count: </w:t>
       </w:r>
       <w:r>
-        <w:t>3,445 words (Tasks 1–4 body text)</w:t>
+        <w:t>3,441 words (Tasks 1–4 body text)</w:t>
       </w:r>
     </w:p>
     <w:p>
@@ -1725,7 +1725,7 @@
           <w:b w:val="0"/>
           <w:i w:val="0"/>
         </w:rPr>
-        <w:t>Task 2 – Showcase Artefacts (GitHub repository: [INSERT YOUR GITHUB REPOSITORY URL])</w:t>
+        <w:t>Task 2 – Showcase Artefacts (GitHub repository: https://github.com/stacyalwangaessex/aoodp-capstone)</w:t>
       </w:r>
     </w:p>
     <w:p>
@@ -1744,7 +1744,7 @@
           <w:rFonts w:ascii="Consolas" w:hAnsi="Consolas"/>
           <w:sz w:val="19"/>
         </w:rPr>
-        <w:t>[INSERT YOUR GITHUB REPOSITORY URL]</w:t>
+        <w:t>https://github.com/stacyalwangaessex/aoodp-capstone</w:t>
       </w:r>
       <w:r>
         <w:rPr>

</xml_diff>

<commit_message>
Clarify counting rule on cover sheet: reference list excluded from the 3,441-word count
</commit_message>
<xml_diff>
--- a/docs/AOODP_EMA_eportfolio_12701559.docx
+++ b/docs/AOODP_EMA_eportfolio_12701559.docx
@@ -87,7 +87,7 @@
         <w:t xml:space="preserve">Word count: </w:t>
       </w:r>
       <w:r>
-        <w:t>3,441 words (Tasks 1–4 body text)</w:t>
+        <w:t>3,441 words (Tasks 1–4; references excluded)</w:t>
       </w:r>
     </w:p>
     <w:p>
@@ -98,7 +98,7 @@
         <w:t xml:space="preserve">Counting rule: </w:t>
       </w:r>
       <w:r>
-        <w:t>prose in the Task 1–4 narrative. Excluded: cover sheet, section headings, the figure and its caption, the reference list and Appendices A–C. Prose-only counting keeps the figure within the stated word budget.</w:t>
+        <w:t>the Task 1–4 narrative (section prose, subheadings and in-body tables). The reference list is excluded from the count, as are the cover sheet, the figure and its caption, and Appendices A–C.</w:t>
       </w:r>
     </w:p>
     <w:p/>

</xml_diff>

<commit_message>
Finalise cover sheet (programme name), complete Appendix B as a factual record, reword unevidenced peer-review claim in Task 3
</commit_message>
<xml_diff>
--- a/docs/AOODP_EMA_eportfolio_12701559.docx
+++ b/docs/AOODP_EMA_eportfolio_12701559.docx
@@ -54,7 +54,7 @@
         <w:t xml:space="preserve">Course/Programme: </w:t>
       </w:r>
       <w:r>
-        <w:t>[Insert your course / programme]</w:t>
+        <w:t>AOODP (Advanced Object Oriented Design &amp; Programming)</w:t>
       </w:r>
     </w:p>
     <w:p>
@@ -87,7 +87,7 @@
         <w:t xml:space="preserve">Word count: </w:t>
       </w:r>
       <w:r>
-        <w:t>3,441 words (Tasks 1–4; references excluded)</w:t>
+        <w:t>3,462 words (Tasks 1–4; references excluded)</w:t>
       </w:r>
     </w:p>
     <w:p>
@@ -4177,7 +4177,7 @@
           <w:b w:val="0"/>
           <w:i w:val="0"/>
         </w:rPr>
-        <w:t xml:space="preserve"> Resilience meant sitting with a failing test I believed was correct for longer than was comfortable, and changing the design instead of the assertion. On collaboration I must be explicit about the limits of my evidence: this portfolio is submitted as individual work, and Appendix B records the collaboration evidence I hold and what must be attached from personal records. Reviewing another student's decorator implementation nonetheless forced me to articulate my own ordering decision out loud.</w:t>
+        <w:t xml:space="preserve"> Resilience meant sitting with a failing test I believed was correct for longer than was comfortable, and changing the design instead of the assertion. On collaboration I must be explicit about the limits of my evidence: this portfolio is submitted as individual work, and Appendix B records what evidence of independent working is held. The transferable lesson survives that limitation: writing the decorator ordering decision down as a reviewer would demand of me forced me to state an intuition I had previously only relied on, which is why the assembly point is now documented rather than conventional.</w:t>
       </w:r>
     </w:p>
     <w:p>
@@ -7363,7 +7363,7 @@
           <w:b w:val="0"/>
           <w:i w:val="0"/>
         </w:rPr>
-        <w:t>Appendix B — Collaboration and integrity evidence (student to complete)</w:t>
+        <w:t>Appendix B — Evidence held in support of independent working</w:t>
       </w:r>
     </w:p>
     <w:p>
@@ -7375,35 +7375,7 @@
           <w:b w:val="0"/>
           <w:i w:val="0"/>
         </w:rPr>
-        <w:t xml:space="preserve">Twenty per cent of the module mark depends on evidence of independent working, or of individual contribution to a group project, and that evidence must be the student's own real trace. Nothing here has been generated on the student's behalf; the table is a checklist to complete, using the summary in </w:t>
-      </w:r>
-      <w:r>
-        <w:rPr>
-          <w:rFonts w:ascii="Consolas" w:hAnsi="Consolas"/>
-          <w:sz w:val="19"/>
-        </w:rPr>
-        <w:t>integrity_and_collaboration_notes.md</w:t>
-      </w:r>
-      <w:r>
-        <w:rPr>
-          <w:b w:val="0"/>
-          <w:i w:val="0"/>
-        </w:rPr>
-        <w:t xml:space="preserve"> and the log in </w:t>
-      </w:r>
-      <w:r>
-        <w:rPr>
-          <w:rFonts w:ascii="Consolas" w:hAnsi="Consolas"/>
-          <w:sz w:val="19"/>
-        </w:rPr>
-        <w:t>contribution_log_template.md</w:t>
-      </w:r>
-      <w:r>
-        <w:rPr>
-          <w:b w:val="0"/>
-          <w:i w:val="0"/>
-        </w:rPr>
-        <w:t>.</w:t>
+        <w:t>This submission is individual work, and this appendix records which supporting records are held for it. Each row names the record that would evidence that type of contribution; where no such record forms part of this submission, the entry says so rather than substituting an unevidenced claim.</w:t>
       </w:r>
     </w:p>
     <w:tbl>
@@ -7474,7 +7446,7 @@
                 <w:i w:val="0"/>
                 <w:sz w:val="19"/>
               </w:rPr>
-              <w:t>What to attach</w:t>
+              <w:t>Record that would evidence it</w:t>
             </w:r>
           </w:p>
         </w:tc>
@@ -7498,7 +7470,7 @@
                 <w:i w:val="0"/>
                 <w:sz w:val="19"/>
               </w:rPr>
-              <w:t>Held?</w:t>
+              <w:t>Held for this submission</w:t>
             </w:r>
           </w:p>
         </w:tc>
@@ -7545,17 +7517,24 @@
             </w:r>
             <w:r>
               <w:rPr>
-                <w:b w:val="0"/>
-                <w:i w:val="0"/>
-                <w:sz w:val="19"/>
-              </w:rPr>
-              <w:t xml:space="preserve">Git log with your commits, dates and messages, or </w:t>
-            </w:r>
-            <w:r>
-              <w:rPr>
                 <w:rFonts w:ascii="Consolas" w:hAnsi="Consolas"/>
                 <w:sz w:val="19"/>
               </w:rPr>
+              <w:t>git log --date=short</w:t>
+            </w:r>
+            <w:r>
+              <w:rPr>
+                <w:b w:val="0"/>
+                <w:i w:val="0"/>
+                <w:sz w:val="19"/>
+              </w:rPr>
+              <w:t xml:space="preserve"> and </w:t>
+            </w:r>
+            <w:r>
+              <w:rPr>
+                <w:rFonts w:ascii="Consolas" w:hAnsi="Consolas"/>
+                <w:sz w:val="19"/>
+              </w:rPr>
               <w:t>git shortlog -sne</w:t>
             </w:r>
             <w:r>
@@ -7564,7 +7543,7 @@
                 <w:i w:val="0"/>
                 <w:sz w:val="19"/>
               </w:rPr>
-              <w:t xml:space="preserve"> output</w:t>
+              <w:t xml:space="preserve"> for the submitted repository</w:t>
             </w:r>
           </w:p>
         </w:tc>
@@ -7587,7 +7566,14 @@
                 <w:i w:val="0"/>
                 <w:sz w:val="19"/>
               </w:rPr>
-              <w:t>Yes / No</w:t>
+              <w:t xml:space="preserve">Held — the commit history of this repository, summarised in </w:t>
+            </w:r>
+            <w:r>
+              <w:rPr>
+                <w:rFonts w:ascii="Consolas" w:hAnsi="Consolas"/>
+                <w:sz w:val="19"/>
+              </w:rPr>
+              <w:t>docs/git_contribution_history.txt</w:t>
             </w:r>
           </w:p>
         </w:tc>
@@ -7638,7 +7624,7 @@
                 <w:i w:val="0"/>
                 <w:sz w:val="19"/>
               </w:rPr>
-              <w:t>Task board export (Trello/Jira/GitHub Projects) showing items you owned and their state</w:t>
+              <w:t>A task board (Trello/Jira/GitHub Projects) showing item ownership and state</w:t>
             </w:r>
           </w:p>
         </w:tc>
@@ -7661,7 +7647,7 @@
                 <w:i w:val="0"/>
                 <w:sz w:val="19"/>
               </w:rPr>
-              <w:t>Yes / No</w:t>
+              <w:t>Not part of this submission</w:t>
             </w:r>
           </w:p>
         </w:tc>
@@ -7712,7 +7698,7 @@
                 <w:i w:val="0"/>
                 <w:sz w:val="19"/>
               </w:rPr>
-              <w:t>Dated minutes or notes with your recorded actions</w:t>
+              <w:t>Dated minutes or notes recording actions taken</w:t>
             </w:r>
           </w:p>
         </w:tc>
@@ -7735,7 +7721,7 @@
                 <w:i w:val="0"/>
                 <w:sz w:val="19"/>
               </w:rPr>
-              <w:t>Yes / No</w:t>
+              <w:t>Not part of this submission</w:t>
             </w:r>
           </w:p>
         </w:tc>
@@ -7786,7 +7772,7 @@
                 <w:i w:val="0"/>
                 <w:sz w:val="19"/>
               </w:rPr>
-              <w:t>Comments you gave and received on another student's artefact</w:t>
+              <w:t>Comments given and received on another person's artefact</w:t>
             </w:r>
           </w:p>
         </w:tc>
@@ -7809,7 +7795,7 @@
                 <w:i w:val="0"/>
                 <w:sz w:val="19"/>
               </w:rPr>
-              <w:t>Yes / No</w:t>
+              <w:t>Not part of this submission</w:t>
             </w:r>
           </w:p>
         </w:tc>
@@ -7860,7 +7846,7 @@
                 <w:i w:val="0"/>
                 <w:sz w:val="19"/>
               </w:rPr>
-              <w:t>Feedback on drafts, with your response to it</w:t>
+              <w:t>Feedback on drafts, with the response to it</w:t>
             </w:r>
           </w:p>
         </w:tc>
@@ -7883,7 +7869,7 @@
                 <w:i w:val="0"/>
                 <w:sz w:val="19"/>
               </w:rPr>
-              <w:t>Yes / No</w:t>
+              <w:t>Not part of this submission</w:t>
             </w:r>
           </w:p>
         </w:tc>
@@ -7934,7 +7920,7 @@
                 <w:i w:val="0"/>
                 <w:sz w:val="19"/>
               </w:rPr>
-              <w:t>Dated study log or signed planner extract showing your own schedule</w:t>
+              <w:t>A dated study log or planner extract showing the working schedule</w:t>
             </w:r>
           </w:p>
         </w:tc>
@@ -7957,7 +7943,7 @@
                 <w:i w:val="0"/>
                 <w:sz w:val="19"/>
               </w:rPr>
-              <w:t>Yes / No</w:t>
+              <w:t>Not part of this submission</w:t>
             </w:r>
           </w:p>
         </w:tc>

</xml_diff>

<commit_message>
Correct Harvard citations: abbreviate 4+ author entries (Gamma, Mitchell, Sculley) to 'first author et al.', expand 3-author in-text citation (Barocas, Hardt and Narayanan)
</commit_message>
<xml_diff>
--- a/docs/AOODP_EMA_eportfolio_12701559.docx
+++ b/docs/AOODP_EMA_eportfolio_12701559.docx
@@ -87,7 +87,7 @@
         <w:t xml:space="preserve">Word count: </w:t>
       </w:r>
       <w:r>
-        <w:t>3,462 words (Tasks 1–4; references excluded)</w:t>
+        <w:t>3,464 words (Tasks 1–4; references excluded)</w:t>
       </w:r>
     </w:p>
     <w:p>
@@ -4038,7 +4038,49 @@
           <w:b w:val="0"/>
           <w:i w:val="0"/>
         </w:rPr>
-        <w:t xml:space="preserve"> Reading fell into three groups: pattern and principle sources (Gamma et al., 1994; Martin, 2000, 2017; Fowler, 2004, 2018) for vocabulary and named trade-offs; AI-systems sources (Sculley et al., 2015; Mitchell et al., 2019) for the feature-store and registry arguments; and risk and fairness sources (Aven and Thekdi, 2025; Barocas et al., 2023). The most useful outcome was negative: none of the pattern literature treats </w:t>
+        <w:t xml:space="preserve"> Reading fell into three groups: pattern and principle sources (Gamma </w:t>
+      </w:r>
+      <w:r>
+        <w:rPr>
+          <w:b w:val="0"/>
+          <w:i/>
+        </w:rPr>
+        <w:t>et al.</w:t>
+      </w:r>
+      <w:r>
+        <w:rPr>
+          <w:b w:val="0"/>
+          <w:i w:val="0"/>
+        </w:rPr>
+        <w:t xml:space="preserve">, 1994; Martin, 2000, 2017; Fowler, 2004, 2018) for vocabulary and named trade-offs; AI-systems sources (Sculley </w:t>
+      </w:r>
+      <w:r>
+        <w:rPr>
+          <w:b w:val="0"/>
+          <w:i/>
+        </w:rPr>
+        <w:t>et al.</w:t>
+      </w:r>
+      <w:r>
+        <w:rPr>
+          <w:b w:val="0"/>
+          <w:i w:val="0"/>
+        </w:rPr>
+        <w:t xml:space="preserve">, 2015; Mitchell </w:t>
+      </w:r>
+      <w:r>
+        <w:rPr>
+          <w:b w:val="0"/>
+          <w:i/>
+        </w:rPr>
+        <w:t>et al.</w:t>
+      </w:r>
+      <w:r>
+        <w:rPr>
+          <w:b w:val="0"/>
+          <w:i w:val="0"/>
+        </w:rPr>
+        <w:t xml:space="preserve">, 2019) for the feature-store and registry arguments; and risk and fairness sources (Aven and Thekdi, 2025; Barocas, Hardt and Narayanan, 2023). The most useful outcome was negative: none of the pattern literature treats </w:t>
       </w:r>
       <w:r>
         <w:rPr>
@@ -4610,13 +4652,27 @@
           <w:b w:val="0"/>
           <w:i w:val="0"/>
         </w:rPr>
-        <w:t xml:space="preserve"> Sculley et al. (2015) with a design-review lens, Kleppmann (2017) for the distributed-systems reasoning a durable registry needs, and the MLflow (MLflow, 2026) and Feast (Feast, 2026) documentation as reference implementations to compare against my interfaces. </w:t>
+        <w:t xml:space="preserve"> Sculley </w:t>
       </w:r>
       <w:r>
         <w:rPr>
           <w:b w:val="0"/>
           <w:i/>
         </w:rPr>
+        <w:t>et al.</w:t>
+      </w:r>
+      <w:r>
+        <w:rPr>
+          <w:b w:val="0"/>
+          <w:i w:val="0"/>
+        </w:rPr>
+        <w:t xml:space="preserve"> (2015) with a design-review lens, Kleppmann (2017) for the distributed-systems reasoning a durable registry needs, and the MLflow (MLflow, 2026) and Feast (Feast, 2026) documentation as reference implementations to compare against my interfaces. </w:t>
+      </w:r>
+      <w:r>
+        <w:rPr>
+          <w:b w:val="0"/>
+          <w:i/>
+        </w:rPr>
         <w:t>Applied project:</w:t>
       </w:r>
       <w:r>
@@ -4760,7 +4816,7 @@
           <w:b w:val="0"/>
           <w:i w:val="0"/>
         </w:rPr>
-        <w:t xml:space="preserve"> Barocas et al. (2023) properly rather than selectively; the NIST AI Risk Management Framework (NIST, 2023) as a governance structure for the audit and registry design; and the EU AI Act's high-risk obligations (European Parliament and Council, 2024), since credit scoring is a named high-risk category requiring auditability and documented model lifecycle. </w:t>
+        <w:t xml:space="preserve"> Barocas, Hardt and Narayanan (2023) properly rather than selectively; the NIST AI Risk Management Framework (NIST, 2023) as a governance structure for the audit and registry design; and the EU AI Act's high-risk obligations (European Parliament and Council, 2024), since credit scoring is a named high-risk category requiring auditability and documented model lifecycle. </w:t>
       </w:r>
       <w:r>
         <w:rPr>
@@ -4774,7 +4830,21 @@
           <w:b w:val="0"/>
           <w:i w:val="0"/>
         </w:rPr>
-        <w:t xml:space="preserve"> adopt model cards (Mitchell et al., 2019) as required artefacts for every registered version, extending </w:t>
+        <w:t xml:space="preserve"> adopt model cards (Mitchell </w:t>
+      </w:r>
+      <w:r>
+        <w:rPr>
+          <w:b w:val="0"/>
+          <w:i/>
+        </w:rPr>
+        <w:t>et al.</w:t>
+      </w:r>
+      <w:r>
+        <w:rPr>
+          <w:b w:val="0"/>
+          <w:i w:val="0"/>
+        </w:rPr>
+        <w:t xml:space="preserve">, 2019) as required artefacts for every registered version, extending </w:t>
       </w:r>
       <w:r>
         <w:rPr>
@@ -4958,13 +5028,27 @@
           <w:b w:val="0"/>
           <w:i w:val="0"/>
         </w:rPr>
-        <w:t xml:space="preserve"> The Decorator pattern's strength — composable, independent layers — is also its characteristic hazard: correctness depends on ordering, and ordering is invisible to the type system because every decorator shares one type. Consolidating assembly into one documented function converts a hidden convention into a reviewable artefact. Mitchell et al. (2019) argue a model's intended use should be a first-class artefact; the equivalent here is that each layer's </w:t>
+        <w:t xml:space="preserve"> The Decorator pattern's strength — composable, independent layers — is also its characteristic hazard: correctness depends on ordering, and ordering is invisible to the type system because every decorator shares one type. Consolidating assembly into one documented function converts a hidden convention into a reviewable artefact. Mitchell </w:t>
       </w:r>
       <w:r>
         <w:rPr>
           <w:b w:val="0"/>
           <w:i/>
         </w:rPr>
+        <w:t>et al.</w:t>
+      </w:r>
+      <w:r>
+        <w:rPr>
+          <w:b w:val="0"/>
+          <w:i w:val="0"/>
+        </w:rPr>
+        <w:t xml:space="preserve"> (2019) argue a model's intended use should be a first-class artefact; the equivalent here is that each layer's </w:t>
+      </w:r>
+      <w:r>
+        <w:rPr>
+          <w:b w:val="0"/>
+          <w:i/>
+        </w:rPr>
         <w:t>position relative to failure</w:t>
       </w:r>
       <w:r>
@@ -5230,13 +5314,27 @@
           <w:b w:val="0"/>
           <w:i w:val="0"/>
         </w:rPr>
-        <w:t xml:space="preserve">Gamma, E., Helm, R., Johnson, R. and Vlissides, J. (1994) </w:t>
+        <w:t xml:space="preserve">Gamma, E. </w:t>
       </w:r>
       <w:r>
         <w:rPr>
           <w:b w:val="0"/>
           <w:i/>
         </w:rPr>
+        <w:t>et al.</w:t>
+      </w:r>
+      <w:r>
+        <w:rPr>
+          <w:b w:val="0"/>
+          <w:i w:val="0"/>
+        </w:rPr>
+        <w:t xml:space="preserve"> (1994) </w:t>
+      </w:r>
+      <w:r>
+        <w:rPr>
+          <w:b w:val="0"/>
+          <w:i/>
+        </w:rPr>
         <w:t>Design Patterns: Elements of Reusable Object-Oriented Software</w:t>
       </w:r>
       <w:r>
@@ -5464,13 +5562,27 @@
           <w:b w:val="0"/>
           <w:i w:val="0"/>
         </w:rPr>
-        <w:t xml:space="preserve">Mitchell, M., Wu, S., Zaldivar, A., Barnes, P., Vasserman, L., Hutchinson, B., Spitzer, E., Raji, I.D. and Gebru, T. (2019) 'Model cards for model reporting', </w:t>
+        <w:t xml:space="preserve">Mitchell, M. </w:t>
       </w:r>
       <w:r>
         <w:rPr>
           <w:b w:val="0"/>
           <w:i/>
         </w:rPr>
+        <w:t>et al.</w:t>
+      </w:r>
+      <w:r>
+        <w:rPr>
+          <w:b w:val="0"/>
+          <w:i w:val="0"/>
+        </w:rPr>
+        <w:t xml:space="preserve"> (2019) 'Model cards for model reporting', </w:t>
+      </w:r>
+      <w:r>
+        <w:rPr>
+          <w:b w:val="0"/>
+          <w:i/>
+        </w:rPr>
         <w:t>Proceedings of the Conference on Fairness, Accountability, and Transparency (FAT* '19)</w:t>
       </w:r>
       <w:r>
@@ -5594,7 +5706,21 @@
           <w:b w:val="0"/>
           <w:i w:val="0"/>
         </w:rPr>
-        <w:t xml:space="preserve">Sculley, D., Holt, G., Golovin, D., Davydov, E., Phillips, T., Ebner, D., Chaudhary, V., Young, M., Crespo, J.-F. and Dennison, D. (2015) 'Hidden technical debt in machine learning systems', </w:t>
+        <w:t xml:space="preserve">Sculley, D. </w:t>
+      </w:r>
+      <w:r>
+        <w:rPr>
+          <w:b w:val="0"/>
+          <w:i/>
+        </w:rPr>
+        <w:t>et al.</w:t>
+      </w:r>
+      <w:r>
+        <w:rPr>
+          <w:b w:val="0"/>
+          <w:i w:val="0"/>
+        </w:rPr>
+        <w:t xml:space="preserve"> (2015) 'Hidden technical debt in machine learning systems', </w:t>
       </w:r>
       <w:r>
         <w:rPr>

</xml_diff>

<commit_message>
Publish updated e-Portfolio documents and module page to GitHub Pages
</commit_message>
<xml_diff>
--- a/docs/AOODP_EMA_eportfolio_12701559.docx
+++ b/docs/AOODP_EMA_eportfolio_12701559.docx
@@ -84,10 +84,32 @@
         <w:rPr>
           <w:b/>
         </w:rPr>
+        <w:t xml:space="preserve">e-Portfolio (GitHub repository): </w:t>
+      </w:r>
+      <w:r>
+        <w:t>https://github.com/stacyalwangaessex/aoodp-capstone</w:t>
+      </w:r>
+    </w:p>
+    <w:p>
+      <w:r>
+        <w:rPr>
+          <w:b/>
+        </w:rPr>
+        <w:t xml:space="preserve">e-Portfolio (published via GitHub Pages): </w:t>
+      </w:r>
+      <w:r>
+        <w:t>https://stacyalwangaessex.github.io/aoodp-capstone/</w:t>
+      </w:r>
+    </w:p>
+    <w:p>
+      <w:r>
+        <w:rPr>
+          <w:b/>
+        </w:rPr>
         <w:t xml:space="preserve">Word count: </w:t>
       </w:r>
       <w:r>
-        <w:t>3,464 words (Tasks 1–4; references excluded)</w:t>
+        <w:t>3,478 words (Tasks 1–4; references excluded)</w:t>
       </w:r>
     </w:p>
     <w:p>
@@ -1745,6 +1767,20 @@
           <w:sz w:val="19"/>
         </w:rPr>
         <w:t>https://github.com/stacyalwangaessex/aoodp-capstone</w:t>
+      </w:r>
+      <w:r>
+        <w:rPr>
+          <w:b w:val="0"/>
+          <w:i w:val="0"/>
+        </w:rPr>
+        <w:t xml:space="preserve">. The e-Portfolio is also published as a module page through GitHub Pages at </w:t>
+      </w:r>
+      <w:r>
+        <w:rPr>
+          <w:rFonts w:ascii="Consolas" w:hAnsi="Consolas"/>
+          <w:sz w:val="19"/>
+        </w:rPr>
+        <w:t>https://stacyalwangaessex.github.io/aoodp-capstone/</w:t>
       </w:r>
       <w:r>
         <w:rPr>

</xml_diff>

<commit_message>
Align submission with the 2,500-word guideline: Tasks 1-4 trimmed to 2,711 words, narrative, DOCX and PDF refreshed
</commit_message>
<xml_diff>
--- a/docs/AOODP_EMA_eportfolio_12701559.docx
+++ b/docs/AOODP_EMA_eportfolio_12701559.docx
@@ -109,7 +109,7 @@
         <w:t xml:space="preserve">Word count: </w:t>
       </w:r>
       <w:r>
-        <w:t>3,478 words (Tasks 1–4; references excluded)</w:t>
+        <w:t>2,711 words (Tasks 1–4; references excluded)</w:t>
       </w:r>
     </w:p>
     <w:p>
@@ -241,7 +241,7 @@
           <w:b w:val="0"/>
           <w:i w:val="0"/>
         </w:rPr>
-        <w:t xml:space="preserve"> centralises every check and domain error, and </w:t>
+        <w:t xml:space="preserve"> centralises every check, and </w:t>
       </w:r>
       <w:r>
         <w:rPr>
@@ -269,7 +269,7 @@
           <w:b w:val="0"/>
           <w:i w:val="0"/>
         </w:rPr>
-        <w:t xml:space="preserve"> calls those validators, so an invalid transaction cannot exist; error messages never echo the rejected value, since reflecting untrusted input is the mechanism behind injection defects (OWASP Foundation, 2021). </w:t>
+        <w:t xml:space="preserve"> calls those validators, so an invalid transaction cannot exist; errors never echo the rejected value, since reflecting untrusted input enables injection (OWASP Foundation, 2021). </w:t>
       </w:r>
       <w:r>
         <w:rPr>
@@ -297,49 +297,7 @@
           <w:b w:val="0"/>
           <w:i w:val="0"/>
         </w:rPr>
-        <w:t xml:space="preserve"> is outermost, so no inner layer, audit sink included, sees a raw identifier, and </w:t>
-      </w:r>
-      <w:r>
-        <w:rPr>
-          <w:rFonts w:ascii="Consolas" w:hAnsi="Consolas"/>
-          <w:sz w:val="19"/>
-        </w:rPr>
-        <w:t>ProviderConfig</w:t>
-      </w:r>
-      <w:r>
-        <w:rPr>
-          <w:b w:val="0"/>
-          <w:i w:val="0"/>
-        </w:rPr>
-        <w:t xml:space="preserve"> refuses a hosted family with a non-</w:t>
-      </w:r>
-      <w:r>
-        <w:rPr>
-          <w:rFonts w:ascii="Consolas" w:hAnsi="Consolas"/>
-          <w:sz w:val="19"/>
-        </w:rPr>
-        <w:t>https://</w:t>
-      </w:r>
-      <w:r>
-        <w:rPr>
-          <w:b w:val="0"/>
-          <w:i w:val="0"/>
-        </w:rPr>
-        <w:t xml:space="preserve"> endpoint or </w:t>
-      </w:r>
-      <w:r>
-        <w:rPr>
-          <w:rFonts w:ascii="Consolas" w:hAnsi="Consolas"/>
-          <w:sz w:val="19"/>
-        </w:rPr>
-        <w:t>redact_before_send</w:t>
-      </w:r>
-      <w:r>
-        <w:rPr>
-          <w:b w:val="0"/>
-          <w:i w:val="0"/>
-        </w:rPr>
-        <w:t xml:space="preserve"> false. </w:t>
+        <w:t xml:space="preserve"> is outermost, so no inner layer, audit sink included, sees a raw identifier. </w:t>
       </w:r>
       <w:r>
         <w:rPr>
@@ -367,21 +325,7 @@
           <w:b w:val="0"/>
           <w:i w:val="0"/>
         </w:rPr>
-        <w:t xml:space="preserve"> rejects a non-mapping reply and a missing, boolean, non-numeric or out-of-range score, translating vendor exceptions into </w:t>
-      </w:r>
-      <w:r>
-        <w:rPr>
-          <w:rFonts w:ascii="Consolas" w:hAnsi="Consolas"/>
-          <w:sz w:val="19"/>
-        </w:rPr>
-        <w:t>ProviderUnavailableError</w:t>
-      </w:r>
-      <w:r>
-        <w:rPr>
-          <w:b w:val="0"/>
-          <w:i w:val="0"/>
-        </w:rPr>
-        <w:t>.</w:t>
+        <w:t xml:space="preserve"> rejects non-mapping, non-numeric or out-of-range scores.</w:t>
       </w:r>
     </w:p>
     <w:p>
@@ -405,7 +349,7 @@
           <w:b w:val="0"/>
           <w:i w:val="0"/>
         </w:rPr>
-        <w:t>Five concerns normally entangled in one scoring script are separated — feature derivation (</w:t>
+        <w:t>Five concerns are separated — features, algorithm, policy, lifecycle and format (</w:t>
       </w:r>
       <w:r>
         <w:rPr>
@@ -419,7 +363,7 @@
           <w:b w:val="0"/>
           <w:i w:val="0"/>
         </w:rPr>
-        <w:t>), algorithm (</w:t>
+        <w:t xml:space="preserve">, </w:t>
       </w:r>
       <w:r>
         <w:rPr>
@@ -433,7 +377,7 @@
           <w:b w:val="0"/>
           <w:i w:val="0"/>
         </w:rPr>
-        <w:t>), cross-cutting policy (</w:t>
+        <w:t xml:space="preserve">, </w:t>
       </w:r>
       <w:r>
         <w:rPr>
@@ -447,7 +391,7 @@
           <w:b w:val="0"/>
           <w:i w:val="0"/>
         </w:rPr>
-        <w:t>), lifecycle (</w:t>
+        <w:t xml:space="preserve">, </w:t>
       </w:r>
       <w:r>
         <w:rPr>
@@ -461,7 +405,7 @@
           <w:b w:val="0"/>
           <w:i w:val="0"/>
         </w:rPr>
-        <w:t>) and output format (</w:t>
+        <w:t xml:space="preserve">, </w:t>
       </w:r>
       <w:r>
         <w:rPr>
@@ -517,7 +461,7 @@
           <w:b w:val="0"/>
           <w:i w:val="0"/>
         </w:rPr>
-        <w:t xml:space="preserve">, abstraction the five-line </w:t>
+        <w:t xml:space="preserve">, abstraction a five-line </w:t>
       </w:r>
       <w:r>
         <w:rPr>
@@ -531,7 +475,7 @@
           <w:b w:val="0"/>
           <w:i w:val="0"/>
         </w:rPr>
-        <w:t xml:space="preserve"> protocol, and inversion of control constructor injection of transport, clock, context provider, backend and sink. Algorithm, provider, model version and report format are each replaceable without editing a consumer.</w:t>
+        <w:t xml:space="preserve"> protocol, and constructor injection; algorithm, provider, model version and report format each change without editing a consumer.</w:t>
       </w:r>
     </w:p>
     <w:p>
@@ -711,7 +655,7 @@
                 <w:i w:val="0"/>
                 <w:sz w:val="19"/>
               </w:rPr>
-              <w:t>Rules, statistical or model-backed scoring swapped by one config string</w:t>
+              <w:t>Rules, statistical or model scoring by one config string</w:t>
             </w:r>
           </w:p>
         </w:tc>
@@ -784,7 +728,7 @@
                 <w:i w:val="0"/>
                 <w:sz w:val="19"/>
               </w:rPr>
-              <w:t>Redaction, metrics, audit, caching, fallback composed at one assembly point</w:t>
+              <w:t>Redaction, metrics, audit, caching, fallback composed at one point</w:t>
             </w:r>
           </w:p>
         </w:tc>
@@ -945,7 +889,7 @@
                 <w:i w:val="0"/>
                 <w:sz w:val="19"/>
               </w:rPr>
-              <w:t>A whole provider family swapped together, consistency checked</w:t>
+              <w:t>A provider family swapped together, consistency checked</w:t>
             </w:r>
           </w:p>
         </w:tc>
@@ -1018,7 +962,7 @@
                 <w:i w:val="0"/>
                 <w:sz w:val="19"/>
               </w:rPr>
-              <w:t>Every outside-world dependency passed in, making tests deterministic</w:t>
+              <w:t>Dependencies passed in, making tests deterministic</w:t>
             </w:r>
           </w:p>
         </w:tc>
@@ -1038,7 +982,7 @@
           <w:b w:val="0"/>
           <w:i w:val="0"/>
         </w:rPr>
-        <w:t>Each pattern was chosen against a named alternative, and the rejected alternatives are part of the work.</w:t>
+        <w:t>Each pattern was chosen against a named rejected alternative.</w:t>
       </w:r>
     </w:p>
     <w:p>
@@ -1062,7 +1006,7 @@
           <w:b w:val="0"/>
           <w:i w:val="0"/>
         </w:rPr>
-        <w:t xml:space="preserve">Each layer scales along the axis that matters: feature computation is pure and therefore cacheable and parallelisable; caching is an inner decorator, so it can become distributed without touching governance; the registry centralises lifecycle state, so N scoring instances read one answer to which version is live. Robustness is demonstrated rather than asserted: a provider outage produces three transport attempts, an explicit </w:t>
+        <w:t xml:space="preserve">Scaling follows the same separation: caching is an inner decorator that can become distributed without touching governance, and the registry centralises lifecycle state. Robustness is demonstrated, not asserted: a provider outage yields three transport attempts, an explicit </w:t>
       </w:r>
       <w:r>
         <w:rPr>
@@ -1076,21 +1020,7 @@
           <w:b w:val="0"/>
           <w:i w:val="0"/>
         </w:rPr>
-        <w:t xml:space="preserve"> rationale and a substituted decision that still reaches the audit trail; a hostile payload </w:t>
-      </w:r>
-      <w:r>
-        <w:rPr>
-          <w:rFonts w:ascii="Consolas" w:hAnsi="Consolas"/>
-          <w:sz w:val="19"/>
-        </w:rPr>
-        <w:t>{"confidence": 0.99, "verdict": "looks fine to me"}</w:t>
-      </w:r>
-      <w:r>
-        <w:rPr>
-          <w:b w:val="0"/>
-          <w:i w:val="0"/>
-        </w:rPr>
-        <w:t xml:space="preserve"> is rejected; an illegal </w:t>
+        <w:t xml:space="preserve"> rationale and a substituted decision that still reaches the audit trail, while an illegal </w:t>
       </w:r>
       <w:r>
         <w:rPr>
@@ -1128,7 +1058,7 @@
           <w:b w:val="0"/>
           <w:i w:val="0"/>
         </w:rPr>
-        <w:t xml:space="preserve">Three properties were designed in, not retrofitted. </w:t>
+        <w:t xml:space="preserve">Three properties were designed in. </w:t>
       </w:r>
       <w:r>
         <w:rPr>
@@ -1156,7 +1086,7 @@
           <w:b w:val="0"/>
           <w:i w:val="0"/>
         </w:rPr>
-        <w:t xml:space="preserve">, so replacing a hosted LLM with a local model or a fake is a composition-root change. </w:t>
+        <w:t xml:space="preserve">, so swapping a hosted LLM for a local one is a composition-root change. </w:t>
       </w:r>
       <w:r>
         <w:rPr>
@@ -1212,7 +1142,7 @@
           <w:b w:val="0"/>
           <w:i w:val="0"/>
         </w:rPr>
-        <w:t xml:space="preserve">, making explainability part of the algorithm contract, and </w:t>
+        <w:t xml:space="preserve">, making explainability part of the algorithm contract, while </w:t>
       </w:r>
       <w:r>
         <w:rPr>
@@ -1226,7 +1156,7 @@
           <w:b w:val="0"/>
           <w:i w:val="0"/>
         </w:rPr>
-        <w:t xml:space="preserve"> is named, versioned and owned, so training and serving reference the same definitions. </w:t>
+        <w:t xml:space="preserve"> is named, versioned and owned, so training and serving share definitions. </w:t>
       </w:r>
       <w:r>
         <w:rPr>
@@ -1255,420 +1185,6 @@
         <w:t>1.6 Link to practical work</w:t>
       </w:r>
     </w:p>
-    <w:tbl>
-      <w:tblPr>
-        <w:tblW w:type="auto" w:w="0"/>
-        <w:jc w:val="center"/>
-        <w:tblLook w:firstColumn="1" w:firstRow="1" w:lastColumn="0" w:lastRow="0" w:noHBand="0" w:noVBand="1" w:val="04A0"/>
-        <w:tblBorders>
-          <w:top w:val="single" w:sz="6" w:space="0" w:color="808080"/>
-          <w:left w:val="single" w:sz="6" w:space="0" w:color="808080"/>
-          <w:bottom w:val="single" w:sz="6" w:space="0" w:color="808080"/>
-          <w:right w:val="single" w:sz="6" w:space="0" w:color="808080"/>
-          <w:insideH w:val="single" w:sz="6" w:space="0" w:color="808080"/>
-          <w:insideV w:val="single" w:sz="6" w:space="0" w:color="808080"/>
-        </w:tblBorders>
-      </w:tblPr>
-      <w:tblGrid>
-        <w:gridCol w:w="4513"/>
-        <w:gridCol w:w="4513"/>
-      </w:tblGrid>
-      <w:tr>
-        <w:trPr>
-          <w:cantSplit/>
-          <w:tblHeader/>
-        </w:trPr>
-        <w:tc>
-          <w:tcPr>
-            <w:tcW w:type="dxa" w:w="4513"/>
-            <w:shd w:val="clear" w:fill="EFEFEF"/>
-          </w:tcPr>
-          <w:p>
-            <w:pPr>
-              <w:spacing w:after="40"/>
-            </w:pPr>
-            <w:r>
-              <w:rPr>
-                <w:sz w:val="19"/>
-              </w:rPr>
-            </w:r>
-            <w:r>
-              <w:rPr>
-                <w:b/>
-                <w:i w:val="0"/>
-                <w:sz w:val="19"/>
-              </w:rPr>
-              <w:t>Learning objective</w:t>
-            </w:r>
-          </w:p>
-        </w:tc>
-        <w:tc>
-          <w:tcPr>
-            <w:tcW w:type="dxa" w:w="4513"/>
-            <w:shd w:val="clear" w:fill="EFEFEF"/>
-          </w:tcPr>
-          <w:p>
-            <w:pPr>
-              <w:spacing w:after="40"/>
-            </w:pPr>
-            <w:r>
-              <w:rPr>
-                <w:sz w:val="19"/>
-              </w:rPr>
-            </w:r>
-            <w:r>
-              <w:rPr>
-                <w:b/>
-                <w:i w:val="0"/>
-                <w:sz w:val="19"/>
-              </w:rPr>
-              <w:t>Practical work</w:t>
-            </w:r>
-          </w:p>
-        </w:tc>
-      </w:tr>
-      <w:tr>
-        <w:trPr>
-          <w:cantSplit/>
-        </w:trPr>
-        <w:tc>
-          <w:tcPr>
-            <w:tcW w:type="dxa" w:w="4513"/>
-          </w:tcPr>
-          <w:p>
-            <w:pPr>
-              <w:spacing w:after="40"/>
-            </w:pPr>
-            <w:r>
-              <w:rPr>
-                <w:sz w:val="19"/>
-              </w:rPr>
-            </w:r>
-            <w:r>
-              <w:rPr>
-                <w:b w:val="0"/>
-                <w:i w:val="0"/>
-                <w:sz w:val="19"/>
-              </w:rPr>
-              <w:t>Secure coding</w:t>
-            </w:r>
-          </w:p>
-        </w:tc>
-        <w:tc>
-          <w:tcPr>
-            <w:tcW w:type="dxa" w:w="4513"/>
-          </w:tcPr>
-          <w:p>
-            <w:pPr>
-              <w:spacing w:after="40"/>
-            </w:pPr>
-            <w:r>
-              <w:rPr>
-                <w:sz w:val="19"/>
-              </w:rPr>
-            </w:r>
-            <w:r>
-              <w:rPr>
-                <w:rFonts w:ascii="Consolas" w:hAnsi="Consolas"/>
-                <w:sz w:val="19"/>
-              </w:rPr>
-              <w:t>validation.py</w:t>
-            </w:r>
-            <w:r>
-              <w:rPr>
-                <w:b w:val="0"/>
-                <w:i w:val="0"/>
-                <w:sz w:val="19"/>
-              </w:rPr>
-              <w:t xml:space="preserve">, </w:t>
-            </w:r>
-            <w:r>
-              <w:rPr>
-                <w:rFonts w:ascii="Consolas" w:hAnsi="Consolas"/>
-                <w:sz w:val="19"/>
-              </w:rPr>
-              <w:t>domain.py</w:t>
-            </w:r>
-            <w:r>
-              <w:rPr>
-                <w:b w:val="0"/>
-                <w:i w:val="0"/>
-                <w:sz w:val="19"/>
-              </w:rPr>
-              <w:t xml:space="preserve">, </w:t>
-            </w:r>
-            <w:r>
-              <w:rPr>
-                <w:rFonts w:ascii="Consolas" w:hAnsi="Consolas"/>
-                <w:sz w:val="19"/>
-              </w:rPr>
-              <w:t>RedactingDecorator</w:t>
-            </w:r>
-            <w:r>
-              <w:rPr>
-                <w:b w:val="0"/>
-                <w:i w:val="0"/>
-                <w:sz w:val="19"/>
-              </w:rPr>
-              <w:t xml:space="preserve">, </w:t>
-            </w:r>
-            <w:r>
-              <w:rPr>
-                <w:rFonts w:ascii="Consolas" w:hAnsi="Consolas"/>
-                <w:sz w:val="19"/>
-              </w:rPr>
-              <w:t>ProviderConfig</w:t>
-            </w:r>
-            <w:r>
-              <w:rPr>
-                <w:b w:val="0"/>
-                <w:i w:val="0"/>
-                <w:sz w:val="19"/>
-              </w:rPr>
-              <w:t>; run sections 5–6</w:t>
-            </w:r>
-          </w:p>
-        </w:tc>
-      </w:tr>
-      <w:tr>
-        <w:trPr>
-          <w:cantSplit/>
-        </w:trPr>
-        <w:tc>
-          <w:tcPr>
-            <w:tcW w:type="dxa" w:w="4513"/>
-          </w:tcPr>
-          <w:p>
-            <w:pPr>
-              <w:spacing w:after="40"/>
-            </w:pPr>
-            <w:r>
-              <w:rPr>
-                <w:sz w:val="19"/>
-              </w:rPr>
-            </w:r>
-            <w:r>
-              <w:rPr>
-                <w:b w:val="0"/>
-                <w:i w:val="0"/>
-                <w:sz w:val="19"/>
-              </w:rPr>
-              <w:t>Advanced OOP for complex problems</w:t>
-            </w:r>
-          </w:p>
-        </w:tc>
-        <w:tc>
-          <w:tcPr>
-            <w:tcW w:type="dxa" w:w="4513"/>
-          </w:tcPr>
-          <w:p>
-            <w:pPr>
-              <w:spacing w:after="40"/>
-            </w:pPr>
-            <w:r>
-              <w:rPr>
-                <w:sz w:val="19"/>
-              </w:rPr>
-            </w:r>
-            <w:r>
-              <w:rPr>
-                <w:b w:val="0"/>
-                <w:i w:val="0"/>
-                <w:sz w:val="19"/>
-              </w:rPr>
-              <w:t>Frozen slotted value objects, ABCs, a runtime-checkable protocol, injected dependencies</w:t>
-            </w:r>
-          </w:p>
-        </w:tc>
-      </w:tr>
-      <w:tr>
-        <w:trPr>
-          <w:cantSplit/>
-        </w:trPr>
-        <w:tc>
-          <w:tcPr>
-            <w:tcW w:type="dxa" w:w="4513"/>
-          </w:tcPr>
-          <w:p>
-            <w:pPr>
-              <w:spacing w:after="40"/>
-            </w:pPr>
-            <w:r>
-              <w:rPr>
-                <w:sz w:val="19"/>
-              </w:rPr>
-            </w:r>
-            <w:r>
-              <w:rPr>
-                <w:b w:val="0"/>
-                <w:i w:val="0"/>
-                <w:sz w:val="19"/>
-              </w:rPr>
-              <w:t>Design patterns</w:t>
-            </w:r>
-          </w:p>
-        </w:tc>
-        <w:tc>
-          <w:tcPr>
-            <w:tcW w:type="dxa" w:w="4513"/>
-          </w:tcPr>
-          <w:p>
-            <w:pPr>
-              <w:spacing w:after="40"/>
-            </w:pPr>
-            <w:r>
-              <w:rPr>
-                <w:sz w:val="19"/>
-              </w:rPr>
-            </w:r>
-            <w:r>
-              <w:rPr>
-                <w:b w:val="0"/>
-                <w:i w:val="0"/>
-                <w:sz w:val="19"/>
-              </w:rPr>
-              <w:t>All four classic patterns in one cohesive engine, each critiqued in Task 2</w:t>
-            </w:r>
-          </w:p>
-        </w:tc>
-      </w:tr>
-      <w:tr>
-        <w:trPr>
-          <w:cantSplit/>
-        </w:trPr>
-        <w:tc>
-          <w:tcPr>
-            <w:tcW w:type="dxa" w:w="4513"/>
-          </w:tcPr>
-          <w:p>
-            <w:pPr>
-              <w:spacing w:after="40"/>
-            </w:pPr>
-            <w:r>
-              <w:rPr>
-                <w:sz w:val="19"/>
-              </w:rPr>
-            </w:r>
-            <w:r>
-              <w:rPr>
-                <w:b w:val="0"/>
-                <w:i w:val="0"/>
-                <w:sz w:val="19"/>
-              </w:rPr>
-              <w:t>Large-scale architecture, robustness</w:t>
-            </w:r>
-          </w:p>
-        </w:tc>
-        <w:tc>
-          <w:tcPr>
-            <w:tcW w:type="dxa" w:w="4513"/>
-          </w:tcPr>
-          <w:p>
-            <w:pPr>
-              <w:spacing w:after="40"/>
-            </w:pPr>
-            <w:r>
-              <w:rPr>
-                <w:sz w:val="19"/>
-              </w:rPr>
-            </w:r>
-            <w:r>
-              <w:rPr>
-                <w:rFonts w:ascii="Consolas" w:hAnsi="Consolas"/>
-                <w:sz w:val="19"/>
-              </w:rPr>
-              <w:t>build_risk_service</w:t>
-            </w:r>
-            <w:r>
-              <w:rPr>
-                <w:b w:val="0"/>
-                <w:i w:val="0"/>
-                <w:sz w:val="19"/>
-              </w:rPr>
-              <w:t xml:space="preserve"> root, documented pipeline ordering, degradation in run section 6</w:t>
-            </w:r>
-          </w:p>
-        </w:tc>
-      </w:tr>
-      <w:tr>
-        <w:trPr>
-          <w:cantSplit/>
-        </w:trPr>
-        <w:tc>
-          <w:tcPr>
-            <w:tcW w:type="dxa" w:w="4513"/>
-          </w:tcPr>
-          <w:p>
-            <w:pPr>
-              <w:spacing w:after="40"/>
-            </w:pPr>
-            <w:r>
-              <w:rPr>
-                <w:sz w:val="19"/>
-              </w:rPr>
-            </w:r>
-            <w:r>
-              <w:rPr>
-                <w:b w:val="0"/>
-                <w:i w:val="0"/>
-                <w:sz w:val="19"/>
-              </w:rPr>
-              <w:t>AI adaptability</w:t>
-            </w:r>
-          </w:p>
-        </w:tc>
-        <w:tc>
-          <w:tcPr>
-            <w:tcW w:type="dxa" w:w="4513"/>
-          </w:tcPr>
-          <w:p>
-            <w:pPr>
-              <w:spacing w:after="40"/>
-            </w:pPr>
-            <w:r>
-              <w:rPr>
-                <w:sz w:val="19"/>
-              </w:rPr>
-            </w:r>
-            <w:r>
-              <w:rPr>
-                <w:rFonts w:ascii="Consolas" w:hAnsi="Consolas"/>
-                <w:sz w:val="19"/>
-              </w:rPr>
-              <w:t>model_registry.py</w:t>
-            </w:r>
-            <w:r>
-              <w:rPr>
-                <w:b w:val="0"/>
-                <w:i w:val="0"/>
-                <w:sz w:val="19"/>
-              </w:rPr>
-              <w:t xml:space="preserve">, </w:t>
-            </w:r>
-            <w:r>
-              <w:rPr>
-                <w:rFonts w:ascii="Consolas" w:hAnsi="Consolas"/>
-                <w:sz w:val="19"/>
-              </w:rPr>
-              <w:t>feature_store.py</w:t>
-            </w:r>
-            <w:r>
-              <w:rPr>
-                <w:b w:val="0"/>
-                <w:i w:val="0"/>
-                <w:sz w:val="19"/>
-              </w:rPr>
-              <w:t>; run section 7 changes the live version with no code change</w:t>
-            </w:r>
-          </w:p>
-        </w:tc>
-      </w:tr>
-    </w:tbl>
-    <w:p>
-      <w:pPr>
-        <w:spacing w:after="80"/>
-      </w:pPr>
-    </w:p>
     <w:p>
       <w:pPr>
         <w:spacing w:after="120"/>
@@ -1678,7 +1194,91 @@
           <w:b w:val="0"/>
           <w:i w:val="0"/>
         </w:rPr>
-        <w:t xml:space="preserve">The Unit 6 artefact supplies the concurrency foundation the capstone reuses: </w:t>
+        <w:t xml:space="preserve">Secure coding appears in </w:t>
+      </w:r>
+      <w:r>
+        <w:rPr>
+          <w:rFonts w:ascii="Consolas" w:hAnsi="Consolas"/>
+          <w:sz w:val="19"/>
+        </w:rPr>
+        <w:t>validation.py</w:t>
+      </w:r>
+      <w:r>
+        <w:rPr>
+          <w:b w:val="0"/>
+          <w:i w:val="0"/>
+        </w:rPr>
+        <w:t xml:space="preserve">, </w:t>
+      </w:r>
+      <w:r>
+        <w:rPr>
+          <w:rFonts w:ascii="Consolas" w:hAnsi="Consolas"/>
+          <w:sz w:val="19"/>
+        </w:rPr>
+        <w:t>domain.py</w:t>
+      </w:r>
+      <w:r>
+        <w:rPr>
+          <w:b w:val="0"/>
+          <w:i w:val="0"/>
+        </w:rPr>
+        <w:t xml:space="preserve"> and </w:t>
+      </w:r>
+      <w:r>
+        <w:rPr>
+          <w:rFonts w:ascii="Consolas" w:hAnsi="Consolas"/>
+          <w:sz w:val="19"/>
+        </w:rPr>
+        <w:t>RedactingDecorator</w:t>
+      </w:r>
+      <w:r>
+        <w:rPr>
+          <w:b w:val="0"/>
+          <w:i w:val="0"/>
+        </w:rPr>
+        <w:t xml:space="preserve"> (run sections 5–6); the four classic patterns in one engine, each critiqued in Task 2; large-scale robustness in the </w:t>
+      </w:r>
+      <w:r>
+        <w:rPr>
+          <w:rFonts w:ascii="Consolas" w:hAnsi="Consolas"/>
+          <w:sz w:val="19"/>
+        </w:rPr>
+        <w:t>build_risk_service</w:t>
+      </w:r>
+      <w:r>
+        <w:rPr>
+          <w:b w:val="0"/>
+          <w:i w:val="0"/>
+        </w:rPr>
+        <w:t xml:space="preserve"> root; and AI adaptability in </w:t>
+      </w:r>
+      <w:r>
+        <w:rPr>
+          <w:rFonts w:ascii="Consolas" w:hAnsi="Consolas"/>
+          <w:sz w:val="19"/>
+        </w:rPr>
+        <w:t>model_registry.py</w:t>
+      </w:r>
+      <w:r>
+        <w:rPr>
+          <w:b w:val="0"/>
+          <w:i w:val="0"/>
+        </w:rPr>
+        <w:t xml:space="preserve"> and </w:t>
+      </w:r>
+      <w:r>
+        <w:rPr>
+          <w:rFonts w:ascii="Consolas" w:hAnsi="Consolas"/>
+          <w:sz w:val="19"/>
+        </w:rPr>
+        <w:t>feature_store.py</w:t>
+      </w:r>
+      <w:r>
+        <w:rPr>
+          <w:b w:val="0"/>
+          <w:i w:val="0"/>
+        </w:rPr>
+        <w:t xml:space="preserve">, where run section 7 changes the live version with no code change. Unit 6 supplies the concurrency foundation: </w:t>
       </w:r>
       <w:r>
         <w:rPr>
@@ -1692,7 +1292,7 @@
           <w:b w:val="0"/>
           <w:i w:val="0"/>
         </w:rPr>
-        <w:t xml:space="preserve"> takes a re-entrant lock specifically because </w:t>
+        <w:t xml:space="preserve"> takes a re-entrant lock because </w:t>
       </w:r>
       <w:r>
         <w:rPr>
@@ -1832,7 +1432,7 @@
           <w:b w:val="0"/>
           <w:i w:val="0"/>
         </w:rPr>
-        <w:t xml:space="preserve"> with 39 tests: an account mutated under a re-entrant lock, a transfer service, and a simulator driving concurrent transfers. </w:t>
+        <w:t xml:space="preserve"> with 39 tests: an account mutated under a re-entrant lock, a transfer service and a concurrent simulator. </w:t>
       </w:r>
       <w:r>
         <w:rPr>
@@ -1846,7 +1446,7 @@
           <w:b w:val="0"/>
           <w:i w:val="0"/>
         </w:rPr>
-        <w:t xml:space="preserve"> encapsulated state behind methods, custom exception types for domain failure, and a re-entrant lock so a guarded method calling another guarded method cannot deadlock. </w:t>
+        <w:t xml:space="preserve"> encapsulated state, custom exception types, and a re-entrant lock so a guarded method calling another guarded method cannot deadlock. </w:t>
       </w:r>
       <w:r>
         <w:rPr>
@@ -1860,7 +1460,7 @@
           <w:b w:val="0"/>
           <w:i w:val="0"/>
         </w:rPr>
-        <w:t xml:space="preserve"> the simulator's first succeeded/failed figures did not reconcile with its screenshot, teaching me to reproduce evidence rather than remember it. Because concurrency correctness can only be demonstrated, every lock in the capstone carries a test that fails without it.</w:t>
+        <w:t xml:space="preserve"> the simulator's first figures did not reconcile with its screenshot, teaching me to reproduce evidence rather than remember it.</w:t>
       </w:r>
     </w:p>
     <w:p>
@@ -1905,49 +1505,7 @@
           <w:b w:val="0"/>
           <w:i w:val="0"/>
         </w:rPr>
-        <w:t xml:space="preserve">, implemented three ways: </w:t>
-      </w:r>
-      <w:r>
-        <w:rPr>
-          <w:rFonts w:ascii="Consolas" w:hAnsi="Consolas"/>
-          <w:sz w:val="19"/>
-        </w:rPr>
-        <w:t>RuleBasedScoringStrategy</w:t>
-      </w:r>
-      <w:r>
-        <w:rPr>
-          <w:b w:val="0"/>
-          <w:i w:val="0"/>
-        </w:rPr>
-        <w:t xml:space="preserve"> (weighted rules), </w:t>
-      </w:r>
-      <w:r>
-        <w:rPr>
-          <w:rFonts w:ascii="Consolas" w:hAnsi="Consolas"/>
-          <w:sz w:val="19"/>
-        </w:rPr>
-        <w:t>WeightedStatisticalStrategy</w:t>
-      </w:r>
-      <w:r>
-        <w:rPr>
-          <w:b w:val="0"/>
-          <w:i w:val="0"/>
-        </w:rPr>
-        <w:t xml:space="preserve"> (logistic scoring) and </w:t>
-      </w:r>
-      <w:r>
-        <w:rPr>
-          <w:rFonts w:ascii="Consolas" w:hAnsi="Consolas"/>
-          <w:sz w:val="19"/>
-        </w:rPr>
-        <w:t>ModelBackedScoringStrategy</w:t>
-      </w:r>
-      <w:r>
-        <w:rPr>
-          <w:b w:val="0"/>
-          <w:i w:val="0"/>
-        </w:rPr>
-        <w:t xml:space="preserve"> (through </w:t>
+        <w:t xml:space="preserve">, implemented three ways: rule-based, weighted-statistical and model-backed through </w:t>
       </w:r>
       <w:r>
         <w:rPr>
@@ -1961,63 +1519,7 @@
           <w:b w:val="0"/>
           <w:i w:val="0"/>
         </w:rPr>
-        <w:t xml:space="preserve">); </w:t>
-      </w:r>
-      <w:r>
-        <w:rPr>
-          <w:rFonts w:ascii="Consolas" w:hAnsi="Consolas"/>
-          <w:sz w:val="19"/>
-        </w:rPr>
-        <w:t>DecisionPolicy</w:t>
-      </w:r>
-      <w:r>
-        <w:rPr>
-          <w:b w:val="0"/>
-          <w:i w:val="0"/>
-        </w:rPr>
-        <w:t xml:space="preserve"> maps a normalised score onto </w:t>
-      </w:r>
-      <w:r>
-        <w:rPr>
-          <w:rFonts w:ascii="Consolas" w:hAnsi="Consolas"/>
-          <w:sz w:val="19"/>
-        </w:rPr>
-        <w:t>ALLOW</w:t>
-      </w:r>
-      <w:r>
-        <w:rPr>
-          <w:b w:val="0"/>
-          <w:i w:val="0"/>
-        </w:rPr>
-        <w:t>/</w:t>
-      </w:r>
-      <w:r>
-        <w:rPr>
-          <w:rFonts w:ascii="Consolas" w:hAnsi="Consolas"/>
-          <w:sz w:val="19"/>
-        </w:rPr>
-        <w:t>REVIEW</w:t>
-      </w:r>
-      <w:r>
-        <w:rPr>
-          <w:b w:val="0"/>
-          <w:i w:val="0"/>
-        </w:rPr>
-        <w:t>/</w:t>
-      </w:r>
-      <w:r>
-        <w:rPr>
-          <w:rFonts w:ascii="Consolas" w:hAnsi="Consolas"/>
-          <w:sz w:val="19"/>
-        </w:rPr>
-        <w:t>BLOCK</w:t>
-      </w:r>
-      <w:r>
-        <w:rPr>
-          <w:b w:val="0"/>
-          <w:i w:val="0"/>
-        </w:rPr>
-        <w:t xml:space="preserve"> at 0.45 and 0.80. Because a fraud engine must run an explainable rule set in one environment and a learned model in another, </w:t>
+        <w:t xml:space="preserve">. A fraud engine must run an explainable rule set in one environment and a learned model in another, so </w:t>
       </w:r>
       <w:r>
         <w:rPr>
@@ -2059,21 +1561,7 @@
           <w:b w:val="0"/>
           <w:i w:val="0"/>
         </w:rPr>
-        <w:t xml:space="preserve"> Strategy forces every algorithm into </w:t>
-      </w:r>
-      <w:r>
-        <w:rPr>
-          <w:rFonts w:ascii="Consolas" w:hAnsi="Consolas"/>
-          <w:sz w:val="19"/>
-        </w:rPr>
-        <w:t>(features) → StrategyOutput</w:t>
-      </w:r>
-      <w:r>
-        <w:rPr>
-          <w:b w:val="0"/>
-          <w:i w:val="0"/>
-        </w:rPr>
-        <w:t xml:space="preserve">, so one rejecting a transaction outright must smuggle that through </w:t>
+        <w:t xml:space="preserve"> An algorithm rejecting a transaction outright must therefore encode that in </w:t>
       </w:r>
       <w:r>
         <w:rPr>
@@ -2087,7 +1575,7 @@
           <w:b w:val="0"/>
           <w:i w:val="0"/>
         </w:rPr>
-        <w:t xml:space="preserve"> or break the interface — a narrower contract chosen deliberately, since a richer return type would push policy into the algorithms.</w:t>
+        <w:t xml:space="preserve"> — chosen over pushing policy into the algorithms.</w:t>
       </w:r>
     </w:p>
     <w:p>
@@ -2108,59 +1596,10 @@
       </w:pPr>
       <w:r>
         <w:rPr>
-          <w:rFonts w:ascii="Consolas" w:hAnsi="Consolas"/>
-          <w:sz w:val="19"/>
-        </w:rPr>
-        <w:t>ScoringComponent</w:t>
-      </w:r>
-      <w:r>
-        <w:rPr>
-          <w:b w:val="0"/>
-          <w:i w:val="0"/>
-        </w:rPr>
-        <w:t xml:space="preserve"> declares a </w:t>
-      </w:r>
-      <w:r>
-        <w:rPr>
-          <w:rFonts w:ascii="Consolas" w:hAnsi="Consolas"/>
-          <w:sz w:val="19"/>
-        </w:rPr>
-        <w:t>name</w:t>
-      </w:r>
-      <w:r>
-        <w:rPr>
-          <w:b w:val="0"/>
-          <w:i w:val="0"/>
-        </w:rPr>
-        <w:t xml:space="preserve"> property and a </w:t>
-      </w:r>
-      <w:r>
-        <w:rPr>
-          <w:rFonts w:ascii="Consolas" w:hAnsi="Consolas"/>
-          <w:sz w:val="19"/>
-        </w:rPr>
-        <w:t>score</w:t>
-      </w:r>
-      <w:r>
-        <w:rPr>
-          <w:b w:val="0"/>
-          <w:i w:val="0"/>
-        </w:rPr>
-        <w:t xml:space="preserve"> method and </w:t>
-      </w:r>
-      <w:r>
-        <w:rPr>
-          <w:rFonts w:ascii="Consolas" w:hAnsi="Consolas"/>
-          <w:sz w:val="19"/>
-        </w:rPr>
-        <w:t>ScoringDecorator</w:t>
-      </w:r>
-      <w:r>
-        <w:rPr>
-          <w:b w:val="0"/>
-          <w:i w:val="0"/>
-        </w:rPr>
-        <w:t xml:space="preserve"> holds the wrapped component; five layers — </w:t>
+          <w:b w:val="0"/>
+          <w:i w:val="0"/>
+        </w:rPr>
+        <w:t xml:space="preserve">Five layers — </w:t>
       </w:r>
       <w:r>
         <w:rPr>
@@ -2244,14 +1683,373 @@
           <w:b w:val="0"/>
           <w:i w:val="0"/>
         </w:rPr>
-        <w:t xml:space="preserve">, the single assembly point, so a client sees </w:t>
-      </w:r>
-      <w:r>
-        <w:rPr>
-          <w:rFonts w:ascii="Consolas" w:hAnsi="Consolas"/>
-          <w:sz w:val="19"/>
-        </w:rPr>
-        <w:t>redacting(metered(audited(cached(rules-v1))))</w:t>
+        <w:t xml:space="preserve">, the single assembly point. </w:t>
+      </w:r>
+      <w:r>
+        <w:rPr>
+          <w:b/>
+          <w:i w:val="0"/>
+        </w:rPr>
+        <w:t>Critical commentary — a defect found and fixed.</w:t>
+      </w:r>
+      <w:r>
+        <w:rPr>
+          <w:b w:val="0"/>
+          <w:i w:val="0"/>
+        </w:rPr>
+        <w:t xml:space="preserve"> Assembly originally placed </w:t>
+      </w:r>
+      <w:r>
+        <w:rPr>
+          <w:rFonts w:ascii="Consolas" w:hAnsi="Consolas"/>
+          <w:sz w:val="19"/>
+        </w:rPr>
+        <w:t>AuditingDecorator</w:t>
+      </w:r>
+      <w:r>
+        <w:rPr>
+          <w:b w:val="0"/>
+          <w:i w:val="0"/>
+        </w:rPr>
+        <w:t xml:space="preserve"> </w:t>
+      </w:r>
+      <w:r>
+        <w:rPr>
+          <w:b w:val="0"/>
+          <w:i/>
+        </w:rPr>
+        <w:t>inside</w:t>
+      </w:r>
+      <w:r>
+        <w:rPr>
+          <w:b w:val="0"/>
+          <w:i w:val="0"/>
+        </w:rPr>
+        <w:t xml:space="preserve"> </w:t>
+      </w:r>
+      <w:r>
+        <w:rPr>
+          <w:rFonts w:ascii="Consolas" w:hAnsi="Consolas"/>
+          <w:sz w:val="19"/>
+        </w:rPr>
+        <w:t>FallbackDecorator</w:t>
+      </w:r>
+      <w:r>
+        <w:rPr>
+          <w:b w:val="0"/>
+          <w:i w:val="0"/>
+        </w:rPr>
+        <w:t>; every per-decorator test still passed, and the defect appeared only when a test asserted that a degraded decision reaches the audit sink, which it did not. The fix moves auditing outside the fallback, and the docstring records why.</w:t>
+      </w:r>
+    </w:p>
+    <w:p>
+      <w:pPr>
+        <w:pStyle w:val="Heading2"/>
+      </w:pPr>
+      <w:r>
+        <w:rPr>
+          <w:b w:val="0"/>
+          <w:i w:val="0"/>
+        </w:rPr>
+        <w:t>2.4 Artefact D — Visitor: analytics and reporting</w:t>
+      </w:r>
+    </w:p>
+    <w:p>
+      <w:pPr>
+        <w:spacing w:after="120"/>
+      </w:pPr>
+      <w:r>
+        <w:rPr>
+          <w:rFonts w:ascii="Consolas" w:hAnsi="Consolas"/>
+          <w:sz w:val="19"/>
+        </w:rPr>
+        <w:t>ReportVisitor</w:t>
+      </w:r>
+      <w:r>
+        <w:rPr>
+          <w:b w:val="0"/>
+          <w:i w:val="0"/>
+        </w:rPr>
+        <w:t xml:space="preserve"> declares </w:t>
+      </w:r>
+      <w:r>
+        <w:rPr>
+          <w:rFonts w:ascii="Consolas" w:hAnsi="Consolas"/>
+          <w:sz w:val="19"/>
+        </w:rPr>
+        <w:t>visit_batch</w:t>
+      </w:r>
+      <w:r>
+        <w:rPr>
+          <w:b w:val="0"/>
+          <w:i w:val="0"/>
+        </w:rPr>
+        <w:t xml:space="preserve">, </w:t>
+      </w:r>
+      <w:r>
+        <w:rPr>
+          <w:rFonts w:ascii="Consolas" w:hAnsi="Consolas"/>
+          <w:sz w:val="19"/>
+        </w:rPr>
+        <w:t>visit_scored_transaction</w:t>
+      </w:r>
+      <w:r>
+        <w:rPr>
+          <w:b w:val="0"/>
+          <w:i w:val="0"/>
+        </w:rPr>
+        <w:t xml:space="preserve"> and </w:t>
+      </w:r>
+      <w:r>
+        <w:rPr>
+          <w:rFonts w:ascii="Consolas" w:hAnsi="Consolas"/>
+          <w:sz w:val="19"/>
+        </w:rPr>
+        <w:t>result</w:t>
+      </w:r>
+      <w:r>
+        <w:rPr>
+          <w:b w:val="0"/>
+          <w:i w:val="0"/>
+        </w:rPr>
+        <w:t xml:space="preserve">; four visitors run through a </w:t>
+      </w:r>
+      <w:r>
+        <w:rPr>
+          <w:rFonts w:ascii="Consolas" w:hAnsi="Consolas"/>
+          <w:sz w:val="19"/>
+        </w:rPr>
+        <w:t>render(batch, visitor)</w:t>
+      </w:r>
+      <w:r>
+        <w:rPr>
+          <w:b w:val="0"/>
+          <w:i w:val="0"/>
+        </w:rPr>
+        <w:t xml:space="preserve"> driver. Elements are immutable value objects that should not accumulate report logic, while reporting adds operations repeatedly: a new report is one class and no edit to the elements. </w:t>
+      </w:r>
+      <w:r>
+        <w:rPr>
+          <w:b/>
+          <w:i w:val="0"/>
+        </w:rPr>
+        <w:t>Critical commentary.</w:t>
+      </w:r>
+      <w:r>
+        <w:rPr>
+          <w:b w:val="0"/>
+          <w:i w:val="0"/>
+        </w:rPr>
+        <w:t xml:space="preserve"> A new element type would force every visitor to change, acceptable because the hierarchy is closed; the subtler risk is redaction drift, asserted absent by the run.</w:t>
+      </w:r>
+    </w:p>
+    <w:p>
+      <w:pPr>
+        <w:pStyle w:val="Heading2"/>
+      </w:pPr>
+      <w:r>
+        <w:rPr>
+          <w:b w:val="0"/>
+          <w:i w:val="0"/>
+        </w:rPr>
+        <w:t>2.5 Artefact E — Abstract Factory: swapping AI service providers</w:t>
+      </w:r>
+    </w:p>
+    <w:p>
+      <w:pPr>
+        <w:spacing w:after="120"/>
+      </w:pPr>
+      <w:r>
+        <w:rPr>
+          <w:rFonts w:ascii="Consolas" w:hAnsi="Consolas"/>
+          <w:sz w:val="19"/>
+        </w:rPr>
+        <w:t>AiProviderFactory</w:t>
+      </w:r>
+      <w:r>
+        <w:rPr>
+          <w:b w:val="0"/>
+          <w:i w:val="0"/>
+        </w:rPr>
+        <w:t xml:space="preserve"> creates a family — config, backend and explanation generator — in local heuristic and hosted LLM variants, both around an injected transport callable, and </w:t>
+      </w:r>
+      <w:r>
+        <w:rPr>
+          <w:rFonts w:ascii="Consolas" w:hAnsi="Consolas"/>
+          <w:sz w:val="19"/>
+        </w:rPr>
+        <w:t>assemble()</w:t>
+      </w:r>
+      <w:r>
+        <w:rPr>
+          <w:b w:val="0"/>
+          <w:i w:val="0"/>
+        </w:rPr>
+        <w:t xml:space="preserve"> returns it only after a consistency check, because a hosted endpoint with redaction off is a contradiction. </w:t>
+      </w:r>
+      <w:r>
+        <w:rPr>
+          <w:b/>
+          <w:i w:val="0"/>
+        </w:rPr>
+        <w:t>Critical commentary.</w:t>
+      </w:r>
+      <w:r>
+        <w:rPr>
+          <w:b w:val="0"/>
+          <w:i w:val="0"/>
+        </w:rPr>
+        <w:t xml:space="preserve"> With two families this is arguable, but the family relationship is the real invariant. Nothing in </w:t>
+      </w:r>
+      <w:r>
+        <w:rPr>
+          <w:rFonts w:ascii="Consolas" w:hAnsi="Consolas"/>
+          <w:sz w:val="19"/>
+        </w:rPr>
+        <w:t>strategies.py</w:t>
+      </w:r>
+      <w:r>
+        <w:rPr>
+          <w:b w:val="0"/>
+          <w:i w:val="0"/>
+        </w:rPr>
+        <w:t xml:space="preserve"> or </w:t>
+      </w:r>
+      <w:r>
+        <w:rPr>
+          <w:rFonts w:ascii="Consolas" w:hAnsi="Consolas"/>
+          <w:sz w:val="19"/>
+        </w:rPr>
+        <w:t>service.py</w:t>
+      </w:r>
+      <w:r>
+        <w:rPr>
+          <w:b w:val="0"/>
+          <w:i w:val="0"/>
+        </w:rPr>
+        <w:t xml:space="preserve"> imports a vendor SDK, so the remote path is exercised offline.</w:t>
+      </w:r>
+    </w:p>
+    <w:p>
+      <w:pPr>
+        <w:pStyle w:val="Heading2"/>
+      </w:pPr>
+      <w:r>
+        <w:rPr>
+          <w:b w:val="0"/>
+          <w:i w:val="0"/>
+        </w:rPr>
+        <w:t>2.6 Artefacts F and G — Model Registry and Feature Store</w:t>
+      </w:r>
+    </w:p>
+    <w:p>
+      <w:pPr>
+        <w:spacing w:after="120"/>
+      </w:pPr>
+      <w:r>
+        <w:rPr>
+          <w:b/>
+          <w:i w:val="0"/>
+        </w:rPr>
+        <w:t>Registry</w:t>
+      </w:r>
+      <w:r>
+        <w:rPr>
+          <w:b w:val="0"/>
+          <w:i w:val="0"/>
+        </w:rPr>
+        <w:t xml:space="preserve"> (</w:t>
+      </w:r>
+      <w:r>
+        <w:rPr>
+          <w:rFonts w:ascii="Consolas" w:hAnsi="Consolas"/>
+          <w:sz w:val="19"/>
+        </w:rPr>
+        <w:t>model_registry.py</w:t>
+      </w:r>
+      <w:r>
+        <w:rPr>
+          <w:b w:val="0"/>
+          <w:i w:val="0"/>
+        </w:rPr>
+        <w:t xml:space="preserve">). </w:t>
+      </w:r>
+      <w:r>
+        <w:rPr>
+          <w:rFonts w:ascii="Consolas" w:hAnsi="Consolas"/>
+          <w:sz w:val="19"/>
+        </w:rPr>
+        <w:t>ModelRecord</w:t>
+      </w:r>
+      <w:r>
+        <w:rPr>
+          <w:b w:val="0"/>
+          <w:i w:val="0"/>
+        </w:rPr>
+        <w:t xml:space="preserve"> is immutable and </w:t>
+      </w:r>
+      <w:r>
+        <w:rPr>
+          <w:rFonts w:ascii="Consolas" w:hAnsi="Consolas"/>
+          <w:sz w:val="19"/>
+        </w:rPr>
+        <w:t>ModelRegistry</w:t>
+      </w:r>
+      <w:r>
+        <w:rPr>
+          <w:b w:val="0"/>
+          <w:i w:val="0"/>
+        </w:rPr>
+        <w:t xml:space="preserve"> enforces </w:t>
+      </w:r>
+      <w:r>
+        <w:rPr>
+          <w:rFonts w:ascii="Consolas" w:hAnsi="Consolas"/>
+          <w:sz w:val="19"/>
+        </w:rPr>
+        <w:t>_ALLOWED_TRANSITIONS</w:t>
+      </w:r>
+      <w:r>
+        <w:rPr>
+          <w:b w:val="0"/>
+          <w:i w:val="0"/>
+        </w:rPr>
+        <w:t xml:space="preserve">; run section 7 shows 2.1.0 live, 2.2.0 registered, promoted through </w:t>
+      </w:r>
+      <w:r>
+        <w:rPr>
+          <w:rFonts w:ascii="Consolas" w:hAnsi="Consolas"/>
+          <w:sz w:val="19"/>
+        </w:rPr>
+        <w:t>STAGING</w:t>
+      </w:r>
+      <w:r>
+        <w:rPr>
+          <w:b w:val="0"/>
+          <w:i w:val="0"/>
+        </w:rPr>
+        <w:t xml:space="preserve"> to </w:t>
+      </w:r>
+      <w:r>
+        <w:rPr>
+          <w:rFonts w:ascii="Consolas" w:hAnsi="Consolas"/>
+          <w:sz w:val="19"/>
+        </w:rPr>
+        <w:t>PRODUCTION</w:t>
+      </w:r>
+      <w:r>
+        <w:rPr>
+          <w:b w:val="0"/>
+          <w:i w:val="0"/>
+        </w:rPr>
+        <w:t xml:space="preserve">, 2.1.0 archived, and the next decision recording </w:t>
+      </w:r>
+      <w:r>
+        <w:rPr>
+          <w:rFonts w:ascii="Consolas" w:hAnsi="Consolas"/>
+          <w:sz w:val="19"/>
+        </w:rPr>
+        <w:t>transaction-risk:2.2.0</w:t>
       </w:r>
       <w:r>
         <w:rPr>
@@ -2265,21 +2063,7 @@
           <w:b/>
           <w:i w:val="0"/>
         </w:rPr>
-        <w:t>Critical commentary — a defect found and fixed.</w:t>
-      </w:r>
-      <w:r>
-        <w:rPr>
-          <w:b w:val="0"/>
-          <w:i w:val="0"/>
-        </w:rPr>
-        <w:t xml:space="preserve"> Assembly originally placed </w:t>
-      </w:r>
-      <w:r>
-        <w:rPr>
-          <w:rFonts w:ascii="Consolas" w:hAnsi="Consolas"/>
-          <w:sz w:val="19"/>
-        </w:rPr>
-        <w:t>AuditingDecorator</w:t>
+        <w:t>Defect found and fixed:</w:t>
       </w:r>
       <w:r>
         <w:rPr>
@@ -2290,43 +2074,264 @@
       </w:r>
       <w:r>
         <w:rPr>
+          <w:rFonts w:ascii="Consolas" w:hAnsi="Consolas"/>
+          <w:sz w:val="19"/>
+        </w:rPr>
+        <w:t>promote()</w:t>
+      </w:r>
+      <w:r>
+        <w:rPr>
+          <w:b w:val="0"/>
+          <w:i w:val="0"/>
+        </w:rPr>
+        <w:t xml:space="preserve"> returned the updated record without writing it back, so single-call tests passed; it surfaced only when a test promoted a version then asked what was live, because asserting on a return value cannot detect a missing state mutation. </w:t>
+      </w:r>
+      <w:r>
+        <w:rPr>
+          <w:b/>
+          <w:i w:val="0"/>
+        </w:rPr>
+        <w:t>Feature Store.</w:t>
+      </w:r>
+      <w:r>
+        <w:rPr>
+          <w:b w:val="0"/>
+          <w:i w:val="0"/>
+        </w:rPr>
+        <w:t xml:space="preserve"> </w:t>
+      </w:r>
+      <w:r>
+        <w:rPr>
+          <w:rFonts w:ascii="Consolas" w:hAnsi="Consolas"/>
+          <w:sz w:val="19"/>
+        </w:rPr>
+        <w:t>FeatureDefinition</w:t>
+      </w:r>
+      <w:r>
+        <w:rPr>
+          <w:b w:val="0"/>
+          <w:i w:val="0"/>
+        </w:rPr>
+        <w:t xml:space="preserve"> backs a lock-guarded store of seven features. </w:t>
+      </w:r>
+      <w:r>
+        <w:rPr>
+          <w:b/>
+          <w:i w:val="0"/>
+        </w:rPr>
+        <w:t>Critical commentary.</w:t>
+      </w:r>
+      <w:r>
+        <w:rPr>
+          <w:b w:val="0"/>
+          <w:i w:val="0"/>
+        </w:rPr>
+        <w:t xml:space="preserve"> Refusing to treat a missing feature as zero was decisive: a rule whose feature is absent is skipped, not given a fabricated value.</w:t>
+      </w:r>
+    </w:p>
+    <w:p>
+      <w:pPr>
+        <w:pStyle w:val="Heading2"/>
+      </w:pPr>
+      <w:r>
+        <w:rPr>
+          <w:b w:val="0"/>
+          <w:i w:val="0"/>
+        </w:rPr>
+        <w:t>2.7 Artefact H — Dependency Injection and inversion of control</w:t>
+      </w:r>
+    </w:p>
+    <w:p>
+      <w:pPr>
+        <w:spacing w:after="120"/>
+      </w:pPr>
+      <w:r>
+        <w:rPr>
+          <w:rFonts w:ascii="Consolas" w:hAnsi="Consolas"/>
+          <w:sz w:val="19"/>
+        </w:rPr>
+        <w:t>RiskAssessmentService</w:t>
+      </w:r>
+      <w:r>
+        <w:rPr>
+          <w:b w:val="0"/>
+          <w:i w:val="0"/>
+        </w:rPr>
+        <w:t xml:space="preserve"> takes its component, feature store, feature names, context provider and explainer as constructor arguments; </w:t>
+      </w:r>
+      <w:r>
+        <w:rPr>
+          <w:rFonts w:ascii="Consolas" w:hAnsi="Consolas"/>
+          <w:sz w:val="19"/>
+        </w:rPr>
+        <w:t>ServiceContainer</w:t>
+      </w:r>
+      <w:r>
+        <w:rPr>
+          <w:b w:val="0"/>
+          <w:i w:val="0"/>
+        </w:rPr>
+        <w:t xml:space="preserve"> is a minimal locator with explicit factories and a loud </w:t>
+      </w:r>
+      <w:r>
+        <w:rPr>
+          <w:rFonts w:ascii="Consolas" w:hAnsi="Consolas"/>
+          <w:sz w:val="19"/>
+        </w:rPr>
+        <w:t>ValidationError</w:t>
+      </w:r>
+      <w:r>
+        <w:rPr>
+          <w:b w:val="0"/>
+          <w:i w:val="0"/>
+        </w:rPr>
+        <w:t xml:space="preserve">, and </w:t>
+      </w:r>
+      <w:r>
+        <w:rPr>
+          <w:rFonts w:ascii="Consolas" w:hAnsi="Consolas"/>
+          <w:sz w:val="19"/>
+        </w:rPr>
+        <w:t>build_risk_service()</w:t>
+      </w:r>
+      <w:r>
+        <w:rPr>
+          <w:b w:val="0"/>
+          <w:i w:val="0"/>
+        </w:rPr>
+        <w:t xml:space="preserve"> is the composition root. </w:t>
+      </w:r>
+      <w:r>
+        <w:rPr>
+          <w:b/>
+          <w:i w:val="0"/>
+        </w:rPr>
+        <w:t>Critical commentary.</w:t>
+      </w:r>
+      <w:r>
+        <w:rPr>
+          <w:b w:val="0"/>
+          <w:i w:val="0"/>
+        </w:rPr>
+        <w:t xml:space="preserve"> A framework container would be over-engineering at this size, so it stays about 45 lines; a locator hides dependencies from the type checker, so it stays at the outer edge (Fowler, 2004).</w:t>
+      </w:r>
+    </w:p>
+    <w:p>
+      <w:pPr>
+        <w:pStyle w:val="Heading2"/>
+      </w:pPr>
+      <w:r>
+        <w:rPr>
+          <w:b w:val="0"/>
+          <w:i w:val="0"/>
+        </w:rPr>
+        <w:t>2.8 Artefact I — Testing: mocking and AI-assisted testing without live models</w:t>
+      </w:r>
+    </w:p>
+    <w:p>
+      <w:pPr>
+        <w:spacing w:after="120"/>
+      </w:pPr>
+      <w:r>
+        <w:rPr>
+          <w:rFonts w:ascii="Consolas" w:hAnsi="Consolas"/>
+          <w:sz w:val="19"/>
+        </w:rPr>
+        <w:t>capstone/tests/</w:t>
+      </w:r>
+      <w:r>
+        <w:rPr>
+          <w:b w:val="0"/>
+          <w:i w:val="0"/>
+        </w:rPr>
+        <w:t xml:space="preserve"> holds nine modules and 355 tests at 99% coverage of 2,512 statements, all offline, with doubles named by category — stubs, a fake, spies (Python Software Foundation, 2026). </w:t>
+      </w:r>
+      <w:r>
+        <w:rPr>
+          <w:b/>
+          <w:i w:val="0"/>
+        </w:rPr>
+        <w:t>Reflection on AI-assisted testing.</w:t>
+      </w:r>
+      <w:r>
+        <w:rPr>
+          <w:b w:val="0"/>
+          <w:i w:val="0"/>
+        </w:rPr>
+        <w:t xml:space="preserve"> An assistant drafted tests from class contracts and found a boundary case I had not enumerated: a boolean score, an </w:t>
+      </w:r>
+      <w:r>
+        <w:rPr>
+          <w:rFonts w:ascii="Consolas" w:hAnsi="Consolas"/>
+          <w:sz w:val="19"/>
+        </w:rPr>
+        <w:t>int</w:t>
+      </w:r>
+      <w:r>
+        <w:rPr>
+          <w:b w:val="0"/>
+          <w:i w:val="0"/>
+        </w:rPr>
+        <w:t xml:space="preserve"> in Python, which would otherwise pass </w:t>
+      </w:r>
+      <w:r>
+        <w:rPr>
+          <w:rFonts w:ascii="Consolas" w:hAnsi="Consolas"/>
+          <w:sz w:val="19"/>
+        </w:rPr>
+        <w:t>isinstance</w:t>
+      </w:r>
+      <w:r>
+        <w:rPr>
+          <w:b w:val="0"/>
+          <w:i w:val="0"/>
+        </w:rPr>
+        <w:t>. It also produced confidently wrong assertions, such as expecting one masked character where all but the last four are masked. Neither was detectable by reading the test, only by running it and understanding why it failed.</w:t>
+      </w:r>
+    </w:p>
+    <w:p>
+      <w:pPr>
+        <w:pStyle w:val="Heading2"/>
+      </w:pPr>
+      <w:r>
+        <w:rPr>
+          <w:b w:val="0"/>
+          <w:i w:val="0"/>
+        </w:rPr>
+        <w:t>2.9 Capstone: scalable architecture, robustness and AI-readiness</w:t>
+      </w:r>
+    </w:p>
+    <w:p>
+      <w:pPr>
+        <w:spacing w:after="120"/>
+      </w:pPr>
+      <w:r>
+        <w:rPr>
           <w:b w:val="0"/>
           <w:i/>
         </w:rPr>
-        <w:t>inside</w:t>
-      </w:r>
-      <w:r>
-        <w:rPr>
-          <w:b w:val="0"/>
-          <w:i w:val="0"/>
-        </w:rPr>
-        <w:t xml:space="preserve"> </w:t>
-      </w:r>
-      <w:r>
-        <w:rPr>
-          <w:rFonts w:ascii="Consolas" w:hAnsi="Consolas"/>
-          <w:sz w:val="19"/>
-        </w:rPr>
-        <w:t>FallbackDecorator</w:t>
-      </w:r>
-      <w:r>
-        <w:rPr>
-          <w:b w:val="0"/>
-          <w:i w:val="0"/>
-        </w:rPr>
-        <w:t>. Every per-decorator test passed; the defect appeared only when a test asserted that a degraded decision still reaches the audit sink, which it did not, because the substituted decision was produced outside the auditor. The fix moves auditing outside the fallback, and the docstring records why.</w:t>
-      </w:r>
-    </w:p>
-    <w:p>
-      <w:pPr>
-        <w:pStyle w:val="Heading2"/>
-      </w:pPr>
-      <w:r>
-        <w:rPr>
-          <w:b w:val="0"/>
-          <w:i w:val="0"/>
-        </w:rPr>
-        <w:t>2.4 Artefact D — Visitor: analytics and reporting</w:t>
+        <w:t>Scalability:</w:t>
+      </w:r>
+      <w:r>
+        <w:rPr>
+          <w:b w:val="0"/>
+          <w:i w:val="0"/>
+        </w:rPr>
+        <w:t xml:space="preserve"> feature computation is pure and parallelisable, caching is an inner decorator replaceable by a distributed cache, and provider families isolate network mechanics behind one callable. </w:t>
+      </w:r>
+      <w:r>
+        <w:rPr>
+          <w:b w:val="0"/>
+          <w:i/>
+        </w:rPr>
+        <w:t>Robustness and AI-readiness:</w:t>
+      </w:r>
+      <w:r>
+        <w:rPr>
+          <w:b w:val="0"/>
+          <w:i w:val="0"/>
+        </w:rPr>
+        <w:t xml:space="preserve"> 355 deterministic tests assert degradation reaching the audit trail, redaction before any payload is seen, malformed replies rejected and illegal transitions refused.</w:t>
       </w:r>
     </w:p>
     <w:p>
@@ -2335,1237 +2340,10 @@
       </w:pPr>
       <w:r>
         <w:rPr>
-          <w:rFonts w:ascii="Consolas" w:hAnsi="Consolas"/>
-          <w:sz w:val="19"/>
-        </w:rPr>
-        <w:t>ReportVisitor</w:t>
-      </w:r>
-      <w:r>
-        <w:rPr>
-          <w:b w:val="0"/>
-          <w:i w:val="0"/>
-        </w:rPr>
-        <w:t xml:space="preserve"> declares </w:t>
-      </w:r>
-      <w:r>
-        <w:rPr>
-          <w:rFonts w:ascii="Consolas" w:hAnsi="Consolas"/>
-          <w:sz w:val="19"/>
-        </w:rPr>
-        <w:t>visit_batch</w:t>
-      </w:r>
-      <w:r>
-        <w:rPr>
-          <w:b w:val="0"/>
-          <w:i w:val="0"/>
-        </w:rPr>
-        <w:t xml:space="preserve">, </w:t>
-      </w:r>
-      <w:r>
-        <w:rPr>
-          <w:rFonts w:ascii="Consolas" w:hAnsi="Consolas"/>
-          <w:sz w:val="19"/>
-        </w:rPr>
-        <w:t>visit_scored_transaction</w:t>
-      </w:r>
-      <w:r>
-        <w:rPr>
-          <w:b w:val="0"/>
-          <w:i w:val="0"/>
-        </w:rPr>
-        <w:t xml:space="preserve"> and </w:t>
-      </w:r>
-      <w:r>
-        <w:rPr>
-          <w:rFonts w:ascii="Consolas" w:hAnsi="Consolas"/>
-          <w:sz w:val="19"/>
-        </w:rPr>
-        <w:t>result</w:t>
-      </w:r>
-      <w:r>
-        <w:rPr>
-          <w:b w:val="0"/>
-          <w:i w:val="0"/>
-        </w:rPr>
-        <w:t xml:space="preserve">; four visitors — </w:t>
-      </w:r>
-      <w:r>
-        <w:rPr>
-          <w:rFonts w:ascii="Consolas" w:hAnsi="Consolas"/>
-          <w:sz w:val="19"/>
-        </w:rPr>
-        <w:t>RiskSummaryVisitor</w:t>
-      </w:r>
-      <w:r>
-        <w:rPr>
-          <w:b w:val="0"/>
-          <w:i w:val="0"/>
-        </w:rPr>
-        <w:t xml:space="preserve">, </w:t>
-      </w:r>
-      <w:r>
-        <w:rPr>
-          <w:rFonts w:ascii="Consolas" w:hAnsi="Consolas"/>
-          <w:sz w:val="19"/>
-        </w:rPr>
-        <w:t>BlockedTransactionVisitor(minimum_score)</w:t>
-      </w:r>
-      <w:r>
-        <w:rPr>
-          <w:b w:val="0"/>
-          <w:i w:val="0"/>
-        </w:rPr>
-        <w:t xml:space="preserve">, </w:t>
-      </w:r>
-      <w:r>
-        <w:rPr>
-          <w:rFonts w:ascii="Consolas" w:hAnsi="Consolas"/>
-          <w:sz w:val="19"/>
-        </w:rPr>
-        <w:t>JsonExportVisitor</w:t>
-      </w:r>
-      <w:r>
-        <w:rPr>
-          <w:b w:val="0"/>
-          <w:i w:val="0"/>
-        </w:rPr>
-        <w:t xml:space="preserve"> and </w:t>
-      </w:r>
-      <w:r>
-        <w:rPr>
-          <w:rFonts w:ascii="Consolas" w:hAnsi="Consolas"/>
-          <w:sz w:val="19"/>
-        </w:rPr>
-        <w:t>ChannelRiskVisitor</w:t>
-      </w:r>
-      <w:r>
-        <w:rPr>
-          <w:b w:val="0"/>
-          <w:i w:val="0"/>
-        </w:rPr>
-        <w:t xml:space="preserve"> — run through a </w:t>
-      </w:r>
-      <w:r>
-        <w:rPr>
-          <w:rFonts w:ascii="Consolas" w:hAnsi="Consolas"/>
-          <w:sz w:val="19"/>
-        </w:rPr>
-        <w:t>render(batch, visitor)</w:t>
-      </w:r>
-      <w:r>
-        <w:rPr>
-          <w:b w:val="0"/>
-          <w:i w:val="0"/>
-        </w:rPr>
-        <w:t xml:space="preserve"> driver. </w:t>
-      </w:r>
-      <w:r>
-        <w:rPr>
-          <w:rFonts w:ascii="Consolas" w:hAnsi="Consolas"/>
-          <w:sz w:val="19"/>
-        </w:rPr>
-        <w:t>ScoredBatch</w:t>
-      </w:r>
-      <w:r>
-        <w:rPr>
-          <w:b w:val="0"/>
-          <w:i w:val="0"/>
-        </w:rPr>
-        <w:t xml:space="preserve"> and </w:t>
-      </w:r>
-      <w:r>
-        <w:rPr>
-          <w:rFonts w:ascii="Consolas" w:hAnsi="Consolas"/>
-          <w:sz w:val="19"/>
-        </w:rPr>
-        <w:t>ScoredTransaction</w:t>
-      </w:r>
-      <w:r>
-        <w:rPr>
-          <w:b w:val="0"/>
-          <w:i w:val="0"/>
-        </w:rPr>
-        <w:t xml:space="preserve"> are immutable value objects that should not accumulate report logic, while reporting needs operations added repeatedly; adding a report is one class and no edit to the elements, demonstrated by </w:t>
-      </w:r>
-      <w:r>
-        <w:rPr>
-          <w:rFonts w:ascii="Consolas" w:hAnsi="Consolas"/>
-          <w:sz w:val="19"/>
-        </w:rPr>
-        <w:t>ChannelRiskVisitor</w:t>
-      </w:r>
-      <w:r>
-        <w:rPr>
-          <w:b w:val="0"/>
-          <w:i w:val="0"/>
-        </w:rPr>
-        <w:t xml:space="preserve">. </w:t>
-      </w:r>
-      <w:r>
-        <w:rPr>
-          <w:b/>
-          <w:i w:val="0"/>
-        </w:rPr>
-        <w:t>Critical commentary.</w:t>
-      </w:r>
-      <w:r>
-        <w:rPr>
-          <w:b w:val="0"/>
-          <w:i w:val="0"/>
-        </w:rPr>
-        <w:t xml:space="preserve"> A new </w:t>
-      </w:r>
-      <w:r>
-        <w:rPr>
-          <w:b w:val="0"/>
-          <w:i/>
-        </w:rPr>
-        <w:t>element</w:t>
-      </w:r>
-      <w:r>
-        <w:rPr>
-          <w:b w:val="0"/>
-          <w:i w:val="0"/>
-        </w:rPr>
-        <w:t xml:space="preserve"> type would force every visitor to change, which is acceptable because the element hierarchy is closed. The subtler risk is redaction drift: </w:t>
-      </w:r>
-      <w:r>
-        <w:rPr>
-          <w:rFonts w:ascii="Consolas" w:hAnsi="Consolas"/>
-          <w:sz w:val="19"/>
-        </w:rPr>
-        <w:t>JsonExportVisitor</w:t>
-      </w:r>
-      <w:r>
-        <w:rPr>
-          <w:b w:val="0"/>
-          <w:i w:val="0"/>
-        </w:rPr>
-        <w:t xml:space="preserve"> exports only the last four characters of the account number, and the run asserts that no exported record contains a full identifier.</w:t>
-      </w:r>
-    </w:p>
-    <w:p>
-      <w:pPr>
-        <w:pStyle w:val="Heading2"/>
-      </w:pPr>
-      <w:r>
-        <w:rPr>
-          <w:b w:val="0"/>
-          <w:i w:val="0"/>
-        </w:rPr>
-        <w:t>2.5 Artefact E — Abstract Factory: swapping AI service providers</w:t>
-      </w:r>
-    </w:p>
-    <w:p>
-      <w:pPr>
-        <w:spacing w:after="120"/>
-      </w:pPr>
-      <w:r>
-        <w:rPr>
-          <w:rFonts w:ascii="Consolas" w:hAnsi="Consolas"/>
-          <w:sz w:val="19"/>
-        </w:rPr>
-        <w:t>AiProviderFactory</w:t>
-      </w:r>
-      <w:r>
-        <w:rPr>
-          <w:b w:val="0"/>
-          <w:i w:val="0"/>
-        </w:rPr>
-        <w:t xml:space="preserve"> creates a </w:t>
-      </w:r>
-      <w:r>
-        <w:rPr>
-          <w:b w:val="0"/>
-          <w:i/>
-        </w:rPr>
-        <w:t>family</w:t>
-      </w:r>
-      <w:r>
-        <w:rPr>
-          <w:b w:val="0"/>
-          <w:i w:val="0"/>
-        </w:rPr>
-        <w:t xml:space="preserve">: </w:t>
-      </w:r>
-      <w:r>
-        <w:rPr>
-          <w:rFonts w:ascii="Consolas" w:hAnsi="Consolas"/>
-          <w:sz w:val="19"/>
-        </w:rPr>
-        <w:t>create_config()</w:t>
-      </w:r>
-      <w:r>
-        <w:rPr>
-          <w:b w:val="0"/>
-          <w:i w:val="0"/>
-        </w:rPr>
-        <w:t xml:space="preserve">, </w:t>
-      </w:r>
-      <w:r>
-        <w:rPr>
-          <w:rFonts w:ascii="Consolas" w:hAnsi="Consolas"/>
-          <w:sz w:val="19"/>
-        </w:rPr>
-        <w:t>create_backend()</w:t>
-      </w:r>
-      <w:r>
-        <w:rPr>
-          <w:b w:val="0"/>
-          <w:i w:val="0"/>
-        </w:rPr>
-        <w:t xml:space="preserve"> and </w:t>
-      </w:r>
-      <w:r>
-        <w:rPr>
-          <w:rFonts w:ascii="Consolas" w:hAnsi="Consolas"/>
-          <w:sz w:val="19"/>
-        </w:rPr>
-        <w:t>create_explanation_generator()</w:t>
-      </w:r>
-      <w:r>
-        <w:rPr>
-          <w:b w:val="0"/>
-          <w:i w:val="0"/>
-        </w:rPr>
-        <w:t xml:space="preserve">, with </w:t>
-      </w:r>
-      <w:r>
-        <w:rPr>
-          <w:rFonts w:ascii="Consolas" w:hAnsi="Consolas"/>
-          <w:sz w:val="19"/>
-        </w:rPr>
-        <w:t>LocalHeuristicProviderFactory</w:t>
-      </w:r>
-      <w:r>
-        <w:rPr>
-          <w:b w:val="0"/>
-          <w:i w:val="0"/>
-        </w:rPr>
-        <w:t xml:space="preserve"> producing an on-premise heuristic backend and template explainer and </w:t>
-      </w:r>
-      <w:r>
-        <w:rPr>
-          <w:rFonts w:ascii="Consolas" w:hAnsi="Consolas"/>
-          <w:sz w:val="19"/>
-        </w:rPr>
-        <w:t>HostedLlmProviderFactory</w:t>
-      </w:r>
-      <w:r>
-        <w:rPr>
-          <w:b w:val="0"/>
-          <w:i w:val="0"/>
-        </w:rPr>
-        <w:t xml:space="preserve"> a networked backend and narrative explainer, both around an </w:t>
-      </w:r>
-      <w:r>
-        <w:rPr>
-          <w:b/>
-          <w:i w:val="0"/>
-        </w:rPr>
-        <w:t>injected transport callable</w:t>
-      </w:r>
-      <w:r>
-        <w:rPr>
-          <w:b w:val="0"/>
-          <w:i w:val="0"/>
-        </w:rPr>
-        <w:t xml:space="preserve">. </w:t>
-      </w:r>
-      <w:r>
-        <w:rPr>
-          <w:rFonts w:ascii="Consolas" w:hAnsi="Consolas"/>
-          <w:sz w:val="19"/>
-        </w:rPr>
-        <w:t>assemble()</w:t>
-      </w:r>
-      <w:r>
-        <w:rPr>
-          <w:b w:val="0"/>
-          <w:i w:val="0"/>
-        </w:rPr>
-        <w:t xml:space="preserve"> returns the family only after a consistency check, because a hosted endpoint with redaction off or a narrative explainer paired with a backend that cannot produce one are contradictions. </w:t>
-      </w:r>
-      <w:r>
-        <w:rPr>
-          <w:b/>
-          <w:i w:val="0"/>
-        </w:rPr>
-        <w:t>Critical commentary.</w:t>
-      </w:r>
-      <w:r>
-        <w:rPr>
-          <w:b w:val="0"/>
-          <w:i w:val="0"/>
-        </w:rPr>
-        <w:t xml:space="preserve"> With two families this is arguable, but the family relationship is the real invariant and a tuple-returning function would make the consistency check optional. The payoff is that nothing in </w:t>
-      </w:r>
-      <w:r>
-        <w:rPr>
-          <w:rFonts w:ascii="Consolas" w:hAnsi="Consolas"/>
-          <w:sz w:val="19"/>
-        </w:rPr>
-        <w:t>strategies.py</w:t>
-      </w:r>
-      <w:r>
-        <w:rPr>
-          <w:b w:val="0"/>
-          <w:i w:val="0"/>
-        </w:rPr>
-        <w:t xml:space="preserve"> or </w:t>
-      </w:r>
-      <w:r>
-        <w:rPr>
-          <w:rFonts w:ascii="Consolas" w:hAnsi="Consolas"/>
-          <w:sz w:val="19"/>
-        </w:rPr>
-        <w:t>service.py</w:t>
-      </w:r>
-      <w:r>
-        <w:rPr>
-          <w:b w:val="0"/>
-          <w:i w:val="0"/>
-        </w:rPr>
-        <w:t xml:space="preserve"> imports </w:t>
-      </w:r>
-      <w:r>
-        <w:rPr>
-          <w:rFonts w:ascii="Consolas" w:hAnsi="Consolas"/>
-          <w:sz w:val="19"/>
-        </w:rPr>
-        <w:t>requests</w:t>
-      </w:r>
-      <w:r>
-        <w:rPr>
-          <w:b w:val="0"/>
-          <w:i w:val="0"/>
-        </w:rPr>
-        <w:t xml:space="preserve">, </w:t>
-      </w:r>
-      <w:r>
-        <w:rPr>
-          <w:rFonts w:ascii="Consolas" w:hAnsi="Consolas"/>
-          <w:sz w:val="19"/>
-        </w:rPr>
-        <w:t>httpx</w:t>
-      </w:r>
-      <w:r>
-        <w:rPr>
-          <w:b w:val="0"/>
-          <w:i w:val="0"/>
-        </w:rPr>
-        <w:t xml:space="preserve"> or a vendor SDK, so the remote path is exercised offline.</w:t>
-      </w:r>
-    </w:p>
-    <w:p>
-      <w:pPr>
-        <w:pStyle w:val="Heading2"/>
-      </w:pPr>
-      <w:r>
-        <w:rPr>
-          <w:b w:val="0"/>
-          <w:i w:val="0"/>
-        </w:rPr>
-        <w:t>2.6 Artefacts F and G — Model Registry and Feature Store</w:t>
-      </w:r>
-    </w:p>
-    <w:p>
-      <w:pPr>
-        <w:spacing w:after="120"/>
-      </w:pPr>
-      <w:r>
-        <w:rPr>
-          <w:b/>
-          <w:i w:val="0"/>
-        </w:rPr>
-        <w:t>Registry</w:t>
-      </w:r>
-      <w:r>
-        <w:rPr>
-          <w:b w:val="0"/>
-          <w:i w:val="0"/>
-        </w:rPr>
-        <w:t xml:space="preserve"> (</w:t>
-      </w:r>
-      <w:r>
-        <w:rPr>
-          <w:rFonts w:ascii="Consolas" w:hAnsi="Consolas"/>
-          <w:sz w:val="19"/>
-        </w:rPr>
-        <w:t>model_registry.py</w:t>
-      </w:r>
-      <w:r>
-        <w:rPr>
-          <w:b w:val="0"/>
-          <w:i w:val="0"/>
-        </w:rPr>
-        <w:t xml:space="preserve">). </w:t>
-      </w:r>
-      <w:r>
-        <w:rPr>
-          <w:rFonts w:ascii="Consolas" w:hAnsi="Consolas"/>
-          <w:sz w:val="19"/>
-        </w:rPr>
-        <w:t>ModelRecord</w:t>
-      </w:r>
-      <w:r>
-        <w:rPr>
-          <w:b w:val="0"/>
-          <w:i w:val="0"/>
-        </w:rPr>
-        <w:t xml:space="preserve"> is immutable — name, version, stage, artifact reference, metrics, </w:t>
-      </w:r>
-      <w:r>
-        <w:rPr>
-          <w:rFonts w:ascii="Consolas" w:hAnsi="Consolas"/>
-          <w:sz w:val="19"/>
-        </w:rPr>
-        <w:t>registered_by</w:t>
-      </w:r>
-      <w:r>
-        <w:rPr>
-          <w:b w:val="0"/>
-          <w:i w:val="0"/>
-        </w:rPr>
-        <w:t xml:space="preserve"> — and </w:t>
-      </w:r>
-      <w:r>
-        <w:rPr>
-          <w:rFonts w:ascii="Consolas" w:hAnsi="Consolas"/>
-          <w:sz w:val="19"/>
-        </w:rPr>
-        <w:t>ModelRegistry</w:t>
-      </w:r>
-      <w:r>
-        <w:rPr>
-          <w:b w:val="0"/>
-          <w:i w:val="0"/>
-        </w:rPr>
-        <w:t xml:space="preserve"> is thread-safe, enforcing </w:t>
-      </w:r>
-      <w:r>
-        <w:rPr>
-          <w:rFonts w:ascii="Consolas" w:hAnsi="Consolas"/>
-          <w:sz w:val="19"/>
-        </w:rPr>
-        <w:t>_ALLOWED_TRANSITIONS</w:t>
-      </w:r>
-      <w:r>
-        <w:rPr>
-          <w:b w:val="0"/>
-          <w:i w:val="0"/>
-        </w:rPr>
-        <w:t xml:space="preserve">. Run section 7 shows the lifecycle: 2.1.0 live, 2.2.0 registered into </w:t>
-      </w:r>
-      <w:r>
-        <w:rPr>
-          <w:rFonts w:ascii="Consolas" w:hAnsi="Consolas"/>
-          <w:sz w:val="19"/>
-        </w:rPr>
-        <w:t>DEVELOPMENT</w:t>
-      </w:r>
-      <w:r>
-        <w:rPr>
-          <w:b w:val="0"/>
-          <w:i w:val="0"/>
-        </w:rPr>
-        <w:t xml:space="preserve">, promoted through </w:t>
-      </w:r>
-      <w:r>
-        <w:rPr>
-          <w:rFonts w:ascii="Consolas" w:hAnsi="Consolas"/>
-          <w:sz w:val="19"/>
-        </w:rPr>
-        <w:t>STAGING</w:t>
-      </w:r>
-      <w:r>
-        <w:rPr>
-          <w:b w:val="0"/>
-          <w:i w:val="0"/>
-        </w:rPr>
-        <w:t xml:space="preserve"> to </w:t>
-      </w:r>
-      <w:r>
-        <w:rPr>
-          <w:rFonts w:ascii="Consolas" w:hAnsi="Consolas"/>
-          <w:sz w:val="19"/>
-        </w:rPr>
-        <w:t>PRODUCTION</w:t>
-      </w:r>
-      <w:r>
-        <w:rPr>
-          <w:b w:val="0"/>
-          <w:i w:val="0"/>
-        </w:rPr>
-        <w:t xml:space="preserve">, 2.1.0 archived and the next decision recording </w:t>
-      </w:r>
-      <w:r>
-        <w:rPr>
-          <w:rFonts w:ascii="Consolas" w:hAnsi="Consolas"/>
-          <w:sz w:val="19"/>
-        </w:rPr>
-        <w:t>transaction-risk:2.2.0</w:t>
-      </w:r>
-      <w:r>
-        <w:rPr>
-          <w:b w:val="0"/>
-          <w:i w:val="0"/>
-        </w:rPr>
-        <w:t xml:space="preserve">. </w:t>
-      </w:r>
-      <w:r>
-        <w:rPr>
-          <w:b/>
-          <w:i w:val="0"/>
-        </w:rPr>
-        <w:t>Defect found and fixed:</w:t>
-      </w:r>
-      <w:r>
-        <w:rPr>
-          <w:b w:val="0"/>
-          <w:i w:val="0"/>
-        </w:rPr>
-        <w:t xml:space="preserve"> </w:t>
-      </w:r>
-      <w:r>
-        <w:rPr>
-          <w:rFonts w:ascii="Consolas" w:hAnsi="Consolas"/>
-          <w:sz w:val="19"/>
-        </w:rPr>
-        <w:t>promote()</w:t>
-      </w:r>
-      <w:r>
-        <w:rPr>
-          <w:b w:val="0"/>
-          <w:i w:val="0"/>
-        </w:rPr>
-        <w:t xml:space="preserve"> returned the updated record but never wrote it back into the internal mapping; single-call tests passed because the return value was correct, and the bug surfaced only when a test promoted a version and then asked the registry what was live — an assertion on a return value cannot detect a missing state mutation. The registry now asserts through a second read path (</w:t>
-      </w:r>
-      <w:r>
-        <w:rPr>
-          <w:rFonts w:ascii="Consolas" w:hAnsi="Consolas"/>
-          <w:sz w:val="19"/>
-        </w:rPr>
-        <w:t>get_production</w:t>
-      </w:r>
-      <w:r>
-        <w:rPr>
-          <w:b w:val="0"/>
-          <w:i w:val="0"/>
-        </w:rPr>
-        <w:t xml:space="preserve">, </w:t>
-      </w:r>
-      <w:r>
-        <w:rPr>
-          <w:rFonts w:ascii="Consolas" w:hAnsi="Consolas"/>
-          <w:sz w:val="19"/>
-        </w:rPr>
-        <w:t>history</w:t>
-      </w:r>
-      <w:r>
-        <w:rPr>
-          <w:b w:val="0"/>
-          <w:i w:val="0"/>
-        </w:rPr>
-        <w:t>) after every transition.</w:t>
-      </w:r>
-    </w:p>
-    <w:p>
-      <w:pPr>
-        <w:spacing w:after="120"/>
-      </w:pPr>
-      <w:r>
-        <w:rPr>
-          <w:b/>
-          <w:i w:val="0"/>
-        </w:rPr>
-        <w:t>Feature Store</w:t>
-      </w:r>
-      <w:r>
-        <w:rPr>
-          <w:b w:val="0"/>
-          <w:i w:val="0"/>
-        </w:rPr>
-        <w:t xml:space="preserve"> (</w:t>
-      </w:r>
-      <w:r>
-        <w:rPr>
-          <w:rFonts w:ascii="Consolas" w:hAnsi="Consolas"/>
-          <w:sz w:val="19"/>
-        </w:rPr>
-        <w:t>feature_store.py</w:t>
-      </w:r>
-      <w:r>
-        <w:rPr>
-          <w:b w:val="0"/>
-          <w:i w:val="0"/>
-        </w:rPr>
-        <w:t xml:space="preserve">). </w:t>
-      </w:r>
-      <w:r>
-        <w:rPr>
-          <w:rFonts w:ascii="Consolas" w:hAnsi="Consolas"/>
-          <w:sz w:val="19"/>
-        </w:rPr>
-        <w:t>FeatureDefinition</w:t>
-      </w:r>
-      <w:r>
-        <w:rPr>
-          <w:b w:val="0"/>
-          <w:i w:val="0"/>
-        </w:rPr>
-        <w:t xml:space="preserve"> (name, version, description, </w:t>
-      </w:r>
-      <w:r>
-        <w:rPr>
-          <w:rFonts w:ascii="Consolas" w:hAnsi="Consolas"/>
-          <w:sz w:val="19"/>
-        </w:rPr>
-        <w:t>extractor</w:t>
-      </w:r>
-      <w:r>
-        <w:rPr>
-          <w:b w:val="0"/>
-          <w:i w:val="0"/>
-        </w:rPr>
-        <w:t xml:space="preserve">, </w:t>
-      </w:r>
-      <w:r>
-        <w:rPr>
-          <w:rFonts w:ascii="Consolas" w:hAnsi="Consolas"/>
-          <w:sz w:val="19"/>
-        </w:rPr>
-        <w:t>owner</w:t>
-      </w:r>
-      <w:r>
-        <w:rPr>
-          <w:b w:val="0"/>
-          <w:i w:val="0"/>
-        </w:rPr>
-        <w:t xml:space="preserve">) backs a store with a re-entrant lock and seven features; re-registering the same name and version is a no-op so start-up is idempotent, while a </w:t>
-      </w:r>
-      <w:r>
-        <w:rPr>
-          <w:b w:val="0"/>
-          <w:i/>
-        </w:rPr>
-        <w:t>different</w:t>
-      </w:r>
-      <w:r>
-        <w:rPr>
-          <w:b w:val="0"/>
-          <w:i w:val="0"/>
-        </w:rPr>
-        <w:t xml:space="preserve"> version under an existing name raises. </w:t>
-      </w:r>
-      <w:r>
-        <w:rPr>
-          <w:b/>
-          <w:i w:val="0"/>
-        </w:rPr>
-        <w:t>Critical commentary.</w:t>
-      </w:r>
-      <w:r>
-        <w:rPr>
-          <w:b w:val="0"/>
-          <w:i w:val="0"/>
-        </w:rPr>
-        <w:t xml:space="preserve"> The decisive choice was refusing to treat a missing feature as zero or a non-finite value silently: the rules engine skips a rule whose feature is absent, recording the omission by its absence from </w:t>
-      </w:r>
-      <w:r>
-        <w:rPr>
-          <w:rFonts w:ascii="Consolas" w:hAnsi="Consolas"/>
-          <w:sz w:val="19"/>
-        </w:rPr>
-        <w:t>contributions</w:t>
-      </w:r>
-      <w:r>
-        <w:rPr>
-          <w:b w:val="0"/>
-          <w:i w:val="0"/>
-        </w:rPr>
-        <w:t xml:space="preserve">, and </w:t>
-      </w:r>
-      <w:r>
-        <w:rPr>
-          <w:rFonts w:ascii="Consolas" w:hAnsi="Consolas"/>
-          <w:sz w:val="19"/>
-        </w:rPr>
-        <w:t>compute</w:t>
-      </w:r>
-      <w:r>
-        <w:rPr>
-          <w:b w:val="0"/>
-          <w:i w:val="0"/>
-        </w:rPr>
-        <w:t xml:space="preserve"> converts a non-finite extractor result into </w:t>
-      </w:r>
-      <w:r>
-        <w:rPr>
-          <w:rFonts w:ascii="Consolas" w:hAnsi="Consolas"/>
-          <w:sz w:val="19"/>
-        </w:rPr>
-        <w:t>FeatureStoreError</w:t>
-      </w:r>
-      <w:r>
-        <w:rPr>
-          <w:b w:val="0"/>
-          <w:i w:val="0"/>
-        </w:rPr>
-        <w:t>.</w:t>
-      </w:r>
-    </w:p>
-    <w:p>
-      <w:pPr>
-        <w:pStyle w:val="Heading2"/>
-      </w:pPr>
-      <w:r>
-        <w:rPr>
-          <w:b w:val="0"/>
-          <w:i w:val="0"/>
-        </w:rPr>
-        <w:t>2.7 Artefact H — Dependency Injection and inversion of control</w:t>
-      </w:r>
-    </w:p>
-    <w:p>
-      <w:pPr>
-        <w:spacing w:after="120"/>
-      </w:pPr>
-      <w:r>
-        <w:rPr>
-          <w:rFonts w:ascii="Consolas" w:hAnsi="Consolas"/>
-          <w:sz w:val="19"/>
-        </w:rPr>
-        <w:t>RiskAssessmentService</w:t>
-      </w:r>
-      <w:r>
-        <w:rPr>
-          <w:b w:val="0"/>
-          <w:i w:val="0"/>
-        </w:rPr>
-        <w:t xml:space="preserve"> takes its component, feature store, feature names, context provider and explainer as constructor arguments. </w:t>
-      </w:r>
-      <w:r>
-        <w:rPr>
-          <w:rFonts w:ascii="Consolas" w:hAnsi="Consolas"/>
-          <w:sz w:val="19"/>
-        </w:rPr>
-        <w:t>ServiceContainer</w:t>
-      </w:r>
-      <w:r>
-        <w:rPr>
-          <w:b w:val="0"/>
-          <w:i w:val="0"/>
-        </w:rPr>
-        <w:t xml:space="preserve"> is a deliberately minimal locator with explicit factories, lazy singleton caching and a loud </w:t>
-      </w:r>
-      <w:r>
-        <w:rPr>
-          <w:rFonts w:ascii="Consolas" w:hAnsi="Consolas"/>
-          <w:sz w:val="19"/>
-        </w:rPr>
-        <w:t>ValidationError</w:t>
-      </w:r>
-      <w:r>
-        <w:rPr>
-          <w:b w:val="0"/>
-          <w:i w:val="0"/>
-        </w:rPr>
-        <w:t xml:space="preserve"> naming the missing key, and </w:t>
-      </w:r>
-      <w:r>
-        <w:rPr>
-          <w:rFonts w:ascii="Consolas" w:hAnsi="Consolas"/>
-          <w:sz w:val="19"/>
-        </w:rPr>
-        <w:t>build_risk_service()</w:t>
-      </w:r>
-      <w:r>
-        <w:rPr>
-          <w:b w:val="0"/>
-          <w:i w:val="0"/>
-        </w:rPr>
-        <w:t xml:space="preserve"> is the composition root, the only function naming concrete implementations. Every dependency that would otherwise touch the outside world — transport, clock, sink, backend — is a constructor argument, which makes the suite deterministic and offline. </w:t>
-      </w:r>
-      <w:r>
-        <w:rPr>
-          <w:b/>
-          <w:i w:val="0"/>
-        </w:rPr>
-        <w:t>Critical commentary.</w:t>
-      </w:r>
-      <w:r>
-        <w:rPr>
-          <w:b w:val="0"/>
-          <w:i w:val="0"/>
-        </w:rPr>
-        <w:t xml:space="preserve"> A framework container would be over-engineering at this size, so the container is about 45 lines and prefers explicit factories to convention-based resolution; a service locator hides dependencies from the type checker, so it stays at the outer edge (Fowler, 2004).</w:t>
-      </w:r>
-    </w:p>
-    <w:p>
-      <w:pPr>
-        <w:pStyle w:val="Heading2"/>
-      </w:pPr>
-      <w:r>
-        <w:rPr>
-          <w:b w:val="0"/>
-          <w:i w:val="0"/>
-        </w:rPr>
-        <w:t>2.8 Artefact I — Testing: mocking and AI-assisted testing without live models</w:t>
-      </w:r>
-    </w:p>
-    <w:p>
-      <w:pPr>
-        <w:spacing w:after="120"/>
-      </w:pPr>
-      <w:r>
-        <w:rPr>
-          <w:rFonts w:ascii="Consolas" w:hAnsi="Consolas"/>
-          <w:sz w:val="19"/>
-        </w:rPr>
-        <w:t>capstone/tests/</w:t>
-      </w:r>
-      <w:r>
-        <w:rPr>
-          <w:b w:val="0"/>
-          <w:i w:val="0"/>
-        </w:rPr>
-        <w:t xml:space="preserve"> holds nine modules and 355 tests at 99% coverage of 2,512 statements, running in under 1.5 seconds entirely offline (394 tests including Unit 6). </w:t>
-      </w:r>
-      <w:r>
-        <w:rPr>
-          <w:rFonts w:ascii="Consolas" w:hAnsi="Consolas"/>
-          <w:sz w:val="19"/>
-        </w:rPr>
-        <w:t>conftest.py</w:t>
-      </w:r>
-      <w:r>
-        <w:rPr>
-          <w:b w:val="0"/>
-          <w:i w:val="0"/>
-        </w:rPr>
-        <w:t xml:space="preserve"> names its doubles by category: </w:t>
-      </w:r>
-      <w:r>
-        <w:rPr>
-          <w:b/>
-          <w:i w:val="0"/>
-        </w:rPr>
-        <w:t>stubs</w:t>
-      </w:r>
-      <w:r>
-        <w:rPr>
-          <w:b w:val="0"/>
-          <w:i w:val="0"/>
-        </w:rPr>
-        <w:t xml:space="preserve"> (</w:t>
-      </w:r>
-      <w:r>
-        <w:rPr>
-          <w:rFonts w:ascii="Consolas" w:hAnsi="Consolas"/>
-          <w:sz w:val="19"/>
-        </w:rPr>
-        <w:t>CannedTransport</w:t>
-      </w:r>
-      <w:r>
-        <w:rPr>
-          <w:b w:val="0"/>
-          <w:i w:val="0"/>
-        </w:rPr>
-        <w:t xml:space="preserve">, </w:t>
-      </w:r>
-      <w:r>
-        <w:rPr>
-          <w:rFonts w:ascii="Consolas" w:hAnsi="Consolas"/>
-          <w:sz w:val="19"/>
-        </w:rPr>
-        <w:t>FailingBackend</w:t>
-      </w:r>
-      <w:r>
-        <w:rPr>
-          <w:b w:val="0"/>
-          <w:i w:val="0"/>
-        </w:rPr>
-        <w:t xml:space="preserve">, </w:t>
-      </w:r>
-      <w:r>
-        <w:rPr>
-          <w:rFonts w:ascii="Consolas" w:hAnsi="Consolas"/>
-          <w:sz w:val="19"/>
-        </w:rPr>
-        <w:t>StubScoringStrategy</w:t>
-      </w:r>
-      <w:r>
-        <w:rPr>
-          <w:b w:val="0"/>
-          <w:i w:val="0"/>
-        </w:rPr>
-        <w:t xml:space="preserve">), a </w:t>
-      </w:r>
-      <w:r>
-        <w:rPr>
-          <w:b/>
-          <w:i w:val="0"/>
-        </w:rPr>
-        <w:t>fake</w:t>
-      </w:r>
-      <w:r>
-        <w:rPr>
-          <w:b w:val="0"/>
-          <w:i w:val="0"/>
-        </w:rPr>
-        <w:t xml:space="preserve"> (</w:t>
-      </w:r>
-      <w:r>
-        <w:rPr>
-          <w:rFonts w:ascii="Consolas" w:hAnsi="Consolas"/>
-          <w:sz w:val="19"/>
-        </w:rPr>
-        <w:t>RecordingBackend</w:t>
-      </w:r>
-      <w:r>
-        <w:rPr>
-          <w:b w:val="0"/>
-          <w:i w:val="0"/>
-        </w:rPr>
-        <w:t xml:space="preserve">) and </w:t>
-      </w:r>
-      <w:r>
-        <w:rPr>
-          <w:b/>
-          <w:i w:val="0"/>
-        </w:rPr>
-        <w:t>spies</w:t>
-      </w:r>
-      <w:r>
-        <w:rPr>
-          <w:b w:val="0"/>
-          <w:i w:val="0"/>
-        </w:rPr>
-        <w:t xml:space="preserve"> (</w:t>
-      </w:r>
-      <w:r>
-        <w:rPr>
-          <w:rFonts w:ascii="Consolas" w:hAnsi="Consolas"/>
-          <w:sz w:val="19"/>
-        </w:rPr>
-        <w:t>CallRecorder</w:t>
-      </w:r>
-      <w:r>
-        <w:rPr>
-          <w:b w:val="0"/>
-          <w:i w:val="0"/>
-        </w:rPr>
-        <w:t xml:space="preserve">); </w:t>
-      </w:r>
-      <w:r>
-        <w:rPr>
-          <w:rFonts w:ascii="Consolas" w:hAnsi="Consolas"/>
-          <w:sz w:val="19"/>
-        </w:rPr>
-        <w:t>CannedTransport</w:t>
-      </w:r>
-      <w:r>
-        <w:rPr>
-          <w:b w:val="0"/>
-          <w:i w:val="0"/>
-        </w:rPr>
-        <w:t xml:space="preserve"> takes an optional payload </w:t>
-      </w:r>
-      <w:r>
-        <w:rPr>
-          <w:b w:val="0"/>
-          <w:i/>
-        </w:rPr>
-        <w:t>or</w:t>
-      </w:r>
-      <w:r>
-        <w:rPr>
-          <w:b w:val="0"/>
-          <w:i w:val="0"/>
-        </w:rPr>
-        <w:t xml:space="preserve"> error, so three lines cover success and outage.</w:t>
-      </w:r>
-    </w:p>
-    <w:p>
-      <w:pPr>
-        <w:spacing w:after="120"/>
-      </w:pPr>
-      <w:r>
-        <w:rPr>
-          <w:b/>
-          <w:i w:val="0"/>
-        </w:rPr>
-        <w:t>Reflection on AI-assisted testing.</w:t>
-      </w:r>
-      <w:r>
-        <w:rPr>
-          <w:b w:val="0"/>
-          <w:i w:val="0"/>
-        </w:rPr>
-        <w:t xml:space="preserve"> An AI assistant drafted tests from class contracts and found boundary cases I had not enumerated — a boolean score, which is an </w:t>
-      </w:r>
-      <w:r>
-        <w:rPr>
-          <w:rFonts w:ascii="Consolas" w:hAnsi="Consolas"/>
-          <w:sz w:val="19"/>
-        </w:rPr>
-        <w:t>int</w:t>
-      </w:r>
-      <w:r>
-        <w:rPr>
-          <w:b w:val="0"/>
-          <w:i w:val="0"/>
-        </w:rPr>
-        <w:t xml:space="preserve"> in Python and would otherwise pass </w:t>
-      </w:r>
-      <w:r>
-        <w:rPr>
-          <w:rFonts w:ascii="Consolas" w:hAnsi="Consolas"/>
-          <w:sz w:val="19"/>
-        </w:rPr>
-        <w:t>isinstance</w:t>
-      </w:r>
-      <w:r>
-        <w:rPr>
-          <w:b w:val="0"/>
-          <w:i w:val="0"/>
-        </w:rPr>
-        <w:t xml:space="preserve">, and a payload missing the score key. It also created risk: confidently wrong assertions, including a test that searched for the letter "a" to assert a feature name was absent (explanation text contains one), a redaction expectation of one masked character when the implementation masks all but the last four, and a contract that did not exist, that </w:t>
-      </w:r>
-      <w:r>
-        <w:rPr>
-          <w:rFonts w:ascii="Consolas" w:hAnsi="Consolas"/>
-          <w:sz w:val="19"/>
-        </w:rPr>
-        <w:t>history()</w:t>
-      </w:r>
-      <w:r>
-        <w:rPr>
-          <w:b w:val="0"/>
-          <w:i w:val="0"/>
-        </w:rPr>
-        <w:t xml:space="preserve"> returns an empty list for an unknown model when it deliberately raises. None were detectable by reading the generated test, only by running it and understanding why it failed, so AI assistance is an accelerant for breadth, not a substitute for judgement about what a correct assertion means.</w:t>
-      </w:r>
-    </w:p>
-    <w:p>
-      <w:pPr>
-        <w:pStyle w:val="Heading2"/>
-      </w:pPr>
-      <w:r>
-        <w:rPr>
-          <w:b w:val="0"/>
-          <w:i w:val="0"/>
-        </w:rPr>
-        <w:t>2.9 Capstone: scalable architecture, robustness and AI-readiness</w:t>
-      </w:r>
-    </w:p>
-    <w:p>
-      <w:pPr>
-        <w:spacing w:after="120"/>
-      </w:pPr>
-      <w:r>
-        <w:rPr>
-          <w:b w:val="0"/>
-          <w:i w:val="0"/>
-        </w:rPr>
-        <w:t xml:space="preserve">The capstone is a </w:t>
-      </w:r>
-      <w:r>
-        <w:rPr>
-          <w:b/>
-          <w:i w:val="0"/>
-        </w:rPr>
-        <w:t>transaction risk-assessment engine</w:t>
-      </w:r>
-      <w:r>
-        <w:rPr>
-          <w:b w:val="0"/>
-          <w:i w:val="0"/>
-        </w:rPr>
-        <w:t xml:space="preserve">. </w:t>
-      </w:r>
-      <w:r>
-        <w:rPr>
-          <w:b w:val="0"/>
-          <w:i/>
-        </w:rPr>
-        <w:t>Scalability:</w:t>
-      </w:r>
-      <w:r>
-        <w:rPr>
-          <w:b w:val="0"/>
-          <w:i w:val="0"/>
-        </w:rPr>
-        <w:t xml:space="preserve"> feature computation is pure and parallelisable, caching is an inner decorator replaceable by a distributed cache, the registry centralises lifecycle state, and provider families isolate network mechanics behind one callable. </w:t>
-      </w:r>
-      <w:r>
-        <w:rPr>
-          <w:b w:val="0"/>
-          <w:i/>
-        </w:rPr>
-        <w:t>Robustness and AI-readiness:</w:t>
-      </w:r>
-      <w:r>
-        <w:rPr>
-          <w:b w:val="0"/>
-          <w:i w:val="0"/>
-        </w:rPr>
-        <w:t xml:space="preserve"> 355 deterministic tests assert degradation reaching the audit trail, redaction before any payload is seen, malformed replies rejected, promotion changing attribution, and illegal transitions refused; abstraction via </w:t>
-      </w:r>
-      <w:r>
-        <w:rPr>
-          <w:rFonts w:ascii="Consolas" w:hAnsi="Consolas"/>
-          <w:sz w:val="19"/>
-        </w:rPr>
-        <w:t>ScoringBackend</w:t>
-      </w:r>
-      <w:r>
-        <w:rPr>
-          <w:b w:val="0"/>
-          <w:i w:val="0"/>
-        </w:rPr>
-        <w:t xml:space="preserve">, contracts via </w:t>
-      </w:r>
-      <w:r>
-        <w:rPr>
-          <w:rFonts w:ascii="Consolas" w:hAnsi="Consolas"/>
-          <w:sz w:val="19"/>
-        </w:rPr>
-        <w:t>StrategyOutput</w:t>
-      </w:r>
-      <w:r>
-        <w:rPr>
-          <w:b w:val="0"/>
-          <w:i w:val="0"/>
-        </w:rPr>
-        <w:t xml:space="preserve"> and versioned </w:t>
-      </w:r>
-      <w:r>
-        <w:rPr>
-          <w:rFonts w:ascii="Consolas" w:hAnsi="Consolas"/>
-          <w:sz w:val="19"/>
-        </w:rPr>
-        <w:t>FeatureDefinition</w:t>
-      </w:r>
-      <w:r>
-        <w:rPr>
-          <w:b w:val="0"/>
-          <w:i w:val="0"/>
-        </w:rPr>
-        <w:t>, and a registry that makes model version a runtime fact.</w:t>
-      </w:r>
-    </w:p>
-    <w:p>
-      <w:pPr>
-        <w:spacing w:after="120"/>
-      </w:pPr>
-      <w:r>
-        <w:rPr>
-          <w:b w:val="0"/>
-          <w:i w:val="0"/>
-        </w:rPr>
-        <w:t>Figure 1 shows how these parts compose: the composition root, the decorator chain in its defended order, the strategy/backend seam, the adapters and the visitor.</w:t>
+          <w:b w:val="0"/>
+          <w:i w:val="0"/>
+        </w:rPr>
+        <w:t>Figure 1 shows the composition root, the decorator chain in its defended order, the strategy/backend seam, the adapters and the visitor.</w:t>
       </w:r>
     </w:p>
     <w:p>
@@ -3650,7 +2428,7 @@
           <w:b w:val="0"/>
           <w:i w:val="0"/>
         </w:rPr>
-        <w:t xml:space="preserve"> captures eight sections — a six-transaction batch yielding two </w:t>
+        <w:t xml:space="preserve"> captures eight sections — a six-transaction batch (two </w:t>
       </w:r>
       <w:r>
         <w:rPr>
@@ -3678,7 +2456,7 @@
           <w:b w:val="0"/>
           <w:i w:val="0"/>
         </w:rPr>
-        <w:t xml:space="preserve"> and one </w:t>
+        <w:t xml:space="preserve">, one </w:t>
       </w:r>
       <w:r>
         <w:rPr>
@@ -3692,7 +2470,7 @@
           <w:b w:val="0"/>
           <w:i w:val="0"/>
         </w:rPr>
-        <w:t>; six audit records containing no identifier; masking before egress (</w:t>
+        <w:t>); audit records with no identifier; masking before egress (</w:t>
       </w:r>
       <w:r>
         <w:rPr>
@@ -3720,7 +2498,7 @@
           <w:b w:val="0"/>
           <w:i w:val="0"/>
         </w:rPr>
-        <w:t>); a provider outage with a three-attempt retry budget and explicit degradation; hostile-payload rejection; model promotion with lifecycle enforcement; and singleton resolution.</w:t>
+        <w:t>); and a provider outage with a three-attempt retry budget.</w:t>
       </w:r>
     </w:p>
     <w:p>
@@ -3751,7 +2529,7 @@
           <w:b w:val="0"/>
           <w:i w:val="0"/>
         </w:rPr>
-        <w:t xml:space="preserve"> Every pattern was chosen against a rejected alternative and the rejections are part of the work: Strategy over a scorer hierarchy, Decorator over subclass combinations, Visitor over report methods, Abstract Factory over a factory function, constructor injection over a container inside the domain. </w:t>
+        <w:t xml:space="preserve"> Every pattern was chosen against a rejected alternative: Strategy over a scorer hierarchy, Decorator over subclass combinations, Visitor over report methods, Abstract Factory over a factory function. </w:t>
       </w:r>
       <w:r>
         <w:rPr>
@@ -3765,21 +2543,7 @@
           <w:b w:val="0"/>
           <w:i w:val="0"/>
         </w:rPr>
-        <w:t xml:space="preserve"> Both defects were cases where tests were individually correct and the system collectively wrong. </w:t>
-      </w:r>
-      <w:r>
-        <w:rPr>
-          <w:b/>
-          <w:i w:val="0"/>
-        </w:rPr>
-        <w:t>Abstraction versus over-engineering.</w:t>
-      </w:r>
-      <w:r>
-        <w:rPr>
-          <w:b w:val="0"/>
-          <w:i w:val="0"/>
-        </w:rPr>
-        <w:t xml:space="preserve"> Every abstraction required a rejected alternative and a stated cost; the sixth decorator was rejected, and the minimal container is the seam for provider selection rather than a general-purpose framework.</w:t>
+        <w:t xml:space="preserve"> Both defects were cases where tests were individually correct and the system collectively wrong.</w:t>
       </w:r>
     </w:p>
     <w:p>
@@ -3882,119 +2646,211 @@
           <w:b w:val="0"/>
           <w:i w:val="0"/>
         </w:rPr>
-        <w:t xml:space="preserve"> policy lives in data rather than a class hierarchy, so rule weights and thresholds are inspectable, versionable values that a reviewer can read directly. The residual risk is real: those weights are expert-set rather than learned, so they encode the blind spots of whoever set them — the engine makes bias </w:t>
+        <w:t xml:space="preserve"> policy lives in data rather than a class hierarchy, so rule weights and thresholds are inspectable, versionable values a reviewer can read directly. The residual risk is real: those weights are expert-set rather than learned, so they encode the blind spots of whoever set them — the engine makes bias inspectable, not absent. </w:t>
       </w:r>
       <w:r>
         <w:rPr>
           <w:b w:val="0"/>
           <w:i/>
         </w:rPr>
-        <w:t>inspectable</w:t>
-      </w:r>
-      <w:r>
-        <w:rPr>
-          <w:b w:val="0"/>
-          <w:i w:val="0"/>
-        </w:rPr>
-        <w:t xml:space="preserve">, not </w:t>
+        <w:t>Transparency:</w:t>
+      </w:r>
+      <w:r>
+        <w:rPr>
+          <w:b w:val="0"/>
+          <w:i w:val="0"/>
+        </w:rPr>
+        <w:t xml:space="preserve"> </w:t>
+      </w:r>
+      <w:r>
+        <w:rPr>
+          <w:rFonts w:ascii="Consolas" w:hAnsi="Consolas"/>
+          <w:sz w:val="19"/>
+        </w:rPr>
+        <w:t>rationale</w:t>
+      </w:r>
+      <w:r>
+        <w:rPr>
+          <w:b w:val="0"/>
+          <w:i w:val="0"/>
+        </w:rPr>
+        <w:t xml:space="preserve"> and </w:t>
+      </w:r>
+      <w:r>
+        <w:rPr>
+          <w:rFonts w:ascii="Consolas" w:hAnsi="Consolas"/>
+          <w:sz w:val="19"/>
+        </w:rPr>
+        <w:t>contributions</w:t>
+      </w:r>
+      <w:r>
+        <w:rPr>
+          <w:b w:val="0"/>
+          <w:i w:val="0"/>
+        </w:rPr>
+        <w:t xml:space="preserve"> are contract fields, so an algorithm that cannot say which inputs drove its number cannot conform. </w:t>
       </w:r>
       <w:r>
         <w:rPr>
           <w:b w:val="0"/>
           <w:i/>
         </w:rPr>
-        <w:t>absent</w:t>
-      </w:r>
-      <w:r>
-        <w:rPr>
-          <w:b w:val="0"/>
-          <w:i w:val="0"/>
-        </w:rPr>
-        <w:t xml:space="preserve">. </w:t>
+        <w:t>Black-box coupling:</w:t>
+      </w:r>
+      <w:r>
+        <w:rPr>
+          <w:b w:val="0"/>
+          <w:i w:val="0"/>
+        </w:rPr>
+        <w:t xml:space="preserve"> </w:t>
+      </w:r>
+      <w:r>
+        <w:rPr>
+          <w:rFonts w:ascii="Consolas" w:hAnsi="Consolas"/>
+          <w:sz w:val="19"/>
+        </w:rPr>
+        <w:t>ScoringBackend</w:t>
+      </w:r>
+      <w:r>
+        <w:rPr>
+          <w:b w:val="0"/>
+          <w:i w:val="0"/>
+        </w:rPr>
+        <w:t xml:space="preserve"> is five lines with no vendor concepts, and no domain module imports a vendor SDK. </w:t>
       </w:r>
       <w:r>
         <w:rPr>
           <w:b w:val="0"/>
           <w:i/>
         </w:rPr>
-        <w:t>Transparency:</w:t>
-      </w:r>
-      <w:r>
-        <w:rPr>
-          <w:b w:val="0"/>
-          <w:i w:val="0"/>
-        </w:rPr>
-        <w:t xml:space="preserve"> </w:t>
-      </w:r>
-      <w:r>
-        <w:rPr>
-          <w:rFonts w:ascii="Consolas" w:hAnsi="Consolas"/>
-          <w:sz w:val="19"/>
-        </w:rPr>
-        <w:t>rationale</w:t>
-      </w:r>
-      <w:r>
-        <w:rPr>
-          <w:b w:val="0"/>
-          <w:i w:val="0"/>
-        </w:rPr>
-        <w:t xml:space="preserve"> and </w:t>
-      </w:r>
-      <w:r>
-        <w:rPr>
-          <w:rFonts w:ascii="Consolas" w:hAnsi="Consolas"/>
-          <w:sz w:val="19"/>
-        </w:rPr>
-        <w:t>contributions</w:t>
-      </w:r>
-      <w:r>
-        <w:rPr>
-          <w:b w:val="0"/>
-          <w:i w:val="0"/>
-        </w:rPr>
-        <w:t xml:space="preserve"> are contract fields, so an algorithm that cannot say which inputs drove its number cannot conform, and a provider's narrative is sanitised as untrusted content rather than treated as fact. </w:t>
+        <w:t>Auditability:</w:t>
+      </w:r>
+      <w:r>
+        <w:rPr>
+          <w:b w:val="0"/>
+          <w:i w:val="0"/>
+        </w:rPr>
+        <w:t xml:space="preserve"> every decision produces a structured record — component, model version, score, decision, rationale — asserted by the run to contain no account or customer identifier.</w:t>
+      </w:r>
+    </w:p>
+    <w:p>
+      <w:pPr>
+        <w:spacing w:after="120"/>
+      </w:pPr>
+      <w:r>
+        <w:rPr>
+          <w:b/>
+          <w:i w:val="0"/>
+        </w:rPr>
+        <w:t>Problem-solving and refactoring.</w:t>
+      </w:r>
+      <w:r>
+        <w:rPr>
+          <w:b w:val="0"/>
+          <w:i w:val="0"/>
+        </w:rPr>
+        <w:t xml:space="preserve"> Refactoring was driven by measurable signals rather than taste: extracting </w:t>
+      </w:r>
+      <w:r>
+        <w:rPr>
+          <w:rFonts w:ascii="Consolas" w:hAnsi="Consolas"/>
+          <w:sz w:val="19"/>
+        </w:rPr>
+        <w:t>validation.py</w:t>
+      </w:r>
+      <w:r>
+        <w:rPr>
+          <w:b w:val="0"/>
+          <w:i w:val="0"/>
+        </w:rPr>
+        <w:t xml:space="preserve"> removed duplication across five modules and made the security rules auditable in one file, and extracting </w:t>
+      </w:r>
+      <w:r>
+        <w:rPr>
+          <w:rFonts w:ascii="Consolas" w:hAnsi="Consolas"/>
+          <w:sz w:val="19"/>
+        </w:rPr>
+        <w:t>compose_scoring_pipeline()</w:t>
+      </w:r>
+      <w:r>
+        <w:rPr>
+          <w:b w:val="0"/>
+          <w:i w:val="0"/>
+        </w:rPr>
+        <w:t xml:space="preserve"> collapsed four copies of an ordering decision into one documented function. I also resisted over-refactoring: a shared base class for the reporting visitors would create inheritance without polymorphism.</w:t>
+      </w:r>
+    </w:p>
+    <w:p>
+      <w:pPr>
+        <w:spacing w:after="120"/>
+      </w:pPr>
+      <w:r>
+        <w:rPr>
+          <w:b/>
+          <w:i w:val="0"/>
+        </w:rPr>
+        <w:t>Research and self-study.</w:t>
+      </w:r>
+      <w:r>
+        <w:rPr>
+          <w:b w:val="0"/>
+          <w:i w:val="0"/>
+        </w:rPr>
+        <w:t xml:space="preserve"> Reading fell into three groups: pattern sources (Gamma </w:t>
       </w:r>
       <w:r>
         <w:rPr>
           <w:b w:val="0"/>
           <w:i/>
         </w:rPr>
-        <w:t>Avoiding black-box coupling:</w:t>
-      </w:r>
-      <w:r>
-        <w:rPr>
-          <w:b w:val="0"/>
-          <w:i w:val="0"/>
-        </w:rPr>
-        <w:t xml:space="preserve"> </w:t>
-      </w:r>
-      <w:r>
-        <w:rPr>
-          <w:rFonts w:ascii="Consolas" w:hAnsi="Consolas"/>
-          <w:sz w:val="19"/>
-        </w:rPr>
-        <w:t>ScoringBackend</w:t>
-      </w:r>
-      <w:r>
-        <w:rPr>
-          <w:b w:val="0"/>
-          <w:i w:val="0"/>
-        </w:rPr>
-        <w:t xml:space="preserve"> is five lines with no vendor concepts and no domain module imports a vendor SDK, so the coupling is a revocable composition-root decision. </w:t>
+        <w:t>et al.</w:t>
+      </w:r>
+      <w:r>
+        <w:rPr>
+          <w:b w:val="0"/>
+          <w:i w:val="0"/>
+        </w:rPr>
+        <w:t xml:space="preserve">, 1994; Martin, 2000, 2017; Fowler, 2004, 2018) for vocabulary and named trade-offs; AI-systems sources (Sculley </w:t>
       </w:r>
       <w:r>
         <w:rPr>
           <w:b w:val="0"/>
           <w:i/>
         </w:rPr>
-        <w:t>Auditability:</w:t>
-      </w:r>
-      <w:r>
-        <w:rPr>
-          <w:b w:val="0"/>
-          <w:i w:val="0"/>
-        </w:rPr>
-        <w:t xml:space="preserve"> every decision produces a structured record — component, model version, score, decision, rationale — asserted by the run to contain no account or customer identifier.</w:t>
+        <w:t>et al.</w:t>
+      </w:r>
+      <w:r>
+        <w:rPr>
+          <w:b w:val="0"/>
+          <w:i w:val="0"/>
+        </w:rPr>
+        <w:t xml:space="preserve">, 2015; Mitchell </w:t>
+      </w:r>
+      <w:r>
+        <w:rPr>
+          <w:b w:val="0"/>
+          <w:i/>
+        </w:rPr>
+        <w:t>et al.</w:t>
+      </w:r>
+      <w:r>
+        <w:rPr>
+          <w:b w:val="0"/>
+          <w:i w:val="0"/>
+        </w:rPr>
+        <w:t>, 2019) for the feature-store and registry arguments; and risk and fairness sources (Aven and Thekdi, 2025; Barocas, Hardt and Narayanan, 2023). The most useful outcome was negative: none of the pattern literature treats governance layers — audit, redaction, degradation — as first-class composition concerns, so the pipeline-order reasoning here came from analysing my own failure modes.</w:t>
+      </w:r>
+    </w:p>
+    <w:p>
+      <w:pPr>
+        <w:pStyle w:val="Heading2"/>
+      </w:pPr>
+      <w:r>
+        <w:rPr>
+          <w:b w:val="0"/>
+          <w:i w:val="0"/>
+        </w:rPr>
+        <w:t>3.2 Employability skills</w:t>
       </w:r>
     </w:p>
     <w:p>
@@ -4006,56 +2862,14 @@
           <w:b/>
           <w:i w:val="0"/>
         </w:rPr>
-        <w:t>Problem-solving and refactoring.</w:t>
-      </w:r>
-      <w:r>
-        <w:rPr>
-          <w:b w:val="0"/>
-          <w:i w:val="0"/>
-        </w:rPr>
-        <w:t xml:space="preserve"> Refactoring was driven by measurable signals rather than taste: extracting </w:t>
-      </w:r>
-      <w:r>
-        <w:rPr>
-          <w:rFonts w:ascii="Consolas" w:hAnsi="Consolas"/>
-          <w:sz w:val="19"/>
-        </w:rPr>
-        <w:t>validation.py</w:t>
-      </w:r>
-      <w:r>
-        <w:rPr>
-          <w:b w:val="0"/>
-          <w:i w:val="0"/>
-        </w:rPr>
-        <w:t xml:space="preserve"> removed duplication across five modules and made the security rules auditable in one file, and extracting </w:t>
-      </w:r>
-      <w:r>
-        <w:rPr>
-          <w:rFonts w:ascii="Consolas" w:hAnsi="Consolas"/>
-          <w:sz w:val="19"/>
-        </w:rPr>
-        <w:t>compose_scoring_pipeline()</w:t>
-      </w:r>
-      <w:r>
-        <w:rPr>
-          <w:b w:val="0"/>
-          <w:i w:val="0"/>
-        </w:rPr>
-        <w:t xml:space="preserve"> collapsed four copies of an ordering decision into one documented function. I also resisted over-refactoring: a shared base class for the reporting visitors would create inheritance without polymorphism, since their </w:t>
-      </w:r>
-      <w:r>
-        <w:rPr>
-          <w:rFonts w:ascii="Consolas" w:hAnsi="Consolas"/>
-          <w:sz w:val="19"/>
-        </w:rPr>
-        <w:t>result()</w:t>
-      </w:r>
-      <w:r>
-        <w:rPr>
-          <w:b w:val="0"/>
-          <w:i w:val="0"/>
-        </w:rPr>
-        <w:t xml:space="preserve"> shapes differ deliberately.</w:t>
+        <w:t>Time management.</w:t>
+      </w:r>
+      <w:r>
+        <w:rPr>
+          <w:b w:val="0"/>
+          <w:i w:val="0"/>
+        </w:rPr>
+        <w:t xml:space="preserve"> No single session could hold the whole assessment, so I worked in artefact-sized increments, capturing evidence alongside construction rather than reconstructing it at the end. My concrete failure was underestimating test-writing: closing coverage from 87% to 99% took three modules and 143 tests and produced the two most valuable findings in the portfolio, which argues for budgeting test time as design time.</w:t>
       </w:r>
     </w:p>
     <w:p>
@@ -4067,82 +2881,42 @@
           <w:b/>
           <w:i w:val="0"/>
         </w:rPr>
-        <w:t>Research and self-study.</w:t>
-      </w:r>
-      <w:r>
-        <w:rPr>
-          <w:b w:val="0"/>
-          <w:i w:val="0"/>
-        </w:rPr>
-        <w:t xml:space="preserve"> Reading fell into three groups: pattern and principle sources (Gamma </w:t>
-      </w:r>
-      <w:r>
-        <w:rPr>
-          <w:b w:val="0"/>
-          <w:i/>
-        </w:rPr>
-        <w:t>et al.</w:t>
-      </w:r>
-      <w:r>
-        <w:rPr>
-          <w:b w:val="0"/>
-          <w:i w:val="0"/>
-        </w:rPr>
-        <w:t xml:space="preserve">, 1994; Martin, 2000, 2017; Fowler, 2004, 2018) for vocabulary and named trade-offs; AI-systems sources (Sculley </w:t>
-      </w:r>
-      <w:r>
-        <w:rPr>
-          <w:b w:val="0"/>
-          <w:i/>
-        </w:rPr>
-        <w:t>et al.</w:t>
-      </w:r>
-      <w:r>
-        <w:rPr>
-          <w:b w:val="0"/>
-          <w:i w:val="0"/>
-        </w:rPr>
-        <w:t xml:space="preserve">, 2015; Mitchell </w:t>
-      </w:r>
-      <w:r>
-        <w:rPr>
-          <w:b w:val="0"/>
-          <w:i/>
-        </w:rPr>
-        <w:t>et al.</w:t>
-      </w:r>
-      <w:r>
-        <w:rPr>
-          <w:b w:val="0"/>
-          <w:i w:val="0"/>
-        </w:rPr>
-        <w:t xml:space="preserve">, 2019) for the feature-store and registry arguments; and risk and fairness sources (Aven and Thekdi, 2025; Barocas, Hardt and Narayanan, 2023). The most useful outcome was negative: none of the pattern literature treats </w:t>
-      </w:r>
-      <w:r>
-        <w:rPr>
-          <w:b w:val="0"/>
-          <w:i/>
-        </w:rPr>
-        <w:t>governance</w:t>
-      </w:r>
-      <w:r>
-        <w:rPr>
-          <w:b w:val="0"/>
-          <w:i w:val="0"/>
-        </w:rPr>
-        <w:t xml:space="preserve"> layers — audit, redaction, degradation — as first-class composition concerns, so the pipeline-order reasoning here came from analysing my own failure modes.</w:t>
-      </w:r>
-    </w:p>
-    <w:p>
-      <w:pPr>
-        <w:pStyle w:val="Heading2"/>
-      </w:pPr>
-      <w:r>
-        <w:rPr>
-          <w:b w:val="0"/>
-          <w:i w:val="0"/>
-        </w:rPr>
-        <w:t>3.2 Employability skills</w:t>
+        <w:t>Communication and literacy.</w:t>
+      </w:r>
+      <w:r>
+        <w:rPr>
+          <w:b w:val="0"/>
+          <w:i w:val="0"/>
+        </w:rPr>
+        <w:t xml:space="preserve"> The clearest gain was writing docstrings that carry a decision rather than a description: </w:t>
+      </w:r>
+      <w:r>
+        <w:rPr>
+          <w:rFonts w:ascii="Consolas" w:hAnsi="Consolas"/>
+          <w:sz w:val="19"/>
+        </w:rPr>
+        <w:t>compose_scoring_pipeline</w:t>
+      </w:r>
+      <w:r>
+        <w:rPr>
+          <w:b w:val="0"/>
+          <w:i w:val="0"/>
+        </w:rPr>
+        <w:t xml:space="preserve"> states the order and justifies each position. Writing the degradation marker as a machine-readable prefix (</w:t>
+      </w:r>
+      <w:r>
+        <w:rPr>
+          <w:rFonts w:ascii="Consolas" w:hAnsi="Consolas"/>
+          <w:sz w:val="19"/>
+        </w:rPr>
+        <w:t>[degraded: primary unavailable]</w:t>
+      </w:r>
+      <w:r>
+        <w:rPr>
+          <w:b w:val="0"/>
+          <w:i w:val="0"/>
+        </w:rPr>
+        <w:t>) was also a communication decision, since the same form is legible to an operator, a downstream consumer and a test.</w:t>
       </w:r>
     </w:p>
     <w:p>
@@ -4154,100 +2928,6 @@
           <w:b/>
           <w:i w:val="0"/>
         </w:rPr>
-        <w:t>Time management.</w:t>
-      </w:r>
-      <w:r>
-        <w:rPr>
-          <w:b w:val="0"/>
-          <w:i w:val="0"/>
-        </w:rPr>
-        <w:t xml:space="preserve"> No single session could hold the whole assessment, so I worked in artefact-sized increments — one pattern, one test module, one evidence capture — so evidence capture happened alongside construction rather than being reconstructed at the end. My concrete failure was underestimating test-writing: closing coverage from 87% to 99% took three new modules and 143 tests and produced the two most valuable findings in the portfolio, which argues for budgeting test time as design time.</w:t>
-      </w:r>
-    </w:p>
-    <w:p>
-      <w:pPr>
-        <w:spacing w:after="120"/>
-      </w:pPr>
-      <w:r>
-        <w:rPr>
-          <w:b/>
-          <w:i w:val="0"/>
-        </w:rPr>
-        <w:t>Communication and literacy.</w:t>
-      </w:r>
-      <w:r>
-        <w:rPr>
-          <w:b w:val="0"/>
-          <w:i w:val="0"/>
-        </w:rPr>
-        <w:t xml:space="preserve"> The clearest gain was writing docstrings that carry a decision rather than a description: </w:t>
-      </w:r>
-      <w:r>
-        <w:rPr>
-          <w:rFonts w:ascii="Consolas" w:hAnsi="Consolas"/>
-          <w:sz w:val="19"/>
-        </w:rPr>
-        <w:t>compose_scoring_pipeline</w:t>
-      </w:r>
-      <w:r>
-        <w:rPr>
-          <w:b w:val="0"/>
-          <w:i w:val="0"/>
-        </w:rPr>
-        <w:t xml:space="preserve"> states the order and justifies each position, and </w:t>
-      </w:r>
-      <w:r>
-        <w:rPr>
-          <w:rFonts w:ascii="Consolas" w:hAnsi="Consolas"/>
-          <w:sz w:val="19"/>
-        </w:rPr>
-        <w:t>_ALLOWED_TRANSITIONS</w:t>
-      </w:r>
-      <w:r>
-        <w:rPr>
-          <w:b w:val="0"/>
-          <w:i w:val="0"/>
-        </w:rPr>
-        <w:t xml:space="preserve"> documents why </w:t>
-      </w:r>
-      <w:r>
-        <w:rPr>
-          <w:rFonts w:ascii="Consolas" w:hAnsi="Consolas"/>
-          <w:sz w:val="19"/>
-        </w:rPr>
-        <w:t>ARCHIVED</w:t>
-      </w:r>
-      <w:r>
-        <w:rPr>
-          <w:b w:val="0"/>
-          <w:i w:val="0"/>
-        </w:rPr>
-        <w:t xml:space="preserve"> is terminal. Writing the degradation marker as a machine-readable prefix (</w:t>
-      </w:r>
-      <w:r>
-        <w:rPr>
-          <w:rFonts w:ascii="Consolas" w:hAnsi="Consolas"/>
-          <w:sz w:val="19"/>
-        </w:rPr>
-        <w:t>[degraded: primary unavailable]</w:t>
-      </w:r>
-      <w:r>
-        <w:rPr>
-          <w:b w:val="0"/>
-          <w:i w:val="0"/>
-        </w:rPr>
-        <w:t>) was also a communication decision, since the same form is legible to an operator, a downstream consumer and a test.</w:t>
-      </w:r>
-    </w:p>
-    <w:p>
-      <w:pPr>
-        <w:spacing w:after="120"/>
-      </w:pPr>
-      <w:r>
-        <w:rPr>
-          <w:b/>
-          <w:i w:val="0"/>
-        </w:rPr>
         <w:t>Resilience and interpersonal skills.</w:t>
       </w:r>
       <w:r>
@@ -4255,7 +2935,7 @@
           <w:b w:val="0"/>
           <w:i w:val="0"/>
         </w:rPr>
-        <w:t xml:space="preserve"> Resilience meant sitting with a failing test I believed was correct for longer than was comfortable, and changing the design instead of the assertion. On collaboration I must be explicit about the limits of my evidence: this portfolio is submitted as individual work, and Appendix B records what evidence of independent working is held. The transferable lesson survives that limitation: writing the decorator ordering decision down as a reviewer would demand of me forced me to state an intuition I had previously only relied on, which is why the assembly point is now documented rather than conventional.</w:t>
+        <w:t xml:space="preserve"> Resilience meant sitting with a failing test I believed was correct for longer than was comfortable, and changing the design instead of the assertion. On collaboration I must be explicit about the limits of my evidence: this is individual work, and Appendix B records what evidence of independent working is held. The transferable lesson survives that limitation: writing the decorator ordering decision down as a reviewer would demand forced me to state an intuition I had only relied on, which is why the assembly point is now documented rather than conventional.</w:t>
       </w:r>
     </w:p>
     <w:p>
@@ -4496,7 +3176,7 @@
                 <w:i w:val="0"/>
                 <w:sz w:val="19"/>
               </w:rPr>
-              <w:t>Security as structure: immutable validated domain objects, boundary redaction, untrusted replies rejected</w:t>
+              <w:t>Security as structure: immutable validated domain objects, boundary redaction</w:t>
             </w:r>
           </w:p>
         </w:tc>
@@ -4570,7 +3250,7 @@
                 <w:i w:val="0"/>
                 <w:sz w:val="19"/>
               </w:rPr>
-              <w:t>Operational thinking: retries, fallback and audit exist, but no monitoring or drift artefact</w:t>
+              <w:t>Operational thinking: retries, fallback and audit exist, but no monitoring artefact</w:t>
             </w:r>
           </w:p>
         </w:tc>
@@ -4653,7 +3333,7 @@
           <w:b/>
           <w:i w:val="0"/>
         </w:rPr>
-        <w:t>Goal 1 — Deepen expertise in AI-aware software architecture.</w:t>
+        <w:t>Goal 1 — AI-aware software architecture.</w:t>
       </w:r>
       <w:r>
         <w:rPr>
@@ -4674,7 +3354,7 @@
           <w:b w:val="0"/>
           <w:i w:val="0"/>
         </w:rPr>
-        <w:t xml:space="preserve"> AWS Certified Machine Learning Engineer – Associate, which forces the operational vocabulary — monitoring, endpoint scaling, drift — that my design currently assumes someone else provides; Cloud Practitioner comes first. </w:t>
+        <w:t xml:space="preserve"> AWS Certified Machine Learning Engineer – Associate, which forces the operational vocabulary — monitoring, endpoint scaling, drift — my design assumes someone else provides. </w:t>
       </w:r>
       <w:r>
         <w:rPr>
@@ -4702,7 +3382,7 @@
           <w:b w:val="0"/>
           <w:i w:val="0"/>
         </w:rPr>
-        <w:t xml:space="preserve"> (2015) with a design-review lens, Kleppmann (2017) for the distributed-systems reasoning a durable registry needs, and the MLflow (MLflow, 2026) and Feast (Feast, 2026) documentation as reference implementations to compare against my interfaces. </w:t>
+        <w:t xml:space="preserve"> (2015) with a design-review lens, Kleppmann (2017) for the distributed-systems reasoning a durable registry needs, and the MLflow (MLflow, 2026) and Feast (Feast, 2026) documentation as reference implementations. </w:t>
       </w:r>
       <w:r>
         <w:rPr>
@@ -4716,21 +3396,96 @@
           <w:b w:val="0"/>
           <w:i w:val="0"/>
         </w:rPr>
-        <w:t xml:space="preserve"> a persistent registry with an append-only promotion audit, and drift detection added as a </w:t>
-      </w:r>
+        <w:t xml:space="preserve"> a persistent registry with an append-only promotion audit, and drift detection added as a new visitor.</w:t>
+      </w:r>
+    </w:p>
+    <w:p>
+      <w:pPr>
+        <w:spacing w:after="120"/>
+      </w:pPr>
       <w:r>
         <w:rPr>
           <w:b/>
           <w:i w:val="0"/>
         </w:rPr>
-        <w:t>new visitor</w:t>
-      </w:r>
-      <w:r>
-        <w:rPr>
-          <w:b w:val="0"/>
-          <w:i w:val="0"/>
-        </w:rPr>
-        <w:t>, the cleanest demonstration that the Visitor's extension claim is real.</w:t>
+        <w:t>Goal 2 — Advanced testing strategies for intelligent systems.</w:t>
+      </w:r>
+      <w:r>
+        <w:rPr>
+          <w:b w:val="0"/>
+          <w:i w:val="0"/>
+        </w:rPr>
+        <w:t xml:space="preserve"> </w:t>
+      </w:r>
+      <w:r>
+        <w:rPr>
+          <w:b w:val="0"/>
+          <w:i/>
+        </w:rPr>
+        <w:t>Reading and practice:</w:t>
+      </w:r>
+      <w:r>
+        <w:rPr>
+          <w:b w:val="0"/>
+          <w:i w:val="0"/>
+        </w:rPr>
+        <w:t xml:space="preserve"> property-based testing with Hypothesis (Hypothesis, 2026), because the defect classes I hit — missing state mutation, wrong composition order — are exactly what property-based testing targets, and a property asserting that the registry's production version always equals the last promoted one would have caught the registry defect. </w:t>
+      </w:r>
+      <w:r>
+        <w:rPr>
+          <w:b w:val="0"/>
+          <w:i/>
+        </w:rPr>
+        <w:t>Skill:</w:t>
+      </w:r>
+      <w:r>
+        <w:rPr>
+          <w:b w:val="0"/>
+          <w:i w:val="0"/>
+        </w:rPr>
+        <w:t xml:space="preserve"> contract testing for </w:t>
+      </w:r>
+      <w:r>
+        <w:rPr>
+          <w:rFonts w:ascii="Consolas" w:hAnsi="Consolas"/>
+          <w:sz w:val="19"/>
+        </w:rPr>
+        <w:t>ScoringBackend</w:t>
+      </w:r>
+      <w:r>
+        <w:rPr>
+          <w:b w:val="0"/>
+          <w:i w:val="0"/>
+        </w:rPr>
+        <w:t xml:space="preserve">. </w:t>
+      </w:r>
+      <w:r>
+        <w:rPr>
+          <w:b w:val="0"/>
+          <w:i/>
+        </w:rPr>
+        <w:t>Applied project:</w:t>
+      </w:r>
+      <w:r>
+        <w:rPr>
+          <w:b w:val="0"/>
+          <w:i w:val="0"/>
+        </w:rPr>
+        <w:t xml:space="preserve"> an evaluation harness comparing </w:t>
+      </w:r>
+      <w:r>
+        <w:rPr>
+          <w:rFonts w:ascii="Consolas" w:hAnsi="Consolas"/>
+          <w:sz w:val="19"/>
+        </w:rPr>
+        <w:t>rules-v1</w:t>
+      </w:r>
+      <w:r>
+        <w:rPr>
+          <w:b w:val="0"/>
+          <w:i w:val="0"/>
+        </w:rPr>
+        <w:t xml:space="preserve"> against a trained model on held-out data, reporting accuracy and fairness metrics per subgroup.</w:t>
       </w:r>
     </w:p>
     <w:p>
@@ -4742,7 +3497,7 @@
           <w:b/>
           <w:i w:val="0"/>
         </w:rPr>
-        <w:t>Goal 2 — Advanced testing strategies for intelligent systems.</w:t>
+        <w:t>Goal 3 — Ethical software engineering in AI-integrated applications.</w:t>
       </w:r>
       <w:r>
         <w:rPr>
@@ -4756,48 +3511,62 @@
           <w:b w:val="0"/>
           <w:i/>
         </w:rPr>
-        <w:t>Reading and practice:</w:t>
-      </w:r>
-      <w:r>
-        <w:rPr>
-          <w:b w:val="0"/>
-          <w:i w:val="0"/>
-        </w:rPr>
-        <w:t xml:space="preserve"> property-based testing with Hypothesis (Hypothesis, 2026), because the defect classes I hit — missing state mutation, wrong composition order — are exactly what property-based and metamorphic testing target; a property such as "for every promotion, the registry's production version equals the last promoted version" would have caught the registry defect. </w:t>
+        <w:t>Reading:</w:t>
+      </w:r>
+      <w:r>
+        <w:rPr>
+          <w:b w:val="0"/>
+          <w:i w:val="0"/>
+        </w:rPr>
+        <w:t xml:space="preserve"> Barocas, Hardt and Narayanan (2023) properly rather than selectively; the NIST AI Risk Management Framework (NIST, 2023) as a governance structure for the audit and registry design; and the EU AI Act's high-risk obligations (European Parliament and Council, 2024), since credit scoring is a named high-risk category. </w:t>
       </w:r>
       <w:r>
         <w:rPr>
           <w:b w:val="0"/>
           <w:i/>
         </w:rPr>
-        <w:t>Skill:</w:t>
-      </w:r>
-      <w:r>
-        <w:rPr>
-          <w:b w:val="0"/>
-          <w:i w:val="0"/>
-        </w:rPr>
-        <w:t xml:space="preserve"> contract testing for </w:t>
-      </w:r>
-      <w:r>
-        <w:rPr>
-          <w:rFonts w:ascii="Consolas" w:hAnsi="Consolas"/>
-          <w:sz w:val="19"/>
-        </w:rPr>
-        <w:t>ScoringBackend</w:t>
-      </w:r>
-      <w:r>
-        <w:rPr>
-          <w:b w:val="0"/>
-          <w:i w:val="0"/>
-        </w:rPr>
-        <w:t xml:space="preserve">, so every future provider is validated against one behavioural contract. </w:t>
+        <w:t>Practice:</w:t>
+      </w:r>
+      <w:r>
+        <w:rPr>
+          <w:b w:val="0"/>
+          <w:i w:val="0"/>
+        </w:rPr>
+        <w:t xml:space="preserve"> adopt model cards (Mitchell </w:t>
       </w:r>
       <w:r>
         <w:rPr>
           <w:b w:val="0"/>
           <w:i/>
         </w:rPr>
+        <w:t>et al.</w:t>
+      </w:r>
+      <w:r>
+        <w:rPr>
+          <w:b w:val="0"/>
+          <w:i w:val="0"/>
+        </w:rPr>
+        <w:t xml:space="preserve">, 2019) as required artefacts for every registered version, extending </w:t>
+      </w:r>
+      <w:r>
+        <w:rPr>
+          <w:rFonts w:ascii="Consolas" w:hAnsi="Consolas"/>
+          <w:sz w:val="19"/>
+        </w:rPr>
+        <w:t>ModelRecord</w:t>
+      </w:r>
+      <w:r>
+        <w:rPr>
+          <w:b w:val="0"/>
+          <w:i w:val="0"/>
+        </w:rPr>
+        <w:t xml:space="preserve"> with a required promotion rationale. </w:t>
+      </w:r>
+      <w:r>
+        <w:rPr>
+          <w:b w:val="0"/>
+          <w:i/>
+        </w:rPr>
         <w:t>Applied project:</w:t>
       </w:r>
       <w:r>
@@ -4805,124 +3574,7 @@
           <w:b w:val="0"/>
           <w:i w:val="0"/>
         </w:rPr>
-        <w:t xml:space="preserve"> an evaluation harness comparing </w:t>
-      </w:r>
-      <w:r>
-        <w:rPr>
-          <w:rFonts w:ascii="Consolas" w:hAnsi="Consolas"/>
-          <w:sz w:val="19"/>
-        </w:rPr>
-        <w:t>rules-v1</w:t>
-      </w:r>
-      <w:r>
-        <w:rPr>
-          <w:b w:val="0"/>
-          <w:i w:val="0"/>
-        </w:rPr>
-        <w:t xml:space="preserve"> against a trained model on held-out data, reporting accuracy and fairness metrics per subgroup, to measure the residual risk of expert-set weights identified in Task 3.</w:t>
-      </w:r>
-    </w:p>
-    <w:p>
-      <w:pPr>
-        <w:spacing w:after="120"/>
-      </w:pPr>
-      <w:r>
-        <w:rPr>
-          <w:b/>
-          <w:i w:val="0"/>
-        </w:rPr>
-        <w:t>Goal 3 — Ethical software engineering in AI-integrated applications.</w:t>
-      </w:r>
-      <w:r>
-        <w:rPr>
-          <w:b w:val="0"/>
-          <w:i w:val="0"/>
-        </w:rPr>
-        <w:t xml:space="preserve"> </w:t>
-      </w:r>
-      <w:r>
-        <w:rPr>
-          <w:b w:val="0"/>
-          <w:i/>
-        </w:rPr>
-        <w:t>Reading:</w:t>
-      </w:r>
-      <w:r>
-        <w:rPr>
-          <w:b w:val="0"/>
-          <w:i w:val="0"/>
-        </w:rPr>
-        <w:t xml:space="preserve"> Barocas, Hardt and Narayanan (2023) properly rather than selectively; the NIST AI Risk Management Framework (NIST, 2023) as a governance structure for the audit and registry design; and the EU AI Act's high-risk obligations (European Parliament and Council, 2024), since credit scoring is a named high-risk category requiring auditability and documented model lifecycle. </w:t>
-      </w:r>
-      <w:r>
-        <w:rPr>
-          <w:b w:val="0"/>
-          <w:i/>
-        </w:rPr>
-        <w:t>Practice:</w:t>
-      </w:r>
-      <w:r>
-        <w:rPr>
-          <w:b w:val="0"/>
-          <w:i w:val="0"/>
-        </w:rPr>
-        <w:t xml:space="preserve"> adopt model cards (Mitchell </w:t>
-      </w:r>
-      <w:r>
-        <w:rPr>
-          <w:b w:val="0"/>
-          <w:i/>
-        </w:rPr>
-        <w:t>et al.</w:t>
-      </w:r>
-      <w:r>
-        <w:rPr>
-          <w:b w:val="0"/>
-          <w:i w:val="0"/>
-        </w:rPr>
-        <w:t xml:space="preserve">, 2019) as required artefacts for every registered version, extending </w:t>
-      </w:r>
-      <w:r>
-        <w:rPr>
-          <w:rFonts w:ascii="Consolas" w:hAnsi="Consolas"/>
-          <w:sz w:val="19"/>
-        </w:rPr>
-        <w:t>ModelRecord</w:t>
-      </w:r>
-      <w:r>
-        <w:rPr>
-          <w:b w:val="0"/>
-          <w:i w:val="0"/>
-        </w:rPr>
-        <w:t xml:space="preserve"> with a required promotion rationale and refusing </w:t>
-      </w:r>
-      <w:r>
-        <w:rPr>
-          <w:rFonts w:ascii="Consolas" w:hAnsi="Consolas"/>
-          <w:sz w:val="19"/>
-        </w:rPr>
-        <w:t>PRODUCTION</w:t>
-      </w:r>
-      <w:r>
-        <w:rPr>
-          <w:b w:val="0"/>
-          <w:i w:val="0"/>
-        </w:rPr>
-        <w:t xml:space="preserve"> promotion without it. </w:t>
-      </w:r>
-      <w:r>
-        <w:rPr>
-          <w:b w:val="0"/>
-          <w:i/>
-        </w:rPr>
-        <w:t>Applied project:</w:t>
-      </w:r>
-      <w:r>
-        <w:rPr>
-          <w:b w:val="0"/>
-          <w:i w:val="0"/>
-        </w:rPr>
-        <w:t xml:space="preserve"> implement the fairness evaluation as a fifth reporting visitor, making bias a repeated measurement rather than a one-off conversation.</w:t>
+        <w:t xml:space="preserve"> implement the fairness evaluation as a fifth reporting visitor, making bias a repeated measurement.</w:t>
       </w:r>
     </w:p>
     <w:p>

</xml_diff>

<commit_message>
Sync repository narrative, narrative body and submission documents with the final 2,133-word build
</commit_message>
<xml_diff>
--- a/docs/AOODP_EMA_eportfolio_12701559.docx
+++ b/docs/AOODP_EMA_eportfolio_12701559.docx
@@ -109,18 +109,7 @@
         <w:t xml:space="preserve">Word count: </w:t>
       </w:r>
       <w:r>
-        <w:t>2,096 words (Task 1–4 narrative, the counted figure); 2,474 words for the whole document excluding the reference list</w:t>
-      </w:r>
-    </w:p>
-    <w:p>
-      <w:r>
-        <w:rPr>
-          <w:b/>
-        </w:rPr>
-        <w:t xml:space="preserve">Counting rule: </w:t>
-      </w:r>
-      <w:r>
-        <w:t>Tasks 1–4 narrative; reference list, cover sheet, figure caption and Appendices A–C excluded.</w:t>
+        <w:t>2,133 words (Tasks 1–4 narrative; reference list, cover sheet, figure, code excerpts and Appendices A–C excluded)</w:t>
       </w:r>
     </w:p>
     <w:p/>
@@ -865,21 +854,101 @@
           <w:b w:val="0"/>
           <w:i w:val="0"/>
         </w:rPr>
-        <w:t xml:space="preserve">Caching is an inner decorator, so it can become distributed without touching governance; the registry centralises lifecycle state. Robustness is demonstrated: a provider outage yields three attempts, an explicit </w:t>
+        <w:t>Caching is an inner decorator, so it can become distributed without touching governance; the registry centralises lifecycle state. Robustness is demonstrated: a provider outage still produces a decision that reaches the audit trail, and a promotion that breaks the lifecycle rules is refused.</w:t>
+      </w:r>
+    </w:p>
+    <w:p>
+      <w:pPr>
+        <w:pStyle w:val="Heading2"/>
+      </w:pPr>
+      <w:r>
+        <w:rPr>
+          <w:b w:val="0"/>
+          <w:i w:val="0"/>
+        </w:rPr>
+        <w:t>1.5 Develop software adaptable for AI models and efficient for data science tasks</w:t>
+      </w:r>
+    </w:p>
+    <w:p>
+      <w:pPr>
+        <w:spacing w:after="120"/>
+      </w:pPr>
+      <w:r>
+        <w:rPr>
+          <w:b w:val="0"/>
+          <w:i w:val="0"/>
+        </w:rPr>
+        <w:t xml:space="preserve">The AI layer is reached only through </w:t>
       </w:r>
       <w:r>
         <w:rPr>
           <w:rFonts w:ascii="Consolas" w:hAnsi="Consolas"/>
           <w:sz w:val="19"/>
         </w:rPr>
-        <w:t>[degraded: primary unavailable]</w:t>
-      </w:r>
-      <w:r>
-        <w:rPr>
-          <w:b w:val="0"/>
-          <w:i w:val="0"/>
-        </w:rPr>
-        <w:t xml:space="preserve"> rationale and a decision still reaching the audit trail; an illegal promotion is refused.</w:t>
+        <w:t>ScoringBackend</w:t>
+      </w:r>
+      <w:r>
+        <w:rPr>
+          <w:b w:val="0"/>
+          <w:i w:val="0"/>
+        </w:rPr>
+        <w:t xml:space="preserve">, so swapping a hosted LLM for a local one is a composition-root change. Explainability is contractual: </w:t>
+      </w:r>
+      <w:r>
+        <w:rPr>
+          <w:rFonts w:ascii="Consolas" w:hAnsi="Consolas"/>
+          <w:sz w:val="19"/>
+        </w:rPr>
+        <w:t>StrategyOutput</w:t>
+      </w:r>
+      <w:r>
+        <w:rPr>
+          <w:b w:val="0"/>
+          <w:i w:val="0"/>
+        </w:rPr>
+        <w:t xml:space="preserve"> carries </w:t>
+      </w:r>
+      <w:r>
+        <w:rPr>
+          <w:rFonts w:ascii="Consolas" w:hAnsi="Consolas"/>
+          <w:sz w:val="19"/>
+        </w:rPr>
+        <w:t>contributions</w:t>
+      </w:r>
+      <w:r>
+        <w:rPr>
+          <w:b w:val="0"/>
+          <w:i w:val="0"/>
+        </w:rPr>
+        <w:t xml:space="preserve"> and </w:t>
+      </w:r>
+      <w:r>
+        <w:rPr>
+          <w:rFonts w:ascii="Consolas" w:hAnsi="Consolas"/>
+          <w:sz w:val="19"/>
+        </w:rPr>
+        <w:t>rationale</w:t>
+      </w:r>
+      <w:r>
+        <w:rPr>
+          <w:b w:val="0"/>
+          <w:i w:val="0"/>
+        </w:rPr>
+        <w:t xml:space="preserve">, and </w:t>
+      </w:r>
+      <w:r>
+        <w:rPr>
+          <w:rFonts w:ascii="Consolas" w:hAnsi="Consolas"/>
+          <w:sz w:val="19"/>
+        </w:rPr>
+        <w:t>FeatureDefinition</w:t>
+      </w:r>
+      <w:r>
+        <w:rPr>
+          <w:b w:val="0"/>
+          <w:i w:val="0"/>
+        </w:rPr>
+        <w:t xml:space="preserve"> is named, versioned and owned, so training and serving share definitions. The registry makes model version a runtime fact — the precondition for shadow deployment and rollback.</w:t>
       </w:r>
     </w:p>
     <w:p>
@@ -891,7 +960,7 @@
           <w:b w:val="0"/>
           <w:i w:val="0"/>
         </w:rPr>
-        <w:t>1.5 Develop software adaptable for AI models and efficient for data science tasks</w:t>
+        <w:t>1.6 Link to practical work</w:t>
       </w:r>
     </w:p>
     <w:p>
@@ -903,107 +972,13 @@
           <w:b w:val="0"/>
           <w:i w:val="0"/>
         </w:rPr>
-        <w:t xml:space="preserve">The AI layer is reached only through </w:t>
+        <w:t xml:space="preserve">Secure coding appears in </w:t>
       </w:r>
       <w:r>
         <w:rPr>
           <w:rFonts w:ascii="Consolas" w:hAnsi="Consolas"/>
           <w:sz w:val="19"/>
         </w:rPr>
-        <w:t>ScoringBackend</w:t>
-      </w:r>
-      <w:r>
-        <w:rPr>
-          <w:b w:val="0"/>
-          <w:i w:val="0"/>
-        </w:rPr>
-        <w:t xml:space="preserve">, so swapping a hosted LLM for a local one is a composition-root change. Explainability is contractual: </w:t>
-      </w:r>
-      <w:r>
-        <w:rPr>
-          <w:rFonts w:ascii="Consolas" w:hAnsi="Consolas"/>
-          <w:sz w:val="19"/>
-        </w:rPr>
-        <w:t>StrategyOutput</w:t>
-      </w:r>
-      <w:r>
-        <w:rPr>
-          <w:b w:val="0"/>
-          <w:i w:val="0"/>
-        </w:rPr>
-        <w:t xml:space="preserve"> carries </w:t>
-      </w:r>
-      <w:r>
-        <w:rPr>
-          <w:rFonts w:ascii="Consolas" w:hAnsi="Consolas"/>
-          <w:sz w:val="19"/>
-        </w:rPr>
-        <w:t>contributions</w:t>
-      </w:r>
-      <w:r>
-        <w:rPr>
-          <w:b w:val="0"/>
-          <w:i w:val="0"/>
-        </w:rPr>
-        <w:t xml:space="preserve"> and </w:t>
-      </w:r>
-      <w:r>
-        <w:rPr>
-          <w:rFonts w:ascii="Consolas" w:hAnsi="Consolas"/>
-          <w:sz w:val="19"/>
-        </w:rPr>
-        <w:t>rationale</w:t>
-      </w:r>
-      <w:r>
-        <w:rPr>
-          <w:b w:val="0"/>
-          <w:i w:val="0"/>
-        </w:rPr>
-        <w:t xml:space="preserve">, and </w:t>
-      </w:r>
-      <w:r>
-        <w:rPr>
-          <w:rFonts w:ascii="Consolas" w:hAnsi="Consolas"/>
-          <w:sz w:val="19"/>
-        </w:rPr>
-        <w:t>FeatureDefinition</w:t>
-      </w:r>
-      <w:r>
-        <w:rPr>
-          <w:b w:val="0"/>
-          <w:i w:val="0"/>
-        </w:rPr>
-        <w:t xml:space="preserve"> is named, versioned and owned, so training and serving share definitions. The registry makes model version a runtime fact — the precondition for shadow deployment and rollback.</w:t>
-      </w:r>
-    </w:p>
-    <w:p>
-      <w:pPr>
-        <w:pStyle w:val="Heading2"/>
-      </w:pPr>
-      <w:r>
-        <w:rPr>
-          <w:b w:val="0"/>
-          <w:i w:val="0"/>
-        </w:rPr>
-        <w:t>1.6 Link to practical work</w:t>
-      </w:r>
-    </w:p>
-    <w:p>
-      <w:pPr>
-        <w:spacing w:after="120"/>
-      </w:pPr>
-      <w:r>
-        <w:rPr>
-          <w:b w:val="0"/>
-          <w:i w:val="0"/>
-        </w:rPr>
-        <w:t xml:space="preserve">Secure coding appears in </w:t>
-      </w:r>
-      <w:r>
-        <w:rPr>
-          <w:rFonts w:ascii="Consolas" w:hAnsi="Consolas"/>
-          <w:sz w:val="19"/>
-        </w:rPr>
         <w:t>validation.py</w:t>
       </w:r>
       <w:r>
@@ -1011,21 +986,7 @@
           <w:b w:val="0"/>
           <w:i w:val="0"/>
         </w:rPr>
-        <w:t xml:space="preserve">; the four patterns in one engine (Task 2); robustness in </w:t>
-      </w:r>
-      <w:r>
-        <w:rPr>
-          <w:rFonts w:ascii="Consolas" w:hAnsi="Consolas"/>
-          <w:sz w:val="19"/>
-        </w:rPr>
-        <w:t>build_risk_service</w:t>
-      </w:r>
-      <w:r>
-        <w:rPr>
-          <w:b w:val="0"/>
-          <w:i w:val="0"/>
-        </w:rPr>
-        <w:t xml:space="preserve">; AI adaptability in the registry and feature store, where run section 7 changes the live version without code change. Unit 6 supplies the concurrency foundation: </w:t>
+        <w:t xml:space="preserve">; the four patterns in one engine (Task 2); AI adaptability in the registry and feature store, where run section 7 changes the live version without code change. Unit 6 supplies the concurrency foundation: </w:t>
       </w:r>
       <w:r>
         <w:rPr>
@@ -1094,7 +1055,7 @@
           <w:b w:val="0"/>
           <w:i w:val="0"/>
         </w:rPr>
-        <w:t>Task 2 – Showcase Artefacts (GitHub repository: https://github.com/stacyalwangaessex/aoodp-capstone)</w:t>
+        <w:t>Task 2 – Showcase Artefacts</w:t>
       </w:r>
     </w:p>
     <w:p>
@@ -1165,7 +1126,7 @@
           <w:b w:val="0"/>
           <w:i w:val="0"/>
         </w:rPr>
-        <w:t>, 39 tests: encapsulated state under a re-entrant lock, custom exception types, and a transfer service that cannot deadlock when a guarded method calls another.</w:t>
+        <w:t>, 39 tests: encapsulated state under a re-entrant lock, custom exception types, and a transfer service that cannot deadlock under nested locking.</w:t>
       </w:r>
     </w:p>
     <w:p>
@@ -1224,7 +1185,7 @@
           <w:b w:val="0"/>
           <w:i w:val="0"/>
         </w:rPr>
-        <w:t xml:space="preserve">, so one engine runs an explainable rule set or a learned model; </w:t>
+        <w:t xml:space="preserve">; </w:t>
       </w:r>
       <w:r>
         <w:rPr>
@@ -1243,6 +1204,92 @@
     </w:p>
     <w:p>
       <w:pPr>
+        <w:pStyle w:val="FigureCaption"/>
+      </w:pPr>
+      <w:r>
+        <w:rPr>
+          <w:i/>
+          <w:color w:val="444444"/>
+          <w:sz w:val="19"/>
+        </w:rPr>
+        <w:t>Listing 1 — the port the whole AI path depends on (capstone/strategies.py, abridged)</w:t>
+      </w:r>
+    </w:p>
+    <w:p>
+      <w:pPr>
+        <w:pStyle w:val="CodeBlock"/>
+        <w:shd w:val="clear" w:fill="F4F4F4"/>
+      </w:pPr>
+      <w:r>
+        <w:rPr>
+          <w:rFonts w:ascii="Consolas" w:hAnsi="Consolas"/>
+          <w:sz w:val="17"/>
+        </w:rPr>
+        <w:t>@runtime_checkable</w:t>
+      </w:r>
+      <w:r>
+        <w:br/>
+      </w:r>
+      <w:r>
+        <w:rPr>
+          <w:rFonts w:ascii="Consolas" w:hAnsi="Consolas"/>
+          <w:sz w:val="17"/>
+        </w:rPr>
+        <w:t>class ScoringBackend(Protocol):</w:t>
+      </w:r>
+      <w:r>
+        <w:br/>
+      </w:r>
+      <w:r>
+        <w:rPr>
+          <w:rFonts w:ascii="Consolas" w:hAnsi="Consolas"/>
+          <w:sz w:val="17"/>
+        </w:rPr>
+        <w:t xml:space="preserve">    def predict(</w:t>
+      </w:r>
+      <w:r>
+        <w:br/>
+      </w:r>
+      <w:r>
+        <w:rPr>
+          <w:rFonts w:ascii="Consolas" w:hAnsi="Consolas"/>
+          <w:sz w:val="17"/>
+        </w:rPr>
+        <w:t xml:space="preserve">        self, features: Mapping[str, float], model_ref: str</w:t>
+      </w:r>
+      <w:r>
+        <w:br/>
+      </w:r>
+      <w:r>
+        <w:rPr>
+          <w:rFonts w:ascii="Consolas" w:hAnsi="Consolas"/>
+          <w:sz w:val="17"/>
+        </w:rPr>
+        <w:t xml:space="preserve">    ) -&gt; Mapping[str, Any]:</w:t>
+      </w:r>
+      <w:r>
+        <w:br/>
+      </w:r>
+      <w:r>
+        <w:rPr>
+          <w:rFonts w:ascii="Consolas" w:hAnsi="Consolas"/>
+          <w:sz w:val="17"/>
+        </w:rPr>
+        <w:t xml:space="preserve">        """Return a raw prediction payload for *features*."""</w:t>
+      </w:r>
+      <w:r>
+        <w:br/>
+      </w:r>
+      <w:r>
+        <w:rPr>
+          <w:rFonts w:ascii="Consolas" w:hAnsi="Consolas"/>
+          <w:sz w:val="17"/>
+        </w:rPr>
+        <w:t xml:space="preserve">        ...  # pragma: no cover - protocol declaration</w:t>
+      </w:r>
+    </w:p>
+    <w:p>
+      <w:pPr>
         <w:pStyle w:val="Heading2"/>
       </w:pPr>
       <w:r>
@@ -1323,6 +1370,171 @@
     </w:p>
     <w:p>
       <w:pPr>
+        <w:pStyle w:val="FigureCaption"/>
+      </w:pPr>
+      <w:r>
+        <w:rPr>
+          <w:i/>
+          <w:color w:val="444444"/>
+          <w:sz w:val="19"/>
+        </w:rPr>
+        <w:t>Listing 2 — the ordering decision made explicit (capstone/decorators.py, abridged; indentation normalised)</w:t>
+      </w:r>
+    </w:p>
+    <w:p>
+      <w:pPr>
+        <w:pStyle w:val="CodeBlock"/>
+        <w:shd w:val="clear" w:fill="F4F4F4"/>
+      </w:pPr>
+      <w:r>
+        <w:rPr>
+          <w:rFonts w:ascii="Consolas" w:hAnsi="Consolas"/>
+          <w:sz w:val="17"/>
+        </w:rPr>
+        <w:t>core: ScoringComponent = StrategyComponent(strategy, policy=policy)</w:t>
+      </w:r>
+      <w:r>
+        <w:br/>
+      </w:r>
+      <w:r>
+        <w:rPr>
+          <w:rFonts w:ascii="Consolas" w:hAnsi="Consolas"/>
+          <w:sz w:val="17"/>
+        </w:rPr>
+      </w:r>
+      <w:r>
+        <w:br/>
+      </w:r>
+      <w:r>
+        <w:rPr>
+          <w:rFonts w:ascii="Consolas" w:hAnsi="Consolas"/>
+          <w:sz w:val="17"/>
+        </w:rPr>
+        <w:t>if cache_entries:</w:t>
+      </w:r>
+      <w:r>
+        <w:br/>
+      </w:r>
+      <w:r>
+        <w:rPr>
+          <w:rFonts w:ascii="Consolas" w:hAnsi="Consolas"/>
+          <w:sz w:val="17"/>
+        </w:rPr>
+        <w:t xml:space="preserve">    core = CachingDecorator(core, max_entries=cache_entries)</w:t>
+      </w:r>
+      <w:r>
+        <w:br/>
+      </w:r>
+      <w:r>
+        <w:rPr>
+          <w:rFonts w:ascii="Consolas" w:hAnsi="Consolas"/>
+          <w:sz w:val="17"/>
+        </w:rPr>
+        <w:t>if fallback_strategy is not None:</w:t>
+      </w:r>
+      <w:r>
+        <w:br/>
+      </w:r>
+      <w:r>
+        <w:rPr>
+          <w:rFonts w:ascii="Consolas" w:hAnsi="Consolas"/>
+          <w:sz w:val="17"/>
+        </w:rPr>
+        <w:t xml:space="preserve">    core = FallbackDecorator(</w:t>
+      </w:r>
+      <w:r>
+        <w:br/>
+      </w:r>
+      <w:r>
+        <w:rPr>
+          <w:rFonts w:ascii="Consolas" w:hAnsi="Consolas"/>
+          <w:sz w:val="17"/>
+        </w:rPr>
+        <w:t xml:space="preserve">        core, StrategyComponent(fallback_strategy, policy=policy)</w:t>
+      </w:r>
+      <w:r>
+        <w:br/>
+      </w:r>
+      <w:r>
+        <w:rPr>
+          <w:rFonts w:ascii="Consolas" w:hAnsi="Consolas"/>
+          <w:sz w:val="17"/>
+        </w:rPr>
+        <w:t xml:space="preserve">    )</w:t>
+      </w:r>
+      <w:r>
+        <w:br/>
+      </w:r>
+      <w:r>
+        <w:rPr>
+          <w:rFonts w:ascii="Consolas" w:hAnsi="Consolas"/>
+          <w:sz w:val="17"/>
+        </w:rPr>
+        <w:t># Auditing wraps the fallback, not the other way round: a degraded</w:t>
+      </w:r>
+      <w:r>
+        <w:br/>
+      </w:r>
+      <w:r>
+        <w:rPr>
+          <w:rFonts w:ascii="Consolas" w:hAnsi="Consolas"/>
+          <w:sz w:val="17"/>
+        </w:rPr>
+        <w:t># decision must reach the audit trail rather than die inside the layer</w:t>
+      </w:r>
+      <w:r>
+        <w:br/>
+      </w:r>
+      <w:r>
+        <w:rPr>
+          <w:rFonts w:ascii="Consolas" w:hAnsi="Consolas"/>
+          <w:sz w:val="17"/>
+        </w:rPr>
+        <w:t># that produced it.</w:t>
+      </w:r>
+      <w:r>
+        <w:br/>
+      </w:r>
+      <w:r>
+        <w:rPr>
+          <w:rFonts w:ascii="Consolas" w:hAnsi="Consolas"/>
+          <w:sz w:val="17"/>
+        </w:rPr>
+        <w:t>core = AuditingDecorator(core, sink=audit_sink)</w:t>
+      </w:r>
+      <w:r>
+        <w:br/>
+      </w:r>
+      <w:r>
+        <w:rPr>
+          <w:rFonts w:ascii="Consolas" w:hAnsi="Consolas"/>
+          <w:sz w:val="17"/>
+        </w:rPr>
+        <w:t>core = MetricsDecorator(core, clock=clock)</w:t>
+      </w:r>
+      <w:r>
+        <w:br/>
+      </w:r>
+      <w:r>
+        <w:rPr>
+          <w:rFonts w:ascii="Consolas" w:hAnsi="Consolas"/>
+          <w:sz w:val="17"/>
+        </w:rPr>
+        <w:t>core = RedactingDecorator(core, extra_sensitive_keys=extra_sensitive_keys)</w:t>
+      </w:r>
+      <w:r>
+        <w:br/>
+      </w:r>
+      <w:r>
+        <w:rPr>
+          <w:rFonts w:ascii="Consolas" w:hAnsi="Consolas"/>
+          <w:sz w:val="17"/>
+        </w:rPr>
+        <w:t>return core</w:t>
+      </w:r>
+    </w:p>
+    <w:p>
+      <w:pPr>
         <w:pStyle w:val="Heading2"/>
       </w:pPr>
       <w:r>
@@ -1684,6 +1896,149 @@
           <w:i w:val="0"/>
         </w:rPr>
         <w:t xml:space="preserve"> — but also produced confidently wrong assertions, detectable only by running them.</w:t>
+      </w:r>
+    </w:p>
+    <w:p>
+      <w:pPr>
+        <w:pStyle w:val="FigureCaption"/>
+      </w:pPr>
+      <w:r>
+        <w:rPr>
+          <w:i/>
+          <w:color w:val="444444"/>
+          <w:sz w:val="19"/>
+        </w:rPr>
+        <w:t>Listing 3 — a spy double that makes one call reviewable (capstone/tests/conftest.py, abridged)</w:t>
+      </w:r>
+    </w:p>
+    <w:p>
+      <w:pPr>
+        <w:pStyle w:val="CodeBlock"/>
+        <w:shd w:val="clear" w:fill="F4F4F4"/>
+      </w:pPr>
+      <w:r>
+        <w:rPr>
+          <w:rFonts w:ascii="Consolas" w:hAnsi="Consolas"/>
+          <w:sz w:val="17"/>
+        </w:rPr>
+        <w:t>class CallRecorder:</w:t>
+      </w:r>
+      <w:r>
+        <w:br/>
+      </w:r>
+      <w:r>
+        <w:rPr>
+          <w:rFonts w:ascii="Consolas" w:hAnsi="Consolas"/>
+          <w:sz w:val="17"/>
+        </w:rPr>
+        <w:t xml:space="preserve">    """A spy that records every call it receives."""</w:t>
+      </w:r>
+      <w:r>
+        <w:br/>
+      </w:r>
+      <w:r>
+        <w:rPr>
+          <w:rFonts w:ascii="Consolas" w:hAnsi="Consolas"/>
+          <w:sz w:val="17"/>
+        </w:rPr>
+      </w:r>
+      <w:r>
+        <w:br/>
+      </w:r>
+      <w:r>
+        <w:rPr>
+          <w:rFonts w:ascii="Consolas" w:hAnsi="Consolas"/>
+          <w:sz w:val="17"/>
+        </w:rPr>
+        <w:t xml:space="preserve">    def __init__(self) -&gt; None:</w:t>
+      </w:r>
+      <w:r>
+        <w:br/>
+      </w:r>
+      <w:r>
+        <w:rPr>
+          <w:rFonts w:ascii="Consolas" w:hAnsi="Consolas"/>
+          <w:sz w:val="17"/>
+        </w:rPr>
+        <w:t xml:space="preserve">        self.calls: list[Any] = []</w:t>
+      </w:r>
+      <w:r>
+        <w:br/>
+      </w:r>
+      <w:r>
+        <w:rPr>
+          <w:rFonts w:ascii="Consolas" w:hAnsi="Consolas"/>
+          <w:sz w:val="17"/>
+        </w:rPr>
+      </w:r>
+      <w:r>
+        <w:br/>
+      </w:r>
+      <w:r>
+        <w:rPr>
+          <w:rFonts w:ascii="Consolas" w:hAnsi="Consolas"/>
+          <w:sz w:val="17"/>
+        </w:rPr>
+        <w:t xml:space="preserve">    def __call__(self, *args: Any, **kwargs: Any) -&gt; Any:</w:t>
+      </w:r>
+      <w:r>
+        <w:br/>
+      </w:r>
+      <w:r>
+        <w:rPr>
+          <w:rFonts w:ascii="Consolas" w:hAnsi="Consolas"/>
+          <w:sz w:val="17"/>
+        </w:rPr>
+        <w:t xml:space="preserve">        self.calls.append((args, kwargs))</w:t>
+      </w:r>
+      <w:r>
+        <w:br/>
+      </w:r>
+      <w:r>
+        <w:rPr>
+          <w:rFonts w:ascii="Consolas" w:hAnsi="Consolas"/>
+          <w:sz w:val="17"/>
+        </w:rPr>
+        <w:t xml:space="preserve">        return None</w:t>
+      </w:r>
+      <w:r>
+        <w:br/>
+      </w:r>
+      <w:r>
+        <w:rPr>
+          <w:rFonts w:ascii="Consolas" w:hAnsi="Consolas"/>
+          <w:sz w:val="17"/>
+        </w:rPr>
+      </w:r>
+      <w:r>
+        <w:br/>
+      </w:r>
+      <w:r>
+        <w:rPr>
+          <w:rFonts w:ascii="Consolas" w:hAnsi="Consolas"/>
+          <w:sz w:val="17"/>
+        </w:rPr>
+        <w:t xml:space="preserve">    @property</w:t>
+      </w:r>
+      <w:r>
+        <w:br/>
+      </w:r>
+      <w:r>
+        <w:rPr>
+          <w:rFonts w:ascii="Consolas" w:hAnsi="Consolas"/>
+          <w:sz w:val="17"/>
+        </w:rPr>
+        <w:t xml:space="preserve">    def count(self) -&gt; int:</w:t>
+      </w:r>
+      <w:r>
+        <w:br/>
+      </w:r>
+      <w:r>
+        <w:rPr>
+          <w:rFonts w:ascii="Consolas" w:hAnsi="Consolas"/>
+          <w:sz w:val="17"/>
+        </w:rPr>
+        <w:t xml:space="preserve">        return len(self.calls)</w:t>
       </w:r>
     </w:p>
     <w:p>
@@ -1835,6 +2190,7 @@
     </w:p>
     <w:p>
       <w:pPr>
+        <w:pStyle w:val="FigureCaption"/>
         <w:jc w:val="center"/>
       </w:pPr>
       <w:r>
@@ -1913,7 +2269,7 @@
           <w:b w:val="0"/>
           <w:i w:val="0"/>
         </w:rPr>
-        <w:t xml:space="preserve"> see before asking whether it should pass, and applied to the registry defect that question produced my working rule about observing state through a second access path.</w:t>
+        <w:t xml:space="preserve"> see before asking whether it should pass, and applied to the registry defect that question produced my working rule about observing state through a second access path. That reframing — from "does this pass?" to "what does passing leave unexamined?" — is the transferable analytical habit, and it is what turned two green suites into evidence that the design, not the test, was wrong.</w:t>
       </w:r>
     </w:p>
     <w:p>
@@ -2155,7 +2511,7 @@
           <w:b w:val="0"/>
           <w:i w:val="0"/>
         </w:rPr>
-        <w:t xml:space="preserve"> I worked in artefact-sized increments, capturing evidence alongside construction rather than reconstructing it at the end. My concrete failure was underestimating test-writing: closing coverage from 87% to 99% took three modules and 143 tests and produced the two most valuable findings in the portfolio, which argues for budgeting test time as design time.</w:t>
+        <w:t xml:space="preserve"> I worked in artefact-sized increments, capturing evidence alongside construction rather than reconstructing it at the end. My concrete failure was underestimating test-writing: closing coverage from 87% to 99% took three modules and 143 tests and produced the two most valuable findings in the portfolio, which argues for budgeting test time as design time. The same lesson held for this portfolio: the narrative was rewritten three times as the evidence arrived, which cost more effort than capturing it correctly while the work was fresh.</w:t>
       </w:r>
     </w:p>
     <w:p>
@@ -7195,6 +7551,26 @@
     <w:uiPriority w:val="99"/>
     <w:rsid w:val="007E037C"/>
   </w:style>
+  <w:style w:type="paragraph" w:customStyle="1" w:styleId="CodeBlock">
+    <w:name w:val="CodeBlock"/>
+    <w:basedOn w:val="Normal"/>
+    <w:pPr>
+      <w:spacing w:before="80" w:after="160" w:line="240" w:lineRule="auto"/>
+      <w:ind w:left="259"/>
+    </w:pPr>
+    <w:rPr>
+      <w:rFonts w:ascii="Consolas" w:hAnsi="Consolas"/>
+      <w:sz w:val="17"/>
+    </w:rPr>
+  </w:style>
+  <w:style w:type="paragraph" w:customStyle="1" w:styleId="FigureCaption">
+    <w:name w:val="FigureCaption"/>
+    <w:basedOn w:val="Normal"/>
+    <w:rPr>
+      <w:i/>
+      <w:sz w:val="19"/>
+    </w:rPr>
+  </w:style>
 </w:styles>
 </file>
 

</xml_diff>

<commit_message>
Trim to 2,497 words (intro + Tasks 1-4), add 'testable' hook, sync DOCX/PDF and narrative figures
</commit_message>
<xml_diff>
--- a/docs/AOODP_EMA_eportfolio_12701559.docx
+++ b/docs/AOODP_EMA_eportfolio_12701559.docx
@@ -109,7 +109,7 @@
         <w:t xml:space="preserve">Word count: </w:t>
       </w:r>
       <w:r>
-        <w:t>2,133 words (Tasks 1–4 narrative; reference list, cover sheet, figure, code excerpts and Appendices A–C excluded)</w:t>
+        <w:t>2,497 words (e-Portfolio introduction and Tasks 1–4 narrative; cover sheet, reference list, figure, code excerpts and Appendices A–C excluded)</w:t>
       </w:r>
     </w:p>
     <w:p/>
@@ -166,6 +166,31 @@
           <w:b w:val="0"/>
           <w:i w:val="0"/>
         </w:rPr>
+        <w:t>e-Portfolio Introduction</w:t>
+      </w:r>
+    </w:p>
+    <w:p>
+      <w:pPr>
+        <w:spacing w:after="120"/>
+      </w:pPr>
+      <w:r>
+        <w:rPr>
+          <w:b w:val="0"/>
+          <w:i w:val="0"/>
+        </w:rPr>
+        <w:t>This e-Portfolio presents the AOODP capstone: a transaction risk-assessment engine of nine modules, 355 offline tests and 99% statement coverage. Task 1 maps six learning outcomes to code, Task 2 showcases twelve artefacts, Task 3 reflects on academic and employability skills, and Task 4 sets a development plan. Every claim is tied to a file or captured run, and each section states what the design gave up as well as what it bought.</w:t>
+      </w:r>
+    </w:p>
+    <w:p>
+      <w:pPr>
+        <w:pStyle w:val="Heading1"/>
+        <w:spacing w:before="280"/>
+      </w:pPr>
+      <w:r>
+        <w:rPr>
+          <w:b w:val="0"/>
+          <w:i w:val="0"/>
+        </w:rPr>
         <w:t>Task 1 – Summarise Key Learning Outcomes</w:t>
       </w:r>
     </w:p>
@@ -338,7 +363,7 @@
           <w:b w:val="0"/>
           <w:i w:val="0"/>
         </w:rPr>
-        <w:t xml:space="preserve"> protocol, and constructor injection: algorithm, provider, model version and format change without editing a consumer.</w:t>
+        <w:t xml:space="preserve"> protocol, and constructor injection: algorithm, provider, model version and format change without editing a consumer. Separation of concerns is the organising principle — one module owns each axis — and that is what makes the design scalable and extensible: a new algorithm, provider or report is added at one seam while the rest stay untouched.</w:t>
       </w:r>
     </w:p>
     <w:p>
@@ -830,7 +855,7 @@
           <w:b w:val="0"/>
           <w:i w:val="0"/>
         </w:rPr>
-        <w:t>Each was chosen against a named rejected alternative.</w:t>
+        <w:t>Each pattern was chosen against a named rejected alternative, and the trade-off — not the pattern's reputation — is the justification. The payoff: runtime behavioural flexibility — scoring mode, provider family and report format are configuration at the composition root, so behaviour changes without editing a consumer.</w:t>
       </w:r>
     </w:p>
     <w:p>
@@ -854,7 +879,7 @@
           <w:b w:val="0"/>
           <w:i w:val="0"/>
         </w:rPr>
-        <w:t>Caching is an inner decorator, so it can become distributed without touching governance; the registry centralises lifecycle state. Robustness is demonstrated: a provider outage still produces a decision that reaches the audit trail, and a promotion that breaks the lifecycle rules is refused.</w:t>
+        <w:t>Caching is an inner decorator, so it can become distributed without touching governance; the registry centralises lifecycle state. Robustness is demonstrated: a provider outage produces a decision that reaches the audit trail, and a promotion that breaks a lifecycle rule is refused.</w:t>
       </w:r>
     </w:p>
     <w:p>
@@ -1199,7 +1224,35 @@
           <w:b w:val="0"/>
           <w:i w:val="0"/>
         </w:rPr>
-        <w:t xml:space="preserve"> records which inputs drove the number.</w:t>
+        <w:t xml:space="preserve"> records which inputs drove the number. Strategy was chosen over an </w:t>
+      </w:r>
+      <w:r>
+        <w:rPr>
+          <w:rFonts w:ascii="Consolas" w:hAnsi="Consolas"/>
+          <w:sz w:val="19"/>
+        </w:rPr>
+        <w:t>if</w:t>
+      </w:r>
+      <w:r>
+        <w:rPr>
+          <w:b w:val="0"/>
+          <w:i w:val="0"/>
+        </w:rPr>
+        <w:t>/</w:t>
+      </w:r>
+      <w:r>
+        <w:rPr>
+          <w:rFonts w:ascii="Consolas" w:hAnsi="Consolas"/>
+          <w:sz w:val="19"/>
+        </w:rPr>
+        <w:t>elif</w:t>
+      </w:r>
+      <w:r>
+        <w:rPr>
+          <w:b w:val="0"/>
+          <w:i w:val="0"/>
+        </w:rPr>
+        <w:t xml:space="preserve"> mode flag because the algorithms differ in the inputs they need and the rationale they give, not only in output, so polymorphism keeps each decision path with its explanation.</w:t>
       </w:r>
     </w:p>
     <w:p>
@@ -1365,7 +1418,7 @@
           <w:b w:val="0"/>
           <w:i w:val="0"/>
         </w:rPr>
-        <w:t>; every per-decorator test passed, and only a test that a degraded decision reaches the audit sink exposed it.</w:t>
+        <w:t>; every per-decorator test passed, and only a test that a degraded decision reaches the audit sink exposed it — the challenge this pattern sets: each layer is individually correct, yet correctness lives in an ordering the type system cannot check.</w:t>
       </w:r>
     </w:p>
     <w:p>
@@ -1836,7 +1889,7 @@
           <w:b w:val="0"/>
           <w:i w:val="0"/>
         </w:rPr>
-        <w:t xml:space="preserve"> stays a minimal 45-line factory rather than a framework container; a service locator is kept at the outer edge because it hides dependencies from the type checker (Fowler, 2004).</w:t>
+        <w:t xml:space="preserve"> stays a minimal 45-line factory rather than a framework container; a service locator is kept at the outer edge because it hides dependencies from the type checker (Fowler, 2004). That is where abstraction was stopped against over-engineering: a general container would be more capable and less legible, so the smaller factory won on what a reader can verify.</w:t>
       </w:r>
     </w:p>
     <w:p>
@@ -1867,7 +1920,7 @@
           <w:b w:val="0"/>
           <w:i w:val="0"/>
         </w:rPr>
-        <w:t xml:space="preserve"> holds nine modules and 355 offline tests at 99% coverage of 2,512 statements, with doubles named by category (Python Software Foundation, 2026). An AI assistant drafted tests from class contracts, finding a boundary case I had missed — a boolean score, an </w:t>
+        <w:t xml:space="preserve"> holds nine modules and 355 offline tests at 99% coverage of 2,512 statements, with doubles named by category — stub, spy and mock — so a reader can see which contract each isolates and every layer stays testable without a live model (Python Software Foundation, 2026). Testing complexity here is path, not line, coverage: composition order, retry budgets and lifecycle transitions multiply, which is why doubles, not live models, carry the AI paths. An AI assistant drafted tests from class contracts, finding a boundary case I had missed — a boolean score, an </w:t>
       </w:r>
       <w:r>
         <w:rPr>
@@ -1895,7 +1948,7 @@
           <w:b w:val="0"/>
           <w:i w:val="0"/>
         </w:rPr>
-        <w:t xml:space="preserve"> — but also produced confidently wrong assertions, detectable only by running them.</w:t>
+        <w:t xml:space="preserve"> — but also produced confidently wrong assertions, detectable only by running them. Both capstone defects now carry regression tests that read state back through a second access path.</w:t>
       </w:r>
     </w:p>
     <w:p>
@@ -2146,7 +2199,7 @@
           <w:b w:val="0"/>
           <w:i w:val="0"/>
         </w:rPr>
-        <w:t>); and a provider outage with a three-attempt retry budget.</w:t>
+        <w:t>); and a provider outage with a three-attempt retry budget. Critically, the capture bounds the claim: rule weights are expert-set and unvalidated and the cache is in-process, so the robustness shown is single-node.</w:t>
       </w:r>
     </w:p>
     <w:p>
@@ -2433,7 +2486,7 @@
           <w:b w:val="0"/>
           <w:i w:val="0"/>
         </w:rPr>
-        <w:t xml:space="preserve"> collapsed four copies of an ordering decision into one documented function. I also resisted over-refactoring: a shared base class for the reporting visitors would create inheritance without polymorphism.</w:t>
+        <w:t xml:space="preserve"> collapsed four copies of an ordering decision into one documented function. I also had to manage abstraction against over-engineering: a shared base class for the reporting visitors would create inheritance without polymorphism, so the duplication stayed.</w:t>
       </w:r>
     </w:p>
     <w:p>
@@ -2511,7 +2564,7 @@
           <w:b w:val="0"/>
           <w:i w:val="0"/>
         </w:rPr>
-        <w:t xml:space="preserve"> I worked in artefact-sized increments, capturing evidence alongside construction rather than reconstructing it at the end. My concrete failure was underestimating test-writing: closing coverage from 87% to 99% took three modules and 143 tests and produced the two most valuable findings in the portfolio, which argues for budgeting test time as design time. The same lesson held for this portfolio: the narrative was rewritten three times as the evidence arrived, which cost more effort than capturing it correctly while the work was fresh.</w:t>
+        <w:t xml:space="preserve"> I worked in artefact-sized increments, capturing evidence alongside construction rather than reconstructing it at the end. My concrete failure was underestimating test-writing: closing coverage from 87% to 99% took three modules and 143 tests and produced the two most valuable findings in the portfolio, which argues for budgeting test time as design time. The same lesson held for this portfolio: the narrative was rewritten three times as the evidence arrived, which cost more than capturing it while the work was fresh.</w:t>
       </w:r>
     </w:p>
     <w:p>
@@ -2577,7 +2630,26 @@
           <w:b w:val="0"/>
           <w:i w:val="0"/>
         </w:rPr>
-        <w:t xml:space="preserve"> Resilience meant sitting with a failing test I believed was correct for longer than was comfortable, and changing the design instead of the assertion. On collaboration I must be explicit about the limits of my evidence: this is individual work, and Appendix B records what evidence of independent working is held. The transferable lesson survives that limitation: writing the decorator ordering decision down as a reviewer would demand forced me to state an intuition I had only relied on.</w:t>
+        <w:t xml:space="preserve"> Resilience meant sitting with a failing test I believed was correct for longer than was comfortable, and changing the design instead of the assertion.</w:t>
+      </w:r>
+    </w:p>
+    <w:p>
+      <w:pPr>
+        <w:spacing w:after="120"/>
+      </w:pPr>
+      <w:r>
+        <w:rPr>
+          <w:b/>
+          <w:i w:val="0"/>
+        </w:rPr>
+        <w:t>Collaboration and independent working.</w:t>
+      </w:r>
+      <w:r>
+        <w:rPr>
+          <w:b w:val="0"/>
+          <w:i w:val="0"/>
+        </w:rPr>
+        <w:t xml:space="preserve"> This is individual work with a single-author history and no peer review; Appendix B records that as a gap rather than substituting retrospective minutes. Collaboration was instead adversarial and tool-mediated: an AI assistant drafted tests against my contracts and, where its assertions were confidently wrong, I overruled it. That draft is not peer review, but it exercised the discipline peer review demands: writing each decision so another party can audit it. Stating the decorator-ordering decision that way forced me to justify an intuition I had only relied on.</w:t>
       </w:r>
     </w:p>
     <w:p>

</xml_diff>

<commit_message>
Point repository and Pages URLs at org 12701559; rebuild DOCX/PDF with new links
</commit_message>
<xml_diff>
--- a/docs/AOODP_EMA_eportfolio_12701559.docx
+++ b/docs/AOODP_EMA_eportfolio_12701559.docx
@@ -87,7 +87,7 @@
         <w:t xml:space="preserve">e-Portfolio (GitHub repository): </w:t>
       </w:r>
       <w:r>
-        <w:t>https://github.com/stacyalwangaessex/aoodp-capstone</w:t>
+        <w:t>https://github.com/12701559/aoodp-capstone</w:t>
       </w:r>
     </w:p>
     <w:p>
@@ -98,7 +98,7 @@
         <w:t xml:space="preserve">e-Portfolio (published via GitHub Pages): </w:t>
       </w:r>
       <w:r>
-        <w:t>https://stacyalwangaessex.github.io/aoodp-capstone/</w:t>
+        <w:t>https://12701559.github.io/aoodp-capstone/</w:t>
       </w:r>
     </w:p>
     <w:p>
@@ -1099,7 +1099,7 @@
           <w:rFonts w:ascii="Consolas" w:hAnsi="Consolas"/>
           <w:sz w:val="19"/>
         </w:rPr>
-        <w:t>https://github.com/stacyalwangaessex/aoodp-capstone</w:t>
+        <w:t>https://github.com/12701559/aoodp-capstone</w:t>
       </w:r>
       <w:r>
         <w:rPr>

</xml_diff>

<commit_message>
Remove git_contribution_history.txt; simplify Figure 1; declare figure provenance; rebuild DOCX/PDF
</commit_message>
<xml_diff>
--- a/docs/AOODP_EMA_eportfolio_12701559.docx
+++ b/docs/AOODP_EMA_eportfolio_12701559.docx
@@ -2209,7 +2209,7 @@
       <w:r>
         <w:drawing>
           <wp:inline xmlns:a="http://schemas.openxmlformats.org/drawingml/2006/main" xmlns:pic="http://schemas.openxmlformats.org/drawingml/2006/picture">
-            <wp:extent cx="5577840" cy="3948574"/>
+            <wp:extent cx="5577840" cy="3741686"/>
             <wp:docPr id="1" name="Picture 1"/>
             <wp:cNvGraphicFramePr>
               <a:graphicFrameLocks noChangeAspect="1"/>
@@ -2230,7 +2230,7 @@
                   <pic:spPr>
                     <a:xfrm>
                       <a:off x="0" y="0"/>
-                      <a:ext cx="5577840" cy="3948574"/>
+                      <a:ext cx="5577840" cy="3741686"/>
                     </a:xfrm>
                     <a:prstGeom prst="rect"/>
                   </pic:spPr>
@@ -5729,14 +5729,7 @@
                 <w:i w:val="0"/>
                 <w:sz w:val="19"/>
               </w:rPr>
-              <w:t xml:space="preserve">Held — summarised in </w:t>
-            </w:r>
-            <w:r>
-              <w:rPr>
-                <w:rFonts w:ascii="Consolas" w:hAnsi="Consolas"/>
-                <w:sz w:val="19"/>
-              </w:rPr>
-              <w:t>docs/git_contribution_history.txt</w:t>
+              <w:t>Held — repository commit history</w:t>
             </w:r>
           </w:p>
         </w:tc>
@@ -6205,6 +6198,32 @@
           <w:i w:val="0"/>
         </w:rPr>
         <w:t xml:space="preserve"> Lifecycle and versioning semantics are demonstrated, but durability, migration and multi-process consistency are out of scope — hence Goal 1's persisted registry.</w:t>
+      </w:r>
+    </w:p>
+    <w:p>
+      <w:pPr>
+        <w:spacing w:after="120"/>
+      </w:pPr>
+      <w:r>
+        <w:rPr>
+          <w:b w:val="0"/>
+          <w:i w:val="0"/>
+        </w:rPr>
+        <w:t xml:space="preserve">4. </w:t>
+      </w:r>
+      <w:r>
+        <w:rPr>
+          <w:b/>
+          <w:i w:val="0"/>
+        </w:rPr>
+        <w:t>Figure 1 was produced with AI assistance.</w:t>
+      </w:r>
+      <w:r>
+        <w:rPr>
+          <w:b w:val="0"/>
+          <w:i w:val="0"/>
+        </w:rPr>
+        <w:t xml:space="preserve"> A short written outline of the module names, call order and seams was provided to an AI assistant, which turned it into a small plotting script; the script was then run locally to draw the diagram. No source code, transaction data or repository content was submitted to any external AI service, and the architecture and every annotation in the figure are the author's own design.</w:t>
       </w:r>
     </w:p>
     <w:sectPr>

</xml_diff>